<commit_message>
Lab4 - Hoàn thành
</commit_message>
<xml_diff>
--- a/Lab4/Lab 4_Flutter UI Fundamentals.docx
+++ b/Lab4/Lab 4_Flutter UI Fundamentals.docx
@@ -1,6 +1,6 @@
 
 <file path=word/document.xml><?xml version="1.0" encoding="utf-8"?>
-<w:document xmlns:wpc="http://schemas.microsoft.com/office/word/2010/wordprocessingCanvas" xmlns:cx="http://schemas.microsoft.com/office/drawing/2014/chartex" xmlns:cx1="http://schemas.microsoft.com/office/drawing/2015/9/8/chartex" xmlns:cx2="http://schemas.microsoft.com/office/drawing/2015/10/21/chartex" xmlns:cx3="http://schemas.microsoft.com/office/drawing/2016/5/9/chartex" xmlns:cx4="http://schemas.microsoft.com/office/drawing/2016/5/10/chartex" xmlns:cx5="http://schemas.microsoft.com/office/drawing/2016/5/11/chartex" xmlns:cx6="http://schemas.microsoft.com/office/drawing/2016/5/12/chartex" xmlns:cx7="http://schemas.microsoft.com/office/drawing/2016/5/13/chartex" xmlns:cx8="http://schemas.microsoft.com/office/drawing/2016/5/14/chartex" xmlns:mc="http://schemas.openxmlformats.org/markup-compatibility/2006" xmlns:aink="http://schemas.microsoft.com/office/drawing/2016/ink" xmlns:am3d="http://schemas.microsoft.com/office/drawing/2017/model3d" xmlns:o="urn:schemas-microsoft-com:office:office" xmlns:oel="http://schemas.microsoft.com/office/2019/extlst" xmlns:r="http://schemas.openxmlformats.org/officeDocument/2006/relationships" xmlns:m="http://schemas.openxmlformats.org/officeDocument/2006/math" xmlns:v="urn:schemas-microsoft-com:vml" xmlns:wp14="http://schemas.microsoft.com/office/word/2010/wordprocessingDrawing" xmlns:wp="http://schemas.openxmlformats.org/drawingml/2006/wordprocessingDrawing" xmlns:w10="urn:schemas-microsoft-com:office:word" xmlns:w="http://schemas.openxmlformats.org/wordprocessingml/2006/main" xmlns:w14="http://schemas.microsoft.com/office/word/2010/wordml" xmlns:w15="http://schemas.microsoft.com/office/word/2012/wordml" xmlns:w16cex="http://schemas.microsoft.com/office/word/2018/wordml/cex" xmlns:w16cid="http://schemas.microsoft.com/office/word/2016/wordml/cid" xmlns:w16="http://schemas.microsoft.com/office/word/2018/wordml" xmlns:w16du="http://schemas.microsoft.com/office/word/2023/wordml/word16du" xmlns:w16sdtdh="http://schemas.microsoft.com/office/word/2020/wordml/sdtdatahash" xmlns:w16sdtfl="http://schemas.microsoft.com/office/word/2024/wordml/sdtformatlock" xmlns:w16se="http://schemas.microsoft.com/office/word/2015/wordml/symex" xmlns:wpg="http://schemas.microsoft.com/office/word/2010/wordprocessingGroup" xmlns:wpi="http://schemas.microsoft.com/office/word/2010/wordprocessingInk" xmlns:wne="http://schemas.microsoft.com/office/word/2006/wordml" xmlns:wps="http://schemas.microsoft.com/office/word/2010/wordprocessingShape" mc:Ignorable="w14 w15 w16se w16cid w16 w16cex w16sdtdh w16sdtfl w16du wp14">
+<w:document xmlns:wpc="http://schemas.microsoft.com/office/word/2010/wordprocessingCanvas" xmlns:cx="http://schemas.microsoft.com/office/drawing/2014/chartex" xmlns:cx1="http://schemas.microsoft.com/office/drawing/2015/9/8/chartex" xmlns:cx2="http://schemas.microsoft.com/office/drawing/2015/10/21/chartex" xmlns:cx3="http://schemas.microsoft.com/office/drawing/2016/5/9/chartex" xmlns:cx4="http://schemas.microsoft.com/office/drawing/2016/5/10/chartex" xmlns:cx5="http://schemas.microsoft.com/office/drawing/2016/5/11/chartex" xmlns:cx6="http://schemas.microsoft.com/office/drawing/2016/5/12/chartex" xmlns:cx7="http://schemas.microsoft.com/office/drawing/2016/5/13/chartex" xmlns:cx8="http://schemas.microsoft.com/office/drawing/2016/5/14/chartex" xmlns:mc="http://schemas.openxmlformats.org/markup-compatibility/2006" xmlns:o="urn:schemas-microsoft-com:office:office" xmlns:r="http://schemas.openxmlformats.org/officeDocument/2006/relationships" xmlns:m="http://schemas.openxmlformats.org/officeDocument/2006/math" xmlns:v="urn:schemas-microsoft-com:vml" xmlns:wp14="http://schemas.microsoft.com/office/word/2010/wordprocessingDrawing" xmlns:wp="http://schemas.openxmlformats.org/drawingml/2006/wordprocessingDrawing" xmlns:w="http://schemas.openxmlformats.org/wordprocessingml/2006/main" xmlns:w14="http://schemas.microsoft.com/office/word/2010/wordml" xmlns:w10="urn:schemas-microsoft-com:office:word" xmlns:w15="http://schemas.microsoft.com/office/word/2012/wordml" xmlns:wpg="http://schemas.microsoft.com/office/word/2010/wordprocessingGroup" xmlns:wpi="http://schemas.microsoft.com/office/word/2010/wordprocessingInk" xmlns:wne="http://schemas.microsoft.com/office/word/2006/wordml" xmlns:wps="http://schemas.microsoft.com/office/word/2010/wordprocessingShape" xmlns:wpsCustomData="http://www.wps.cn/officeDocument/2013/wpsCustomData" mc:Ignorable="w14 w15 wp14">
   <w:body>
     <w:p>
       <w:pPr>
@@ -41,7 +41,9 @@
         <w:t>This lab helps students practice building user interfaces using Flutter’s core widget system.</w:t>
       </w:r>
       <w:r>
-        <w:br/>
+        <w:br w:type="textWrapping"/>
+      </w:r>
+      <w:r>
         <w:t>Students will learn how to work with basic widgets, input controls, layout structures, navigation scaffolding, and design polish techniques such as spacing and theming.</w:t>
       </w:r>
     </w:p>
@@ -60,7 +62,7 @@
         <w:t>.</w:t>
       </w:r>
       <w:r>
-        <w:br/>
+        <w:br w:type="textWrapping"/>
       </w:r>
     </w:p>
     <w:p>
@@ -80,11 +82,8 @@
     </w:p>
     <w:p>
       <w:r>
-        <w:rPr>
-          <w:noProof/>
-        </w:rPr>
         <w:drawing>
-          <wp:anchor distT="0" distB="0" distL="114300" distR="114300" simplePos="0" relativeHeight="251650560" behindDoc="0" locked="0" layoutInCell="1" allowOverlap="1" wp14:anchorId="1E117EC1" wp14:editId="4DDB7FE6">
+          <wp:anchor distT="0" distB="0" distL="114300" distR="114300" simplePos="0" relativeHeight="251659264" behindDoc="0" locked="0" layoutInCell="1" allowOverlap="1">
             <wp:simplePos x="0" y="0"/>
             <wp:positionH relativeFrom="column">
               <wp:posOffset>4318000</wp:posOffset>
@@ -103,11 +102,13 @@
               <a:graphicData uri="http://schemas.openxmlformats.org/drawingml/2006/picture">
                 <pic:pic xmlns:pic="http://schemas.openxmlformats.org/drawingml/2006/picture">
                   <pic:nvPicPr>
-                    <pic:cNvPr id="450766559" name="Picture 1" descr="A screenshot of a phone&#10;&#10;AI-generated content may be incorrect."/>
-                    <pic:cNvPicPr/>
+                    <pic:cNvPr id="218227018" name="Picture 1" descr="A screenshot of a phone&#10;&#10;AI-generated content may be incorrect."/>
+                    <pic:cNvPicPr>
+                      <a:picLocks noChangeAspect="1"/>
+                    </pic:cNvPicPr>
                   </pic:nvPicPr>
                   <pic:blipFill>
-                    <a:blip r:embed="rId5">
+                    <a:blip r:embed="rId6">
                       <a:extLst>
                         <a:ext uri="{28A0092B-C50C-407E-A947-70E740481C1C}">
                           <a14:useLocalDpi xmlns:a14="http://schemas.microsoft.com/office/drawing/2010/main" val="0"/>
@@ -130,12 +131,6 @@
                 </pic:pic>
               </a:graphicData>
             </a:graphic>
-            <wp14:sizeRelH relativeFrom="page">
-              <wp14:pctWidth>0</wp14:pctWidth>
-            </wp14:sizeRelH>
-            <wp14:sizeRelV relativeFrom="page">
-              <wp14:pctHeight>0</wp14:pctHeight>
-            </wp14:sizeRelV>
           </wp:anchor>
         </w:drawing>
       </w:r>
@@ -150,13 +145,7 @@
         <w:t>five exercises</w:t>
       </w:r>
       <w:r>
-        <w:t xml:space="preserve"> covering the main UI concepts:</w:t>
-      </w:r>
-      <w:r>
-        <w:rPr>
-          <w:noProof/>
-        </w:rPr>
-        <w:t xml:space="preserve"> </w:t>
+        <w:t xml:space="preserve"> covering the main UI concepts: </w:t>
       </w:r>
     </w:p>
     <w:p>
@@ -309,11 +298,8 @@
         </w:rPr>
       </w:pPr>
       <w:r>
-        <w:rPr>
-          <w:noProof/>
-        </w:rPr>
         <w:drawing>
-          <wp:anchor distT="0" distB="0" distL="114300" distR="114300" simplePos="0" relativeHeight="251657728" behindDoc="0" locked="0" layoutInCell="1" allowOverlap="1" wp14:anchorId="262A986B" wp14:editId="0C95067F">
+          <wp:anchor distT="0" distB="0" distL="114300" distR="114300" simplePos="0" relativeHeight="251660288" behindDoc="0" locked="0" layoutInCell="1" allowOverlap="1">
             <wp:simplePos x="0" y="0"/>
             <wp:positionH relativeFrom="column">
               <wp:posOffset>4381500</wp:posOffset>
@@ -333,10 +319,12 @@
                 <pic:pic xmlns:pic="http://schemas.openxmlformats.org/drawingml/2006/picture">
                   <pic:nvPicPr>
                     <pic:cNvPr id="309235735" name="Picture 1" descr="A screenshot of a phone&#10;&#10;AI-generated content may be incorrect."/>
-                    <pic:cNvPicPr/>
+                    <pic:cNvPicPr>
+                      <a:picLocks noChangeAspect="1"/>
+                    </pic:cNvPicPr>
                   </pic:nvPicPr>
                   <pic:blipFill>
-                    <a:blip r:embed="rId6">
+                    <a:blip r:embed="rId7">
                       <a:extLst>
                         <a:ext uri="{28A0092B-C50C-407E-A947-70E740481C1C}">
                           <a14:useLocalDpi xmlns:a14="http://schemas.microsoft.com/office/drawing/2010/main" val="0"/>
@@ -359,12 +347,6 @@
                 </pic:pic>
               </a:graphicData>
             </a:graphic>
-            <wp14:sizeRelH relativeFrom="page">
-              <wp14:pctWidth>0</wp14:pctWidth>
-            </wp14:sizeRelH>
-            <wp14:sizeRelV relativeFrom="page">
-              <wp14:pctHeight>0</wp14:pctHeight>
-            </wp14:sizeRelV>
           </wp:anchor>
         </w:drawing>
       </w:r>
@@ -405,10 +387,7 @@
         </w:numPr>
       </w:pPr>
       <w:r>
-        <w:t>Create a new Flutter file core_widgets_demo.dart.</w:t>
-      </w:r>
-      <w:r>
-        <w:t xml:space="preserve"> </w:t>
+        <w:t xml:space="preserve">Create a new Flutter file core_widgets_demo.dart. </w:t>
       </w:r>
     </w:p>
     <w:p>
@@ -479,34 +458,102 @@
     </w:p>
     <w:p>
       <w:pPr>
-        <w:rPr>
-          <w:b/>
-          <w:bCs/>
-        </w:rPr>
-      </w:pPr>
-    </w:p>
-    <w:p>
-      <w:pPr>
-        <w:rPr>
-          <w:b/>
-          <w:bCs/>
-        </w:rPr>
-      </w:pPr>
-      <w:r>
-        <w:rPr>
-          <w:noProof/>
+        <w:numPr>
+          <w:numId w:val="0"/>
+        </w:numPr>
+        <w:ind w:left="360" w:leftChars="0"/>
+        <w:rPr>
+          <w:rFonts w:hint="default"/>
+          <w:lang w:val="vi-VN"/>
+        </w:rPr>
+      </w:pPr>
+      <w:r>
+        <w:rPr>
+          <w:rFonts w:hint="default"/>
+          <w:lang w:val="vi-VN"/>
         </w:rPr>
         <w:drawing>
-          <wp:anchor distT="0" distB="0" distL="114300" distR="114300" simplePos="0" relativeHeight="251659776" behindDoc="0" locked="0" layoutInCell="1" allowOverlap="1" wp14:anchorId="5C3D0F13" wp14:editId="68A90758">
+          <wp:inline distT="0" distB="0" distL="114300" distR="114300">
+            <wp:extent cx="5939155" cy="3336925"/>
+            <wp:effectExtent l="0" t="0" r="4445" b="635"/>
+            <wp:docPr id="1" name="Hình ảnh 1" descr="Ảnh chụp màn hình 2026-10-02 130124"/>
+            <wp:cNvGraphicFramePr>
+              <a:graphicFrameLocks xmlns:a="http://schemas.openxmlformats.org/drawingml/2006/main" noChangeAspect="1"/>
+            </wp:cNvGraphicFramePr>
+            <a:graphic xmlns:a="http://schemas.openxmlformats.org/drawingml/2006/main">
+              <a:graphicData uri="http://schemas.openxmlformats.org/drawingml/2006/picture">
+                <pic:pic xmlns:pic="http://schemas.openxmlformats.org/drawingml/2006/picture">
+                  <pic:nvPicPr>
+                    <pic:cNvPr id="1" name="Hình ảnh 1" descr="Ảnh chụp màn hình 2026-10-02 130124"/>
+                    <pic:cNvPicPr>
+                      <a:picLocks noChangeAspect="1"/>
+                    </pic:cNvPicPr>
+                  </pic:nvPicPr>
+                  <pic:blipFill>
+                    <a:blip r:embed="rId8"/>
+                    <a:stretch>
+                      <a:fillRect/>
+                    </a:stretch>
+                  </pic:blipFill>
+                  <pic:spPr>
+                    <a:xfrm>
+                      <a:off x="0" y="0"/>
+                      <a:ext cx="5939155" cy="3336925"/>
+                    </a:xfrm>
+                    <a:prstGeom prst="rect">
+                      <a:avLst/>
+                    </a:prstGeom>
+                  </pic:spPr>
+                </pic:pic>
+              </a:graphicData>
+            </a:graphic>
+          </wp:inline>
+        </w:drawing>
+      </w:r>
+    </w:p>
+    <w:p>
+      <w:pPr>
+        <w:rPr>
+          <w:b/>
+          <w:bCs/>
+        </w:rPr>
+      </w:pPr>
+    </w:p>
+    <w:p>
+      <w:pPr>
+        <w:rPr>
+          <w:b/>
+          <w:bCs/>
+        </w:rPr>
+      </w:pPr>
+    </w:p>
+    <w:p>
+      <w:pPr>
+        <w:rPr>
+          <w:b/>
+          <w:bCs/>
+        </w:rPr>
+      </w:pPr>
+    </w:p>
+    <w:p>
+      <w:pPr>
+        <w:rPr>
+          <w:b/>
+          <w:bCs/>
+        </w:rPr>
+      </w:pPr>
+      <w:r>
+        <w:drawing>
+          <wp:anchor distT="0" distB="0" distL="114300" distR="114300" simplePos="0" relativeHeight="251661312" behindDoc="0" locked="0" layoutInCell="1" allowOverlap="1">
             <wp:simplePos x="0" y="0"/>
             <wp:positionH relativeFrom="column">
-              <wp:posOffset>4470400</wp:posOffset>
+              <wp:posOffset>4890770</wp:posOffset>
             </wp:positionH>
             <wp:positionV relativeFrom="paragraph">
-              <wp:posOffset>161290</wp:posOffset>
+              <wp:posOffset>-440055</wp:posOffset>
             </wp:positionV>
-            <wp:extent cx="1543050" cy="2549525"/>
-            <wp:effectExtent l="0" t="0" r="0" b="3175"/>
+            <wp:extent cx="1543050" cy="2427605"/>
+            <wp:effectExtent l="0" t="0" r="11430" b="10795"/>
             <wp:wrapSquare wrapText="bothSides"/>
             <wp:docPr id="634026213" name="Picture 1" descr="A screenshot of a phone&#10;&#10;AI-generated content may be incorrect."/>
             <wp:cNvGraphicFramePr>
@@ -517,10 +564,12 @@
                 <pic:pic xmlns:pic="http://schemas.openxmlformats.org/drawingml/2006/picture">
                   <pic:nvPicPr>
                     <pic:cNvPr id="634026213" name="Picture 1" descr="A screenshot of a phone&#10;&#10;AI-generated content may be incorrect."/>
-                    <pic:cNvPicPr/>
+                    <pic:cNvPicPr>
+                      <a:picLocks noChangeAspect="1"/>
+                    </pic:cNvPicPr>
                   </pic:nvPicPr>
                   <pic:blipFill>
-                    <a:blip r:embed="rId7">
+                    <a:blip r:embed="rId9">
                       <a:extLst>
                         <a:ext uri="{28A0092B-C50C-407E-A947-70E740481C1C}">
                           <a14:useLocalDpi xmlns:a14="http://schemas.microsoft.com/office/drawing/2010/main" val="0"/>
@@ -534,7 +583,7 @@
                   <pic:spPr>
                     <a:xfrm>
                       <a:off x="0" y="0"/>
-                      <a:ext cx="1543050" cy="2549525"/>
+                      <a:ext cx="1543050" cy="2427605"/>
                     </a:xfrm>
                     <a:prstGeom prst="rect">
                       <a:avLst/>
@@ -543,12 +592,6 @@
                 </pic:pic>
               </a:graphicData>
             </a:graphic>
-            <wp14:sizeRelH relativeFrom="page">
-              <wp14:pctWidth>0</wp14:pctWidth>
-            </wp14:sizeRelH>
-            <wp14:sizeRelV relativeFrom="page">
-              <wp14:pctHeight>0</wp14:pctHeight>
-            </wp14:sizeRelV>
           </wp:anchor>
         </w:drawing>
       </w:r>
@@ -557,14 +600,7 @@
           <w:b/>
           <w:bCs/>
         </w:rPr>
-        <w:t>Exercise 2 – Input Widgets: Slider, Switch, RadioListTile, DatePicker</w:t>
-      </w:r>
-      <w:r>
-        <w:rPr>
-          <w:b/>
-          <w:bCs/>
-        </w:rPr>
-        <w:t xml:space="preserve"> </w:t>
+        <w:t xml:space="preserve">Exercise 2 – Input Widgets: Slider, Switch, RadioListTile, DatePicker </w:t>
       </w:r>
     </w:p>
     <w:p>
@@ -627,6 +663,10 @@
           <w:ilvl w:val="0"/>
           <w:numId w:val="4"/>
         </w:numPr>
+        <w:rPr>
+          <w:rFonts w:hint="default"/>
+          <w:lang w:val="vi-VN"/>
+        </w:rPr>
       </w:pPr>
       <w:r>
         <w:t>Display updated values on screen.</w:t>
@@ -634,6 +674,61 @@
     </w:p>
     <w:p>
       <w:pPr>
+        <w:numPr>
+          <w:numId w:val="0"/>
+        </w:numPr>
+        <w:ind w:left="360" w:leftChars="0"/>
+        <w:rPr>
+          <w:rFonts w:hint="default"/>
+          <w:lang w:val="vi-VN"/>
+        </w:rPr>
+      </w:pPr>
+      <w:r>
+        <w:rPr>
+          <w:rFonts w:hint="default"/>
+          <w:lang w:val="vi-VN"/>
+        </w:rPr>
+        <w:drawing>
+          <wp:inline distT="0" distB="0" distL="114300" distR="114300">
+            <wp:extent cx="5939155" cy="3336925"/>
+            <wp:effectExtent l="0" t="0" r="4445" b="635"/>
+            <wp:docPr id="4" name="Hình ảnh 4" descr="Ảnh chụp màn hình 2026-10-02 134215"/>
+            <wp:cNvGraphicFramePr>
+              <a:graphicFrameLocks xmlns:a="http://schemas.openxmlformats.org/drawingml/2006/main" noChangeAspect="1"/>
+            </wp:cNvGraphicFramePr>
+            <a:graphic xmlns:a="http://schemas.openxmlformats.org/drawingml/2006/main">
+              <a:graphicData uri="http://schemas.openxmlformats.org/drawingml/2006/picture">
+                <pic:pic xmlns:pic="http://schemas.openxmlformats.org/drawingml/2006/picture">
+                  <pic:nvPicPr>
+                    <pic:cNvPr id="4" name="Hình ảnh 4" descr="Ảnh chụp màn hình 2026-10-02 134215"/>
+                    <pic:cNvPicPr>
+                      <a:picLocks noChangeAspect="1"/>
+                    </pic:cNvPicPr>
+                  </pic:nvPicPr>
+                  <pic:blipFill>
+                    <a:blip r:embed="rId10"/>
+                    <a:stretch>
+                      <a:fillRect/>
+                    </a:stretch>
+                  </pic:blipFill>
+                  <pic:spPr>
+                    <a:xfrm>
+                      <a:off x="0" y="0"/>
+                      <a:ext cx="5939155" cy="3336925"/>
+                    </a:xfrm>
+                    <a:prstGeom prst="rect">
+                      <a:avLst/>
+                    </a:prstGeom>
+                  </pic:spPr>
+                </pic:pic>
+              </a:graphicData>
+            </a:graphic>
+          </wp:inline>
+        </w:drawing>
+      </w:r>
+    </w:p>
+    <w:p>
+      <w:pPr>
         <w:rPr>
           <w:b/>
           <w:bCs/>
@@ -663,21 +758,17 @@
         </w:rPr>
       </w:pPr>
       <w:r>
-        <w:rPr>
-          <w:noProof/>
-        </w:rPr>
-        <w:lastRenderedPageBreak/>
         <w:drawing>
-          <wp:anchor distT="0" distB="0" distL="114300" distR="114300" simplePos="0" relativeHeight="251661824" behindDoc="0" locked="0" layoutInCell="1" allowOverlap="1" wp14:anchorId="41EA8F4F" wp14:editId="471AD604">
+          <wp:anchor distT="0" distB="0" distL="114300" distR="114300" simplePos="0" relativeHeight="251662336" behindDoc="0" locked="0" layoutInCell="1" allowOverlap="1">
             <wp:simplePos x="0" y="0"/>
             <wp:positionH relativeFrom="column">
               <wp:posOffset>4425950</wp:posOffset>
             </wp:positionH>
             <wp:positionV relativeFrom="paragraph">
-              <wp:posOffset>-38100</wp:posOffset>
+              <wp:posOffset>-215900</wp:posOffset>
             </wp:positionV>
-            <wp:extent cx="1736725" cy="2654300"/>
-            <wp:effectExtent l="0" t="0" r="0" b="0"/>
+            <wp:extent cx="1736725" cy="2205990"/>
+            <wp:effectExtent l="0" t="0" r="635" b="3810"/>
             <wp:wrapSquare wrapText="bothSides"/>
             <wp:docPr id="1527910200" name="Picture 1" descr="A screenshot of a phone&#10;&#10;AI-generated content may be incorrect."/>
             <wp:cNvGraphicFramePr>
@@ -688,10 +779,12 @@
                 <pic:pic xmlns:pic="http://schemas.openxmlformats.org/drawingml/2006/picture">
                   <pic:nvPicPr>
                     <pic:cNvPr id="1527910200" name="Picture 1" descr="A screenshot of a phone&#10;&#10;AI-generated content may be incorrect."/>
-                    <pic:cNvPicPr/>
+                    <pic:cNvPicPr>
+                      <a:picLocks noChangeAspect="1"/>
+                    </pic:cNvPicPr>
                   </pic:nvPicPr>
                   <pic:blipFill>
-                    <a:blip r:embed="rId8">
+                    <a:blip r:embed="rId11">
                       <a:extLst>
                         <a:ext uri="{28A0092B-C50C-407E-A947-70E740481C1C}">
                           <a14:useLocalDpi xmlns:a14="http://schemas.microsoft.com/office/drawing/2010/main" val="0"/>
@@ -705,7 +798,7 @@
                   <pic:spPr>
                     <a:xfrm>
                       <a:off x="0" y="0"/>
-                      <a:ext cx="1736725" cy="2654300"/>
+                      <a:ext cx="1736725" cy="2205990"/>
                     </a:xfrm>
                     <a:prstGeom prst="rect">
                       <a:avLst/>
@@ -714,12 +807,6 @@
                 </pic:pic>
               </a:graphicData>
             </a:graphic>
-            <wp14:sizeRelH relativeFrom="page">
-              <wp14:pctWidth>0</wp14:pctWidth>
-            </wp14:sizeRelH>
-            <wp14:sizeRelV relativeFrom="page">
-              <wp14:pctHeight>0</wp14:pctHeight>
-            </wp14:sizeRelV>
           </wp:anchor>
         </w:drawing>
       </w:r>
@@ -728,14 +815,7 @@
           <w:b/>
           <w:bCs/>
         </w:rPr>
-        <w:t>Exercise 3 – Layout Basics: Column, Row, Padding, ListView</w:t>
-      </w:r>
-      <w:r>
-        <w:rPr>
-          <w:b/>
-          <w:bCs/>
-        </w:rPr>
-        <w:t xml:space="preserve"> </w:t>
+        <w:t xml:space="preserve">Exercise 3 – Layout Basics: Column, Row, Padding, ListView </w:t>
       </w:r>
     </w:p>
     <w:p>
@@ -805,17 +885,69 @@
     </w:p>
     <w:p>
       <w:pPr>
-        <w:rPr>
-          <w:b/>
-          <w:bCs/>
-        </w:rPr>
-      </w:pPr>
-      <w:r>
-        <w:rPr>
-          <w:noProof/>
+        <w:numPr>
+          <w:numId w:val="0"/>
+        </w:numPr>
+        <w:ind w:left="360" w:leftChars="0"/>
+        <w:rPr>
+          <w:rFonts w:hint="default"/>
+          <w:lang w:val="vi-VN"/>
+        </w:rPr>
+      </w:pPr>
+      <w:r>
+        <w:rPr>
+          <w:rFonts w:hint="default"/>
+          <w:lang w:val="vi-VN"/>
         </w:rPr>
         <w:drawing>
-          <wp:anchor distT="0" distB="0" distL="114300" distR="114300" simplePos="0" relativeHeight="251665920" behindDoc="0" locked="0" layoutInCell="1" allowOverlap="1" wp14:anchorId="0B9E151D" wp14:editId="0B785EBB">
+          <wp:inline distT="0" distB="0" distL="114300" distR="114300">
+            <wp:extent cx="5939155" cy="3336925"/>
+            <wp:effectExtent l="0" t="0" r="4445" b="635"/>
+            <wp:docPr id="3" name="Hình ảnh 3" descr="Ảnh chụp màn hình 2026-10-02 134543"/>
+            <wp:cNvGraphicFramePr>
+              <a:graphicFrameLocks xmlns:a="http://schemas.openxmlformats.org/drawingml/2006/main" noChangeAspect="1"/>
+            </wp:cNvGraphicFramePr>
+            <a:graphic xmlns:a="http://schemas.openxmlformats.org/drawingml/2006/main">
+              <a:graphicData uri="http://schemas.openxmlformats.org/drawingml/2006/picture">
+                <pic:pic xmlns:pic="http://schemas.openxmlformats.org/drawingml/2006/picture">
+                  <pic:nvPicPr>
+                    <pic:cNvPr id="3" name="Hình ảnh 3" descr="Ảnh chụp màn hình 2026-10-02 134543"/>
+                    <pic:cNvPicPr>
+                      <a:picLocks noChangeAspect="1"/>
+                    </pic:cNvPicPr>
+                  </pic:nvPicPr>
+                  <pic:blipFill>
+                    <a:blip r:embed="rId12"/>
+                    <a:stretch>
+                      <a:fillRect/>
+                    </a:stretch>
+                  </pic:blipFill>
+                  <pic:spPr>
+                    <a:xfrm>
+                      <a:off x="0" y="0"/>
+                      <a:ext cx="5939155" cy="3336925"/>
+                    </a:xfrm>
+                    <a:prstGeom prst="rect">
+                      <a:avLst/>
+                    </a:prstGeom>
+                  </pic:spPr>
+                </pic:pic>
+              </a:graphicData>
+            </a:graphic>
+          </wp:inline>
+        </w:drawing>
+      </w:r>
+    </w:p>
+    <w:p>
+      <w:pPr>
+        <w:rPr>
+          <w:b/>
+          <w:bCs/>
+        </w:rPr>
+      </w:pPr>
+      <w:r>
+        <w:drawing>
+          <wp:anchor distT="0" distB="0" distL="114300" distR="114300" simplePos="0" relativeHeight="251664384" behindDoc="0" locked="0" layoutInCell="1" allowOverlap="1">
             <wp:simplePos x="0" y="0"/>
             <wp:positionH relativeFrom="column">
               <wp:posOffset>4387850</wp:posOffset>
@@ -835,10 +967,12 @@
                 <pic:pic xmlns:pic="http://schemas.openxmlformats.org/drawingml/2006/picture">
                   <pic:nvPicPr>
                     <pic:cNvPr id="148849504" name="Picture 1" descr="A white background with black text&#10;&#10;AI-generated content may be incorrect."/>
-                    <pic:cNvPicPr/>
+                    <pic:cNvPicPr>
+                      <a:picLocks noChangeAspect="1"/>
+                    </pic:cNvPicPr>
                   </pic:nvPicPr>
                   <pic:blipFill>
-                    <a:blip r:embed="rId9">
+                    <a:blip r:embed="rId13">
                       <a:extLst>
                         <a:ext uri="{28A0092B-C50C-407E-A947-70E740481C1C}">
                           <a14:useLocalDpi xmlns:a14="http://schemas.microsoft.com/office/drawing/2010/main" val="0"/>
@@ -861,12 +995,6 @@
                 </pic:pic>
               </a:graphicData>
             </a:graphic>
-            <wp14:sizeRelH relativeFrom="page">
-              <wp14:pctWidth>0</wp14:pctWidth>
-            </wp14:sizeRelH>
-            <wp14:sizeRelV relativeFrom="page">
-              <wp14:pctHeight>0</wp14:pctHeight>
-            </wp14:sizeRelV>
           </wp:anchor>
         </w:drawing>
       </w:r>
@@ -875,14 +1003,7 @@
           <w:b/>
           <w:bCs/>
         </w:rPr>
-        <w:t>Exercise 4 – App Structure with Scaffold, AppBar, FAB &amp; Theme</w:t>
-      </w:r>
-      <w:r>
-        <w:rPr>
-          <w:b/>
-          <w:bCs/>
-        </w:rPr>
-        <w:t xml:space="preserve"> </w:t>
+        <w:t xml:space="preserve">Exercise 4 – App Structure with Scaffold, AppBar, FAB &amp; Theme </w:t>
       </w:r>
     </w:p>
     <w:p>
@@ -989,17 +1110,73 @@
     </w:p>
     <w:p>
       <w:pPr>
-        <w:rPr>
-          <w:b/>
-          <w:bCs/>
-        </w:rPr>
-      </w:pPr>
-      <w:r>
-        <w:rPr>
-          <w:noProof/>
+        <w:numPr>
+          <w:numId w:val="0"/>
+        </w:numPr>
+        <w:ind w:left="360" w:leftChars="0"/>
+        <w:rPr>
+          <w:rFonts w:hint="default"/>
+          <w:b/>
+          <w:bCs/>
+          <w:lang w:val="vi-VN"/>
+        </w:rPr>
+      </w:pPr>
+      <w:r>
+        <w:rPr>
+          <w:rFonts w:hint="default"/>
+          <w:b/>
+          <w:bCs/>
+          <w:lang w:val="vi-VN"/>
         </w:rPr>
         <w:drawing>
-          <wp:anchor distT="0" distB="0" distL="114300" distR="114300" simplePos="0" relativeHeight="251663872" behindDoc="0" locked="0" layoutInCell="1" allowOverlap="1" wp14:anchorId="4D184853" wp14:editId="09209801">
+          <wp:inline distT="0" distB="0" distL="114300" distR="114300">
+            <wp:extent cx="5939155" cy="3336925"/>
+            <wp:effectExtent l="0" t="0" r="4445" b="635"/>
+            <wp:docPr id="5" name="Hình ảnh 5" descr="Ảnh chụp màn hình 2026-10-02 135218"/>
+            <wp:cNvGraphicFramePr>
+              <a:graphicFrameLocks xmlns:a="http://schemas.openxmlformats.org/drawingml/2006/main" noChangeAspect="1"/>
+            </wp:cNvGraphicFramePr>
+            <a:graphic xmlns:a="http://schemas.openxmlformats.org/drawingml/2006/main">
+              <a:graphicData uri="http://schemas.openxmlformats.org/drawingml/2006/picture">
+                <pic:pic xmlns:pic="http://schemas.openxmlformats.org/drawingml/2006/picture">
+                  <pic:nvPicPr>
+                    <pic:cNvPr id="5" name="Hình ảnh 5" descr="Ảnh chụp màn hình 2026-10-02 135218"/>
+                    <pic:cNvPicPr>
+                      <a:picLocks noChangeAspect="1"/>
+                    </pic:cNvPicPr>
+                  </pic:nvPicPr>
+                  <pic:blipFill>
+                    <a:blip r:embed="rId14"/>
+                    <a:stretch>
+                      <a:fillRect/>
+                    </a:stretch>
+                  </pic:blipFill>
+                  <pic:spPr>
+                    <a:xfrm>
+                      <a:off x="0" y="0"/>
+                      <a:ext cx="5939155" cy="3336925"/>
+                    </a:xfrm>
+                    <a:prstGeom prst="rect">
+                      <a:avLst/>
+                    </a:prstGeom>
+                  </pic:spPr>
+                </pic:pic>
+              </a:graphicData>
+            </a:graphic>
+          </wp:inline>
+        </w:drawing>
+      </w:r>
+    </w:p>
+    <w:p>
+      <w:pPr>
+        <w:rPr>
+          <w:b/>
+          <w:bCs/>
+        </w:rPr>
+      </w:pPr>
+      <w:r>
+        <w:drawing>
+          <wp:anchor distT="0" distB="0" distL="114300" distR="114300" simplePos="0" relativeHeight="251663360" behindDoc="0" locked="0" layoutInCell="1" allowOverlap="1">
             <wp:simplePos x="0" y="0"/>
             <wp:positionH relativeFrom="column">
               <wp:posOffset>4559300</wp:posOffset>
@@ -1019,10 +1196,12 @@
                 <pic:pic xmlns:pic="http://schemas.openxmlformats.org/drawingml/2006/picture">
                   <pic:nvPicPr>
                     <pic:cNvPr id="1619735446" name="Picture 1" descr="A screenshot of a computer&#10;&#10;AI-generated content may be incorrect."/>
-                    <pic:cNvPicPr/>
+                    <pic:cNvPicPr>
+                      <a:picLocks noChangeAspect="1"/>
+                    </pic:cNvPicPr>
                   </pic:nvPicPr>
                   <pic:blipFill>
-                    <a:blip r:embed="rId10">
+                    <a:blip r:embed="rId15">
                       <a:extLst>
                         <a:ext uri="{28A0092B-C50C-407E-A947-70E740481C1C}">
                           <a14:useLocalDpi xmlns:a14="http://schemas.microsoft.com/office/drawing/2010/main" val="0"/>
@@ -1045,12 +1224,6 @@
                 </pic:pic>
               </a:graphicData>
             </a:graphic>
-            <wp14:sizeRelH relativeFrom="page">
-              <wp14:pctWidth>0</wp14:pctWidth>
-            </wp14:sizeRelH>
-            <wp14:sizeRelV relativeFrom="page">
-              <wp14:pctHeight>0</wp14:pctHeight>
-            </wp14:sizeRelV>
           </wp:anchor>
         </w:drawing>
       </w:r>
@@ -1059,14 +1232,7 @@
           <w:b/>
           <w:bCs/>
         </w:rPr>
-        <w:t>Exercise 5 – Debug &amp; Fix Common UI Errors</w:t>
-      </w:r>
-      <w:r>
-        <w:rPr>
-          <w:b/>
-          <w:bCs/>
-        </w:rPr>
-        <w:t xml:space="preserve"> </w:t>
+        <w:t xml:space="preserve">Exercise 5 – Debug &amp; Fix Common UI Errors </w:t>
       </w:r>
     </w:p>
     <w:p>
@@ -1080,6 +1246,8 @@
       <w:r>
         <w:t xml:space="preserve"> Understand common layout issues and fix them.</w:t>
       </w:r>
+      <w:bookmarkStart w:id="0" w:name="_GoBack"/>
+      <w:bookmarkEnd w:id="0"/>
     </w:p>
     <w:p>
       <w:r>
@@ -1156,25 +1324,79 @@
     </w:p>
     <w:p>
       <w:pPr>
-        <w:rPr>
-          <w:b/>
-          <w:bCs/>
-        </w:rPr>
-      </w:pPr>
-    </w:p>
-    <w:p>
-      <w:pPr>
-        <w:rPr>
-          <w:b/>
-          <w:bCs/>
-        </w:rPr>
-      </w:pPr>
-      <w:r>
-        <w:rPr>
-          <w:b/>
-          <w:bCs/>
-        </w:rPr>
-        <w:lastRenderedPageBreak/>
+        <w:numPr>
+          <w:numId w:val="0"/>
+        </w:numPr>
+        <w:ind w:left="360" w:leftChars="0"/>
+        <w:rPr>
+          <w:rFonts w:hint="default"/>
+          <w:lang w:val="vi-VN"/>
+        </w:rPr>
+      </w:pPr>
+      <w:r>
+        <w:rPr>
+          <w:rFonts w:hint="default"/>
+          <w:lang w:val="vi-VN"/>
+        </w:rPr>
+        <w:drawing>
+          <wp:inline distT="0" distB="0" distL="114300" distR="114300">
+            <wp:extent cx="5939155" cy="3336925"/>
+            <wp:effectExtent l="0" t="0" r="4445" b="635"/>
+            <wp:docPr id="6" name="Hình ảnh 6" descr="Ảnh chụp màn hình 2026-10-02 153715"/>
+            <wp:cNvGraphicFramePr>
+              <a:graphicFrameLocks xmlns:a="http://schemas.openxmlformats.org/drawingml/2006/main" noChangeAspect="1"/>
+            </wp:cNvGraphicFramePr>
+            <a:graphic xmlns:a="http://schemas.openxmlformats.org/drawingml/2006/main">
+              <a:graphicData uri="http://schemas.openxmlformats.org/drawingml/2006/picture">
+                <pic:pic xmlns:pic="http://schemas.openxmlformats.org/drawingml/2006/picture">
+                  <pic:nvPicPr>
+                    <pic:cNvPr id="6" name="Hình ảnh 6" descr="Ảnh chụp màn hình 2026-10-02 153715"/>
+                    <pic:cNvPicPr>
+                      <a:picLocks noChangeAspect="1"/>
+                    </pic:cNvPicPr>
+                  </pic:nvPicPr>
+                  <pic:blipFill>
+                    <a:blip r:embed="rId16"/>
+                    <a:stretch>
+                      <a:fillRect/>
+                    </a:stretch>
+                  </pic:blipFill>
+                  <pic:spPr>
+                    <a:xfrm>
+                      <a:off x="0" y="0"/>
+                      <a:ext cx="5939155" cy="3336925"/>
+                    </a:xfrm>
+                    <a:prstGeom prst="rect">
+                      <a:avLst/>
+                    </a:prstGeom>
+                  </pic:spPr>
+                </pic:pic>
+              </a:graphicData>
+            </a:graphic>
+          </wp:inline>
+        </w:drawing>
+      </w:r>
+    </w:p>
+    <w:p>
+      <w:pPr>
+        <w:rPr>
+          <w:b/>
+          <w:bCs/>
+        </w:rPr>
+      </w:pPr>
+    </w:p>
+    <w:p>
+      <w:pPr>
+        <w:rPr>
+          <w:b/>
+          <w:bCs/>
+        </w:rPr>
+      </w:pPr>
+      <w:r>
+        <w:rPr>
+          <w:b/>
+          <w:bCs/>
+        </w:rPr>
         <w:t>4. Expected Results</w:t>
       </w:r>
     </w:p>
@@ -1251,8 +1473,16 @@
     </w:p>
     <w:p>
       <w:r>
-        <w:pict w14:anchorId="14D26995">
-          <v:rect id="_x0000_i1056" style="width:0;height:1.5pt" o:hralign="center" o:hrstd="t" o:hr="t" fillcolor="#a0a0a0" stroked="f"/>
+        <w:pict>
+          <v:rect id="_x0000_i1025" o:spt="1" style="height:1.5pt;width:0pt;" fillcolor="#A0A0A0" filled="t" stroked="f" coordsize="21600,21600" o:hr="t" o:hrstd="t" o:hralign="center">
+            <v:path/>
+            <v:fill on="t" focussize="0,0"/>
+            <v:stroke on="f"/>
+            <v:imagedata o:title=""/>
+            <o:lock v:ext="edit"/>
+            <w10:wrap type="none"/>
+            <w10:anchorlock/>
+          </v:rect>
         </w:pict>
       </w:r>
     </w:p>
@@ -1321,9 +1551,6 @@
         <w:ind w:left="720"/>
       </w:pPr>
       <w:r>
-        <w:rPr>
-          <w:noProof/>
-        </w:rPr>
         <w:t xml:space="preserve"> </w:t>
       </w:r>
     </w:p>
@@ -1331,1587 +1558,1407 @@
     <w:sectPr>
       <w:pgSz w:w="12240" w:h="15840"/>
       <w:pgMar w:top="1440" w:right="1440" w:bottom="1440" w:left="1440" w:header="720" w:footer="720" w:gutter="0"/>
-      <w:cols w:space="720"/>
-      <w:docGrid w:linePitch="360"/>
+      <w:cols w:space="720" w:num="1"/>
+      <w:docGrid w:linePitch="360" w:charSpace="0"/>
     </w:sectPr>
   </w:body>
 </w:document>
 </file>
 
+<file path=word/endnotes.xml><?xml version="1.0" encoding="utf-8"?>
+<w:endnotes xmlns:wpc="http://schemas.microsoft.com/office/word/2010/wordprocessingCanvas" xmlns:mc="http://schemas.openxmlformats.org/markup-compatibility/2006" xmlns:o="urn:schemas-microsoft-com:office:office" xmlns:r="http://schemas.openxmlformats.org/officeDocument/2006/relationships" xmlns:m="http://schemas.openxmlformats.org/officeDocument/2006/math" xmlns:v="urn:schemas-microsoft-com:vml" xmlns:wp14="http://schemas.microsoft.com/office/word/2010/wordprocessingDrawing" xmlns:wp="http://schemas.openxmlformats.org/drawingml/2006/wordprocessingDrawing" xmlns:w="http://schemas.openxmlformats.org/wordprocessingml/2006/main" xmlns:w14="http://schemas.microsoft.com/office/word/2010/wordml" xmlns:w15="http://schemas.microsoft.com/office/word/2012/wordml" xmlns:w10="urn:schemas-microsoft-com:office:word" xmlns:wpg="http://schemas.microsoft.com/office/word/2010/wordprocessingGroup" xmlns:wpi="http://schemas.microsoft.com/office/word/2010/wordprocessingInk" xmlns:wne="http://schemas.microsoft.com/office/word/2006/wordml" xmlns:wps="http://schemas.microsoft.com/office/word/2010/wordprocessingShape" xmlns:wpsCustomData="http://www.wps.cn/officeDocument/2013/wpsCustomData" mc:Ignorable="w14 w15 wp14">
+  <w:endnote w:type="separator" w:id="0">
+    <w:p>
+      <w:pPr>
+        <w:spacing w:line="240" w:lineRule="auto"/>
+      </w:pPr>
+      <w:r>
+        <w:separator/>
+      </w:r>
+    </w:p>
+  </w:endnote>
+  <w:endnote w:type="continuationSeparator" w:id="1">
+    <w:p>
+      <w:pPr>
+        <w:spacing w:line="240" w:lineRule="auto"/>
+      </w:pPr>
+      <w:r>
+        <w:continuationSeparator/>
+      </w:r>
+    </w:p>
+  </w:endnote>
+</w:endnotes>
+</file>
+
+<file path=word/footnotes.xml><?xml version="1.0" encoding="utf-8"?>
+<w:footnotes xmlns:wpc="http://schemas.microsoft.com/office/word/2010/wordprocessingCanvas" xmlns:mc="http://schemas.openxmlformats.org/markup-compatibility/2006" xmlns:o="urn:schemas-microsoft-com:office:office" xmlns:r="http://schemas.openxmlformats.org/officeDocument/2006/relationships" xmlns:m="http://schemas.openxmlformats.org/officeDocument/2006/math" xmlns:v="urn:schemas-microsoft-com:vml" xmlns:wp14="http://schemas.microsoft.com/office/word/2010/wordprocessingDrawing" xmlns:wp="http://schemas.openxmlformats.org/drawingml/2006/wordprocessingDrawing" xmlns:w="http://schemas.openxmlformats.org/wordprocessingml/2006/main" xmlns:w14="http://schemas.microsoft.com/office/word/2010/wordml" xmlns:w15="http://schemas.microsoft.com/office/word/2012/wordml" xmlns:w10="urn:schemas-microsoft-com:office:word" xmlns:wpg="http://schemas.microsoft.com/office/word/2010/wordprocessingGroup" xmlns:wpi="http://schemas.microsoft.com/office/word/2010/wordprocessingInk" xmlns:wne="http://schemas.microsoft.com/office/word/2006/wordml" xmlns:wps="http://schemas.microsoft.com/office/word/2010/wordprocessingShape" xmlns:wpsCustomData="http://www.wps.cn/officeDocument/2013/wpsCustomData" mc:Ignorable="w14 w15 wp14">
+  <w:footnote w:type="separator" w:id="0">
+    <w:p>
+      <w:pPr>
+        <w:spacing w:before="0" w:after="0" w:line="276" w:lineRule="auto"/>
+      </w:pPr>
+      <w:r>
+        <w:separator/>
+      </w:r>
+    </w:p>
+  </w:footnote>
+  <w:footnote w:type="continuationSeparator" w:id="1">
+    <w:p>
+      <w:pPr>
+        <w:spacing w:before="0" w:after="0" w:line="276" w:lineRule="auto"/>
+      </w:pPr>
+      <w:r>
+        <w:continuationSeparator/>
+      </w:r>
+    </w:p>
+  </w:footnote>
+</w:footnotes>
+</file>
+
 <file path=word/numbering.xml><?xml version="1.0" encoding="utf-8"?>
-<w:numbering xmlns:wpc="http://schemas.microsoft.com/office/word/2010/wordprocessingCanvas" xmlns:cx="http://schemas.microsoft.com/office/drawing/2014/chartex" xmlns:cx1="http://schemas.microsoft.com/office/drawing/2015/9/8/chartex" xmlns:cx2="http://schemas.microsoft.com/office/drawing/2015/10/21/chartex" xmlns:cx3="http://schemas.microsoft.com/office/drawing/2016/5/9/chartex" xmlns:cx4="http://schemas.microsoft.com/office/drawing/2016/5/10/chartex" xmlns:cx5="http://schemas.microsoft.com/office/drawing/2016/5/11/chartex" xmlns:cx6="http://schemas.microsoft.com/office/drawing/2016/5/12/chartex" xmlns:cx7="http://schemas.microsoft.com/office/drawing/2016/5/13/chartex" xmlns:cx8="http://schemas.microsoft.com/office/drawing/2016/5/14/chartex" xmlns:mc="http://schemas.openxmlformats.org/markup-compatibility/2006" xmlns:aink="http://schemas.microsoft.com/office/drawing/2016/ink" xmlns:am3d="http://schemas.microsoft.com/office/drawing/2017/model3d" xmlns:o="urn:schemas-microsoft-com:office:office" xmlns:oel="http://schemas.microsoft.com/office/2019/extlst" xmlns:r="http://schemas.openxmlformats.org/officeDocument/2006/relationships" xmlns:m="http://schemas.openxmlformats.org/officeDocument/2006/math" xmlns:v="urn:schemas-microsoft-com:vml" xmlns:wp14="http://schemas.microsoft.com/office/word/2010/wordprocessingDrawing" xmlns:wp="http://schemas.openxmlformats.org/drawingml/2006/wordprocessingDrawing" xmlns:w10="urn:schemas-microsoft-com:office:word" xmlns:w="http://schemas.openxmlformats.org/wordprocessingml/2006/main" xmlns:w14="http://schemas.microsoft.com/office/word/2010/wordml" xmlns:w15="http://schemas.microsoft.com/office/word/2012/wordml" xmlns:w16cex="http://schemas.microsoft.com/office/word/2018/wordml/cex" xmlns:w16cid="http://schemas.microsoft.com/office/word/2016/wordml/cid" xmlns:w16="http://schemas.microsoft.com/office/word/2018/wordml" xmlns:w16du="http://schemas.microsoft.com/office/word/2023/wordml/word16du" xmlns:w16sdtdh="http://schemas.microsoft.com/office/word/2020/wordml/sdtdatahash" xmlns:w16sdtfl="http://schemas.microsoft.com/office/word/2024/wordml/sdtformatlock" xmlns:w16se="http://schemas.microsoft.com/office/word/2015/wordml/symex" xmlns:wpg="http://schemas.microsoft.com/office/word/2010/wordprocessingGroup" xmlns:wpi="http://schemas.microsoft.com/office/word/2010/wordprocessingInk" xmlns:wne="http://schemas.microsoft.com/office/word/2006/wordml" xmlns:wps="http://schemas.microsoft.com/office/word/2010/wordprocessingShape" mc:Ignorable="w14 w15 w16se w16cid w16 w16cex w16sdtdh w16sdtfl w16du wp14">
-  <w:abstractNum w:abstractNumId="0" w15:restartNumberingAfterBreak="0">
+<w:numbering xmlns:wpc="http://schemas.microsoft.com/office/word/2010/wordprocessingCanvas" xmlns:mc="http://schemas.openxmlformats.org/markup-compatibility/2006" xmlns:o="urn:schemas-microsoft-com:office:office" xmlns:r="http://schemas.openxmlformats.org/officeDocument/2006/relationships" xmlns:m="http://schemas.openxmlformats.org/officeDocument/2006/math" xmlns:v="urn:schemas-microsoft-com:vml" xmlns:wp14="http://schemas.microsoft.com/office/word/2010/wordprocessingDrawing" xmlns:wp="http://schemas.openxmlformats.org/drawingml/2006/wordprocessingDrawing" xmlns:w10="urn:schemas-microsoft-com:office:word" xmlns:w="http://schemas.openxmlformats.org/wordprocessingml/2006/main" xmlns:w14="http://schemas.microsoft.com/office/word/2010/wordml" xmlns:wpg="http://schemas.microsoft.com/office/word/2010/wordprocessingGroup" xmlns:wpi="http://schemas.microsoft.com/office/word/2010/wordprocessingInk" xmlns:wne="http://schemas.microsoft.com/office/word/2006/wordml" xmlns:wps="http://schemas.microsoft.com/office/word/2010/wordprocessingShape" xmlns:wpsCustomData="http://www.wps.cn/officeDocument/2013/wpsCustomData" mc:Ignorable="w14 wp14">
+  <w:abstractNum w:abstractNumId="0">
     <w:nsid w:val="1B1F29D7"/>
     <w:multiLevelType w:val="multilevel"/>
-    <w:tmpl w:val="D0C6BB92"/>
-    <w:lvl w:ilvl="0">
+    <w:tmpl w:val="1B1F29D7"/>
+    <w:lvl w:ilvl="0" w:tentative="0">
       <w:start w:val="1"/>
       <w:numFmt w:val="decimal"/>
       <w:lvlText w:val="%1."/>
       <w:lvlJc w:val="left"/>
       <w:pPr>
         <w:tabs>
-          <w:tab w:val="num" w:pos="720"/>
+          <w:tab w:val="left" w:pos="720"/>
         </w:tabs>
         <w:ind w:left="720" w:hanging="360"/>
       </w:pPr>
     </w:lvl>
-    <w:lvl w:ilvl="1" w:tentative="1">
+    <w:lvl w:ilvl="1" w:tentative="0">
       <w:start w:val="1"/>
       <w:numFmt w:val="decimal"/>
       <w:lvlText w:val="%2."/>
       <w:lvlJc w:val="left"/>
       <w:pPr>
         <w:tabs>
-          <w:tab w:val="num" w:pos="1440"/>
+          <w:tab w:val="left" w:pos="1440"/>
         </w:tabs>
         <w:ind w:left="1440" w:hanging="360"/>
       </w:pPr>
     </w:lvl>
-    <w:lvl w:ilvl="2" w:tentative="1">
+    <w:lvl w:ilvl="2" w:tentative="0">
       <w:start w:val="1"/>
       <w:numFmt w:val="decimal"/>
       <w:lvlText w:val="%3."/>
       <w:lvlJc w:val="left"/>
       <w:pPr>
         <w:tabs>
-          <w:tab w:val="num" w:pos="2160"/>
+          <w:tab w:val="left" w:pos="2160"/>
         </w:tabs>
         <w:ind w:left="2160" w:hanging="360"/>
       </w:pPr>
     </w:lvl>
-    <w:lvl w:ilvl="3" w:tentative="1">
+    <w:lvl w:ilvl="3" w:tentative="0">
       <w:start w:val="1"/>
       <w:numFmt w:val="decimal"/>
       <w:lvlText w:val="%4."/>
       <w:lvlJc w:val="left"/>
       <w:pPr>
         <w:tabs>
-          <w:tab w:val="num" w:pos="2880"/>
+          <w:tab w:val="left" w:pos="2880"/>
         </w:tabs>
         <w:ind w:left="2880" w:hanging="360"/>
       </w:pPr>
     </w:lvl>
-    <w:lvl w:ilvl="4" w:tentative="1">
+    <w:lvl w:ilvl="4" w:tentative="0">
       <w:start w:val="1"/>
       <w:numFmt w:val="decimal"/>
       <w:lvlText w:val="%5."/>
       <w:lvlJc w:val="left"/>
       <w:pPr>
         <w:tabs>
-          <w:tab w:val="num" w:pos="3600"/>
+          <w:tab w:val="left" w:pos="3600"/>
         </w:tabs>
         <w:ind w:left="3600" w:hanging="360"/>
       </w:pPr>
     </w:lvl>
-    <w:lvl w:ilvl="5" w:tentative="1">
+    <w:lvl w:ilvl="5" w:tentative="0">
       <w:start w:val="1"/>
       <w:numFmt w:val="decimal"/>
       <w:lvlText w:val="%6."/>
       <w:lvlJc w:val="left"/>
       <w:pPr>
         <w:tabs>
-          <w:tab w:val="num" w:pos="4320"/>
+          <w:tab w:val="left" w:pos="4320"/>
         </w:tabs>
         <w:ind w:left="4320" w:hanging="360"/>
       </w:pPr>
     </w:lvl>
-    <w:lvl w:ilvl="6" w:tentative="1">
+    <w:lvl w:ilvl="6" w:tentative="0">
       <w:start w:val="1"/>
       <w:numFmt w:val="decimal"/>
       <w:lvlText w:val="%7."/>
       <w:lvlJc w:val="left"/>
       <w:pPr>
         <w:tabs>
-          <w:tab w:val="num" w:pos="5040"/>
+          <w:tab w:val="left" w:pos="5040"/>
         </w:tabs>
         <w:ind w:left="5040" w:hanging="360"/>
       </w:pPr>
     </w:lvl>
-    <w:lvl w:ilvl="7" w:tentative="1">
+    <w:lvl w:ilvl="7" w:tentative="0">
       <w:start w:val="1"/>
       <w:numFmt w:val="decimal"/>
       <w:lvlText w:val="%8."/>
       <w:lvlJc w:val="left"/>
       <w:pPr>
         <w:tabs>
-          <w:tab w:val="num" w:pos="5760"/>
+          <w:tab w:val="left" w:pos="5760"/>
         </w:tabs>
         <w:ind w:left="5760" w:hanging="360"/>
       </w:pPr>
     </w:lvl>
-    <w:lvl w:ilvl="8" w:tentative="1">
+    <w:lvl w:ilvl="8" w:tentative="0">
       <w:start w:val="1"/>
       <w:numFmt w:val="decimal"/>
       <w:lvlText w:val="%9."/>
       <w:lvlJc w:val="left"/>
       <w:pPr>
         <w:tabs>
-          <w:tab w:val="num" w:pos="6480"/>
+          <w:tab w:val="left" w:pos="6480"/>
         </w:tabs>
         <w:ind w:left="6480" w:hanging="360"/>
       </w:pPr>
     </w:lvl>
   </w:abstractNum>
-  <w:abstractNum w:abstractNumId="1" w15:restartNumberingAfterBreak="0">
+  <w:abstractNum w:abstractNumId="1">
     <w:nsid w:val="3BF43097"/>
     <w:multiLevelType w:val="multilevel"/>
-    <w:tmpl w:val="8914433C"/>
-    <w:lvl w:ilvl="0">
+    <w:tmpl w:val="3BF43097"/>
+    <w:lvl w:ilvl="0" w:tentative="0">
       <w:start w:val="1"/>
       <w:numFmt w:val="decimal"/>
       <w:lvlText w:val="%1."/>
       <w:lvlJc w:val="left"/>
       <w:pPr>
         <w:tabs>
-          <w:tab w:val="num" w:pos="720"/>
+          <w:tab w:val="left" w:pos="720"/>
         </w:tabs>
         <w:ind w:left="720" w:hanging="360"/>
       </w:pPr>
     </w:lvl>
-    <w:lvl w:ilvl="1" w:tentative="1">
+    <w:lvl w:ilvl="1" w:tentative="0">
       <w:start w:val="1"/>
       <w:numFmt w:val="decimal"/>
       <w:lvlText w:val="%2."/>
       <w:lvlJc w:val="left"/>
       <w:pPr>
         <w:tabs>
-          <w:tab w:val="num" w:pos="1440"/>
+          <w:tab w:val="left" w:pos="1440"/>
         </w:tabs>
         <w:ind w:left="1440" w:hanging="360"/>
       </w:pPr>
     </w:lvl>
-    <w:lvl w:ilvl="2" w:tentative="1">
+    <w:lvl w:ilvl="2" w:tentative="0">
       <w:start w:val="1"/>
       <w:numFmt w:val="decimal"/>
       <w:lvlText w:val="%3."/>
       <w:lvlJc w:val="left"/>
       <w:pPr>
         <w:tabs>
-          <w:tab w:val="num" w:pos="2160"/>
+          <w:tab w:val="left" w:pos="2160"/>
         </w:tabs>
         <w:ind w:left="2160" w:hanging="360"/>
       </w:pPr>
     </w:lvl>
-    <w:lvl w:ilvl="3" w:tentative="1">
+    <w:lvl w:ilvl="3" w:tentative="0">
       <w:start w:val="1"/>
       <w:numFmt w:val="decimal"/>
       <w:lvlText w:val="%4."/>
       <w:lvlJc w:val="left"/>
       <w:pPr>
         <w:tabs>
-          <w:tab w:val="num" w:pos="2880"/>
+          <w:tab w:val="left" w:pos="2880"/>
         </w:tabs>
         <w:ind w:left="2880" w:hanging="360"/>
       </w:pPr>
     </w:lvl>
-    <w:lvl w:ilvl="4" w:tentative="1">
+    <w:lvl w:ilvl="4" w:tentative="0">
       <w:start w:val="1"/>
       <w:numFmt w:val="decimal"/>
       <w:lvlText w:val="%5."/>
       <w:lvlJc w:val="left"/>
       <w:pPr>
         <w:tabs>
-          <w:tab w:val="num" w:pos="3600"/>
+          <w:tab w:val="left" w:pos="3600"/>
         </w:tabs>
         <w:ind w:left="3600" w:hanging="360"/>
       </w:pPr>
     </w:lvl>
-    <w:lvl w:ilvl="5" w:tentative="1">
+    <w:lvl w:ilvl="5" w:tentative="0">
       <w:start w:val="1"/>
       <w:numFmt w:val="decimal"/>
       <w:lvlText w:val="%6."/>
       <w:lvlJc w:val="left"/>
       <w:pPr>
         <w:tabs>
-          <w:tab w:val="num" w:pos="4320"/>
+          <w:tab w:val="left" w:pos="4320"/>
         </w:tabs>
         <w:ind w:left="4320" w:hanging="360"/>
       </w:pPr>
     </w:lvl>
-    <w:lvl w:ilvl="6" w:tentative="1">
+    <w:lvl w:ilvl="6" w:tentative="0">
       <w:start w:val="1"/>
       <w:numFmt w:val="decimal"/>
       <w:lvlText w:val="%7."/>
       <w:lvlJc w:val="left"/>
       <w:pPr>
         <w:tabs>
-          <w:tab w:val="num" w:pos="5040"/>
+          <w:tab w:val="left" w:pos="5040"/>
         </w:tabs>
         <w:ind w:left="5040" w:hanging="360"/>
       </w:pPr>
     </w:lvl>
-    <w:lvl w:ilvl="7" w:tentative="1">
+    <w:lvl w:ilvl="7" w:tentative="0">
       <w:start w:val="1"/>
       <w:numFmt w:val="decimal"/>
       <w:lvlText w:val="%8."/>
       <w:lvlJc w:val="left"/>
       <w:pPr>
         <w:tabs>
-          <w:tab w:val="num" w:pos="5760"/>
+          <w:tab w:val="left" w:pos="5760"/>
         </w:tabs>
         <w:ind w:left="5760" w:hanging="360"/>
       </w:pPr>
     </w:lvl>
-    <w:lvl w:ilvl="8" w:tentative="1">
+    <w:lvl w:ilvl="8" w:tentative="0">
       <w:start w:val="1"/>
       <w:numFmt w:val="decimal"/>
       <w:lvlText w:val="%9."/>
       <w:lvlJc w:val="left"/>
       <w:pPr>
         <w:tabs>
-          <w:tab w:val="num" w:pos="6480"/>
+          <w:tab w:val="left" w:pos="6480"/>
         </w:tabs>
         <w:ind w:left="6480" w:hanging="360"/>
       </w:pPr>
     </w:lvl>
   </w:abstractNum>
-  <w:abstractNum w:abstractNumId="2" w15:restartNumberingAfterBreak="0">
+  <w:abstractNum w:abstractNumId="2">
     <w:nsid w:val="3C083444"/>
     <w:multiLevelType w:val="multilevel"/>
-    <w:tmpl w:val="C1AA329A"/>
-    <w:lvl w:ilvl="0">
+    <w:tmpl w:val="3C083444"/>
+    <w:lvl w:ilvl="0" w:tentative="0">
       <w:start w:val="1"/>
       <w:numFmt w:val="bullet"/>
       <w:lvlText w:val=""/>
       <w:lvlJc w:val="left"/>
       <w:pPr>
         <w:tabs>
-          <w:tab w:val="num" w:pos="720"/>
+          <w:tab w:val="left" w:pos="720"/>
         </w:tabs>
         <w:ind w:left="720" w:hanging="360"/>
       </w:pPr>
       <w:rPr>
-        <w:rFonts w:ascii="Symbol" w:hAnsi="Symbol" w:hint="default"/>
+        <w:rFonts w:hint="default" w:ascii="Symbol" w:hAnsi="Symbol"/>
         <w:sz w:val="20"/>
       </w:rPr>
     </w:lvl>
-    <w:lvl w:ilvl="1" w:tentative="1">
+    <w:lvl w:ilvl="1" w:tentative="0">
       <w:start w:val="1"/>
       <w:numFmt w:val="bullet"/>
       <w:lvlText w:val="o"/>
       <w:lvlJc w:val="left"/>
       <w:pPr>
         <w:tabs>
-          <w:tab w:val="num" w:pos="1440"/>
+          <w:tab w:val="left" w:pos="1440"/>
         </w:tabs>
         <w:ind w:left="1440" w:hanging="360"/>
       </w:pPr>
       <w:rPr>
-        <w:rFonts w:ascii="Courier New" w:hAnsi="Courier New" w:hint="default"/>
+        <w:rFonts w:hint="default" w:ascii="Courier New" w:hAnsi="Courier New"/>
         <w:sz w:val="20"/>
       </w:rPr>
     </w:lvl>
-    <w:lvl w:ilvl="2" w:tentative="1">
+    <w:lvl w:ilvl="2" w:tentative="0">
       <w:start w:val="1"/>
       <w:numFmt w:val="bullet"/>
       <w:lvlText w:val=""/>
       <w:lvlJc w:val="left"/>
       <w:pPr>
         <w:tabs>
-          <w:tab w:val="num" w:pos="2160"/>
+          <w:tab w:val="left" w:pos="2160"/>
         </w:tabs>
         <w:ind w:left="2160" w:hanging="360"/>
       </w:pPr>
       <w:rPr>
-        <w:rFonts w:ascii="Wingdings" w:hAnsi="Wingdings" w:hint="default"/>
+        <w:rFonts w:hint="default" w:ascii="Wingdings" w:hAnsi="Wingdings"/>
         <w:sz w:val="20"/>
       </w:rPr>
     </w:lvl>
-    <w:lvl w:ilvl="3" w:tentative="1">
+    <w:lvl w:ilvl="3" w:tentative="0">
       <w:start w:val="1"/>
       <w:numFmt w:val="bullet"/>
       <w:lvlText w:val=""/>
       <w:lvlJc w:val="left"/>
       <w:pPr>
         <w:tabs>
-          <w:tab w:val="num" w:pos="2880"/>
+          <w:tab w:val="left" w:pos="2880"/>
         </w:tabs>
         <w:ind w:left="2880" w:hanging="360"/>
       </w:pPr>
       <w:rPr>
-        <w:rFonts w:ascii="Wingdings" w:hAnsi="Wingdings" w:hint="default"/>
+        <w:rFonts w:hint="default" w:ascii="Wingdings" w:hAnsi="Wingdings"/>
         <w:sz w:val="20"/>
       </w:rPr>
     </w:lvl>
-    <w:lvl w:ilvl="4" w:tentative="1">
+    <w:lvl w:ilvl="4" w:tentative="0">
       <w:start w:val="1"/>
       <w:numFmt w:val="bullet"/>
       <w:lvlText w:val=""/>
       <w:lvlJc w:val="left"/>
       <w:pPr>
         <w:tabs>
-          <w:tab w:val="num" w:pos="3600"/>
+          <w:tab w:val="left" w:pos="3600"/>
         </w:tabs>
         <w:ind w:left="3600" w:hanging="360"/>
       </w:pPr>
       <w:rPr>
-        <w:rFonts w:ascii="Wingdings" w:hAnsi="Wingdings" w:hint="default"/>
+        <w:rFonts w:hint="default" w:ascii="Wingdings" w:hAnsi="Wingdings"/>
         <w:sz w:val="20"/>
       </w:rPr>
     </w:lvl>
-    <w:lvl w:ilvl="5" w:tentative="1">
+    <w:lvl w:ilvl="5" w:tentative="0">
       <w:start w:val="1"/>
       <w:numFmt w:val="bullet"/>
       <w:lvlText w:val=""/>
       <w:lvlJc w:val="left"/>
       <w:pPr>
         <w:tabs>
-          <w:tab w:val="num" w:pos="4320"/>
+          <w:tab w:val="left" w:pos="4320"/>
         </w:tabs>
         <w:ind w:left="4320" w:hanging="360"/>
       </w:pPr>
       <w:rPr>
-        <w:rFonts w:ascii="Wingdings" w:hAnsi="Wingdings" w:hint="default"/>
+        <w:rFonts w:hint="default" w:ascii="Wingdings" w:hAnsi="Wingdings"/>
         <w:sz w:val="20"/>
       </w:rPr>
     </w:lvl>
-    <w:lvl w:ilvl="6" w:tentative="1">
+    <w:lvl w:ilvl="6" w:tentative="0">
       <w:start w:val="1"/>
       <w:numFmt w:val="bullet"/>
       <w:lvlText w:val=""/>
       <w:lvlJc w:val="left"/>
       <w:pPr>
         <w:tabs>
-          <w:tab w:val="num" w:pos="5040"/>
+          <w:tab w:val="left" w:pos="5040"/>
         </w:tabs>
         <w:ind w:left="5040" w:hanging="360"/>
       </w:pPr>
       <w:rPr>
-        <w:rFonts w:ascii="Wingdings" w:hAnsi="Wingdings" w:hint="default"/>
+        <w:rFonts w:hint="default" w:ascii="Wingdings" w:hAnsi="Wingdings"/>
         <w:sz w:val="20"/>
       </w:rPr>
     </w:lvl>
-    <w:lvl w:ilvl="7" w:tentative="1">
+    <w:lvl w:ilvl="7" w:tentative="0">
       <w:start w:val="1"/>
       <w:numFmt w:val="bullet"/>
       <w:lvlText w:val=""/>
       <w:lvlJc w:val="left"/>
       <w:pPr>
         <w:tabs>
-          <w:tab w:val="num" w:pos="5760"/>
+          <w:tab w:val="left" w:pos="5760"/>
         </w:tabs>
         <w:ind w:left="5760" w:hanging="360"/>
       </w:pPr>
       <w:rPr>
-        <w:rFonts w:ascii="Wingdings" w:hAnsi="Wingdings" w:hint="default"/>
+        <w:rFonts w:hint="default" w:ascii="Wingdings" w:hAnsi="Wingdings"/>
         <w:sz w:val="20"/>
       </w:rPr>
     </w:lvl>
-    <w:lvl w:ilvl="8" w:tentative="1">
+    <w:lvl w:ilvl="8" w:tentative="0">
       <w:start w:val="1"/>
       <w:numFmt w:val="bullet"/>
       <w:lvlText w:val=""/>
       <w:lvlJc w:val="left"/>
       <w:pPr>
         <w:tabs>
-          <w:tab w:val="num" w:pos="6480"/>
+          <w:tab w:val="left" w:pos="6480"/>
         </w:tabs>
         <w:ind w:left="6480" w:hanging="360"/>
       </w:pPr>
       <w:rPr>
-        <w:rFonts w:ascii="Wingdings" w:hAnsi="Wingdings" w:hint="default"/>
+        <w:rFonts w:hint="default" w:ascii="Wingdings" w:hAnsi="Wingdings"/>
         <w:sz w:val="20"/>
       </w:rPr>
     </w:lvl>
   </w:abstractNum>
-  <w:abstractNum w:abstractNumId="3" w15:restartNumberingAfterBreak="0">
+  <w:abstractNum w:abstractNumId="3">
     <w:nsid w:val="3FEB4917"/>
     <w:multiLevelType w:val="multilevel"/>
-    <w:tmpl w:val="8200B39E"/>
-    <w:lvl w:ilvl="0">
+    <w:tmpl w:val="3FEB4917"/>
+    <w:lvl w:ilvl="0" w:tentative="0">
       <w:start w:val="1"/>
       <w:numFmt w:val="decimal"/>
       <w:lvlText w:val="%1."/>
       <w:lvlJc w:val="left"/>
       <w:pPr>
         <w:tabs>
-          <w:tab w:val="num" w:pos="720"/>
+          <w:tab w:val="left" w:pos="720"/>
         </w:tabs>
         <w:ind w:left="720" w:hanging="360"/>
       </w:pPr>
     </w:lvl>
-    <w:lvl w:ilvl="1" w:tentative="1">
+    <w:lvl w:ilvl="1" w:tentative="0">
       <w:start w:val="1"/>
       <w:numFmt w:val="decimal"/>
       <w:lvlText w:val="%2."/>
       <w:lvlJc w:val="left"/>
       <w:pPr>
         <w:tabs>
-          <w:tab w:val="num" w:pos="1440"/>
+          <w:tab w:val="left" w:pos="1440"/>
         </w:tabs>
         <w:ind w:left="1440" w:hanging="360"/>
       </w:pPr>
     </w:lvl>
-    <w:lvl w:ilvl="2" w:tentative="1">
+    <w:lvl w:ilvl="2" w:tentative="0">
       <w:start w:val="1"/>
       <w:numFmt w:val="decimal"/>
       <w:lvlText w:val="%3."/>
       <w:lvlJc w:val="left"/>
       <w:pPr>
         <w:tabs>
-          <w:tab w:val="num" w:pos="2160"/>
+          <w:tab w:val="left" w:pos="2160"/>
         </w:tabs>
         <w:ind w:left="2160" w:hanging="360"/>
       </w:pPr>
     </w:lvl>
-    <w:lvl w:ilvl="3" w:tentative="1">
+    <w:lvl w:ilvl="3" w:tentative="0">
       <w:start w:val="1"/>
       <w:numFmt w:val="decimal"/>
       <w:lvlText w:val="%4."/>
       <w:lvlJc w:val="left"/>
       <w:pPr>
         <w:tabs>
-          <w:tab w:val="num" w:pos="2880"/>
+          <w:tab w:val="left" w:pos="2880"/>
         </w:tabs>
         <w:ind w:left="2880" w:hanging="360"/>
       </w:pPr>
     </w:lvl>
-    <w:lvl w:ilvl="4" w:tentative="1">
+    <w:lvl w:ilvl="4" w:tentative="0">
       <w:start w:val="1"/>
       <w:numFmt w:val="decimal"/>
       <w:lvlText w:val="%5."/>
       <w:lvlJc w:val="left"/>
       <w:pPr>
         <w:tabs>
-          <w:tab w:val="num" w:pos="3600"/>
+          <w:tab w:val="left" w:pos="3600"/>
         </w:tabs>
         <w:ind w:left="3600" w:hanging="360"/>
       </w:pPr>
     </w:lvl>
-    <w:lvl w:ilvl="5" w:tentative="1">
+    <w:lvl w:ilvl="5" w:tentative="0">
       <w:start w:val="1"/>
       <w:numFmt w:val="decimal"/>
       <w:lvlText w:val="%6."/>
       <w:lvlJc w:val="left"/>
       <w:pPr>
         <w:tabs>
-          <w:tab w:val="num" w:pos="4320"/>
+          <w:tab w:val="left" w:pos="4320"/>
         </w:tabs>
         <w:ind w:left="4320" w:hanging="360"/>
       </w:pPr>
     </w:lvl>
-    <w:lvl w:ilvl="6" w:tentative="1">
+    <w:lvl w:ilvl="6" w:tentative="0">
       <w:start w:val="1"/>
       <w:numFmt w:val="decimal"/>
       <w:lvlText w:val="%7."/>
       <w:lvlJc w:val="left"/>
       <w:pPr>
         <w:tabs>
-          <w:tab w:val="num" w:pos="5040"/>
+          <w:tab w:val="left" w:pos="5040"/>
         </w:tabs>
         <w:ind w:left="5040" w:hanging="360"/>
       </w:pPr>
     </w:lvl>
-    <w:lvl w:ilvl="7" w:tentative="1">
+    <w:lvl w:ilvl="7" w:tentative="0">
       <w:start w:val="1"/>
       <w:numFmt w:val="decimal"/>
       <w:lvlText w:val="%8."/>
       <w:lvlJc w:val="left"/>
       <w:pPr>
         <w:tabs>
-          <w:tab w:val="num" w:pos="5760"/>
+          <w:tab w:val="left" w:pos="5760"/>
         </w:tabs>
         <w:ind w:left="5760" w:hanging="360"/>
       </w:pPr>
     </w:lvl>
-    <w:lvl w:ilvl="8" w:tentative="1">
+    <w:lvl w:ilvl="8" w:tentative="0">
       <w:start w:val="1"/>
       <w:numFmt w:val="decimal"/>
       <w:lvlText w:val="%9."/>
       <w:lvlJc w:val="left"/>
       <w:pPr>
         <w:tabs>
-          <w:tab w:val="num" w:pos="6480"/>
+          <w:tab w:val="left" w:pos="6480"/>
         </w:tabs>
         <w:ind w:left="6480" w:hanging="360"/>
       </w:pPr>
     </w:lvl>
   </w:abstractNum>
-  <w:abstractNum w:abstractNumId="4" w15:restartNumberingAfterBreak="0">
+  <w:abstractNum w:abstractNumId="4">
     <w:nsid w:val="486D3B11"/>
     <w:multiLevelType w:val="multilevel"/>
-    <w:tmpl w:val="7B3ACD7C"/>
-    <w:lvl w:ilvl="0">
+    <w:tmpl w:val="486D3B11"/>
+    <w:lvl w:ilvl="0" w:tentative="0">
       <w:start w:val="1"/>
       <w:numFmt w:val="decimal"/>
       <w:lvlText w:val="%1."/>
       <w:lvlJc w:val="left"/>
       <w:pPr>
         <w:tabs>
-          <w:tab w:val="num" w:pos="720"/>
+          <w:tab w:val="left" w:pos="720"/>
         </w:tabs>
         <w:ind w:left="720" w:hanging="360"/>
       </w:pPr>
     </w:lvl>
-    <w:lvl w:ilvl="1">
+    <w:lvl w:ilvl="1" w:tentative="0">
       <w:start w:val="1"/>
       <w:numFmt w:val="bullet"/>
       <w:lvlText w:val="o"/>
       <w:lvlJc w:val="left"/>
       <w:pPr>
         <w:tabs>
-          <w:tab w:val="num" w:pos="1440"/>
+          <w:tab w:val="left" w:pos="1440"/>
         </w:tabs>
         <w:ind w:left="1440" w:hanging="360"/>
       </w:pPr>
       <w:rPr>
-        <w:rFonts w:ascii="Courier New" w:hAnsi="Courier New" w:hint="default"/>
+        <w:rFonts w:hint="default" w:ascii="Courier New" w:hAnsi="Courier New"/>
         <w:sz w:val="20"/>
       </w:rPr>
     </w:lvl>
-    <w:lvl w:ilvl="2" w:tentative="1">
+    <w:lvl w:ilvl="2" w:tentative="0">
       <w:start w:val="1"/>
       <w:numFmt w:val="decimal"/>
       <w:lvlText w:val="%3."/>
       <w:lvlJc w:val="left"/>
       <w:pPr>
         <w:tabs>
-          <w:tab w:val="num" w:pos="2160"/>
+          <w:tab w:val="left" w:pos="2160"/>
         </w:tabs>
         <w:ind w:left="2160" w:hanging="360"/>
       </w:pPr>
     </w:lvl>
-    <w:lvl w:ilvl="3" w:tentative="1">
+    <w:lvl w:ilvl="3" w:tentative="0">
       <w:start w:val="1"/>
       <w:numFmt w:val="decimal"/>
       <w:lvlText w:val="%4."/>
       <w:lvlJc w:val="left"/>
       <w:pPr>
         <w:tabs>
-          <w:tab w:val="num" w:pos="2880"/>
+          <w:tab w:val="left" w:pos="2880"/>
         </w:tabs>
         <w:ind w:left="2880" w:hanging="360"/>
       </w:pPr>
     </w:lvl>
-    <w:lvl w:ilvl="4" w:tentative="1">
+    <w:lvl w:ilvl="4" w:tentative="0">
       <w:start w:val="1"/>
       <w:numFmt w:val="decimal"/>
       <w:lvlText w:val="%5."/>
       <w:lvlJc w:val="left"/>
       <w:pPr>
         <w:tabs>
-          <w:tab w:val="num" w:pos="3600"/>
+          <w:tab w:val="left" w:pos="3600"/>
         </w:tabs>
         <w:ind w:left="3600" w:hanging="360"/>
       </w:pPr>
     </w:lvl>
-    <w:lvl w:ilvl="5" w:tentative="1">
+    <w:lvl w:ilvl="5" w:tentative="0">
       <w:start w:val="1"/>
       <w:numFmt w:val="decimal"/>
       <w:lvlText w:val="%6."/>
       <w:lvlJc w:val="left"/>
       <w:pPr>
         <w:tabs>
-          <w:tab w:val="num" w:pos="4320"/>
+          <w:tab w:val="left" w:pos="4320"/>
         </w:tabs>
         <w:ind w:left="4320" w:hanging="360"/>
       </w:pPr>
     </w:lvl>
-    <w:lvl w:ilvl="6" w:tentative="1">
+    <w:lvl w:ilvl="6" w:tentative="0">
       <w:start w:val="1"/>
       <w:numFmt w:val="decimal"/>
       <w:lvlText w:val="%7."/>
       <w:lvlJc w:val="left"/>
       <w:pPr>
         <w:tabs>
-          <w:tab w:val="num" w:pos="5040"/>
+          <w:tab w:val="left" w:pos="5040"/>
         </w:tabs>
         <w:ind w:left="5040" w:hanging="360"/>
       </w:pPr>
     </w:lvl>
-    <w:lvl w:ilvl="7" w:tentative="1">
+    <w:lvl w:ilvl="7" w:tentative="0">
       <w:start w:val="1"/>
       <w:numFmt w:val="decimal"/>
       <w:lvlText w:val="%8."/>
       <w:lvlJc w:val="left"/>
       <w:pPr>
         <w:tabs>
-          <w:tab w:val="num" w:pos="5760"/>
+          <w:tab w:val="left" w:pos="5760"/>
         </w:tabs>
         <w:ind w:left="5760" w:hanging="360"/>
       </w:pPr>
     </w:lvl>
-    <w:lvl w:ilvl="8" w:tentative="1">
+    <w:lvl w:ilvl="8" w:tentative="0">
       <w:start w:val="1"/>
       <w:numFmt w:val="decimal"/>
       <w:lvlText w:val="%9."/>
       <w:lvlJc w:val="left"/>
       <w:pPr>
         <w:tabs>
-          <w:tab w:val="num" w:pos="6480"/>
+          <w:tab w:val="left" w:pos="6480"/>
         </w:tabs>
         <w:ind w:left="6480" w:hanging="360"/>
       </w:pPr>
     </w:lvl>
   </w:abstractNum>
-  <w:abstractNum w:abstractNumId="5" w15:restartNumberingAfterBreak="0">
+  <w:abstractNum w:abstractNumId="5">
     <w:nsid w:val="613C1698"/>
     <w:multiLevelType w:val="multilevel"/>
-    <w:tmpl w:val="EFA40A72"/>
-    <w:lvl w:ilvl="0">
+    <w:tmpl w:val="613C1698"/>
+    <w:lvl w:ilvl="0" w:tentative="0">
       <w:start w:val="1"/>
       <w:numFmt w:val="decimal"/>
       <w:lvlText w:val="%1."/>
       <w:lvlJc w:val="left"/>
       <w:pPr>
         <w:tabs>
-          <w:tab w:val="num" w:pos="720"/>
+          <w:tab w:val="left" w:pos="720"/>
         </w:tabs>
         <w:ind w:left="720" w:hanging="360"/>
       </w:pPr>
     </w:lvl>
-    <w:lvl w:ilvl="1">
+    <w:lvl w:ilvl="1" w:tentative="0">
       <w:start w:val="1"/>
       <w:numFmt w:val="bullet"/>
       <w:lvlText w:val="o"/>
       <w:lvlJc w:val="left"/>
       <w:pPr>
         <w:tabs>
-          <w:tab w:val="num" w:pos="1440"/>
+          <w:tab w:val="left" w:pos="1440"/>
         </w:tabs>
         <w:ind w:left="1440" w:hanging="360"/>
       </w:pPr>
       <w:rPr>
-        <w:rFonts w:ascii="Courier New" w:hAnsi="Courier New" w:hint="default"/>
+        <w:rFonts w:hint="default" w:ascii="Courier New" w:hAnsi="Courier New"/>
         <w:sz w:val="20"/>
       </w:rPr>
     </w:lvl>
-    <w:lvl w:ilvl="2" w:tentative="1">
+    <w:lvl w:ilvl="2" w:tentative="0">
       <w:start w:val="1"/>
       <w:numFmt w:val="decimal"/>
       <w:lvlText w:val="%3."/>
       <w:lvlJc w:val="left"/>
       <w:pPr>
         <w:tabs>
-          <w:tab w:val="num" w:pos="2160"/>
+          <w:tab w:val="left" w:pos="2160"/>
         </w:tabs>
         <w:ind w:left="2160" w:hanging="360"/>
       </w:pPr>
     </w:lvl>
-    <w:lvl w:ilvl="3" w:tentative="1">
+    <w:lvl w:ilvl="3" w:tentative="0">
       <w:start w:val="1"/>
       <w:numFmt w:val="decimal"/>
       <w:lvlText w:val="%4."/>
       <w:lvlJc w:val="left"/>
       <w:pPr>
         <w:tabs>
-          <w:tab w:val="num" w:pos="2880"/>
+          <w:tab w:val="left" w:pos="2880"/>
         </w:tabs>
         <w:ind w:left="2880" w:hanging="360"/>
       </w:pPr>
     </w:lvl>
-    <w:lvl w:ilvl="4" w:tentative="1">
+    <w:lvl w:ilvl="4" w:tentative="0">
       <w:start w:val="1"/>
       <w:numFmt w:val="decimal"/>
       <w:lvlText w:val="%5."/>
       <w:lvlJc w:val="left"/>
       <w:pPr>
         <w:tabs>
-          <w:tab w:val="num" w:pos="3600"/>
+          <w:tab w:val="left" w:pos="3600"/>
         </w:tabs>
         <w:ind w:left="3600" w:hanging="360"/>
       </w:pPr>
     </w:lvl>
-    <w:lvl w:ilvl="5" w:tentative="1">
+    <w:lvl w:ilvl="5" w:tentative="0">
       <w:start w:val="1"/>
       <w:numFmt w:val="decimal"/>
       <w:lvlText w:val="%6."/>
       <w:lvlJc w:val="left"/>
       <w:pPr>
         <w:tabs>
-          <w:tab w:val="num" w:pos="4320"/>
+          <w:tab w:val="left" w:pos="4320"/>
         </w:tabs>
         <w:ind w:left="4320" w:hanging="360"/>
       </w:pPr>
     </w:lvl>
-    <w:lvl w:ilvl="6" w:tentative="1">
+    <w:lvl w:ilvl="6" w:tentative="0">
       <w:start w:val="1"/>
       <w:numFmt w:val="decimal"/>
       <w:lvlText w:val="%7."/>
       <w:lvlJc w:val="left"/>
       <w:pPr>
         <w:tabs>
-          <w:tab w:val="num" w:pos="5040"/>
+          <w:tab w:val="left" w:pos="5040"/>
         </w:tabs>
         <w:ind w:left="5040" w:hanging="360"/>
       </w:pPr>
     </w:lvl>
-    <w:lvl w:ilvl="7" w:tentative="1">
+    <w:lvl w:ilvl="7" w:tentative="0">
       <w:start w:val="1"/>
       <w:numFmt w:val="decimal"/>
       <w:lvlText w:val="%8."/>
       <w:lvlJc w:val="left"/>
       <w:pPr>
         <w:tabs>
-          <w:tab w:val="num" w:pos="5760"/>
+          <w:tab w:val="left" w:pos="5760"/>
         </w:tabs>
         <w:ind w:left="5760" w:hanging="360"/>
       </w:pPr>
     </w:lvl>
-    <w:lvl w:ilvl="8" w:tentative="1">
+    <w:lvl w:ilvl="8" w:tentative="0">
       <w:start w:val="1"/>
       <w:numFmt w:val="decimal"/>
       <w:lvlText w:val="%9."/>
       <w:lvlJc w:val="left"/>
       <w:pPr>
         <w:tabs>
-          <w:tab w:val="num" w:pos="6480"/>
+          <w:tab w:val="left" w:pos="6480"/>
         </w:tabs>
         <w:ind w:left="6480" w:hanging="360"/>
       </w:pPr>
     </w:lvl>
   </w:abstractNum>
-  <w:abstractNum w:abstractNumId="6" w15:restartNumberingAfterBreak="0">
+  <w:abstractNum w:abstractNumId="6">
     <w:nsid w:val="66DC6339"/>
     <w:multiLevelType w:val="multilevel"/>
-    <w:tmpl w:val="A8A4303A"/>
-    <w:lvl w:ilvl="0">
+    <w:tmpl w:val="66DC6339"/>
+    <w:lvl w:ilvl="0" w:tentative="0">
       <w:start w:val="1"/>
       <w:numFmt w:val="bullet"/>
       <w:lvlText w:val=""/>
       <w:lvlJc w:val="left"/>
       <w:pPr>
         <w:tabs>
-          <w:tab w:val="num" w:pos="720"/>
+          <w:tab w:val="left" w:pos="720"/>
         </w:tabs>
         <w:ind w:left="720" w:hanging="360"/>
       </w:pPr>
       <w:rPr>
-        <w:rFonts w:ascii="Symbol" w:hAnsi="Symbol" w:hint="default"/>
+        <w:rFonts w:hint="default" w:ascii="Symbol" w:hAnsi="Symbol"/>
         <w:sz w:val="20"/>
       </w:rPr>
     </w:lvl>
-    <w:lvl w:ilvl="1" w:tentative="1">
+    <w:lvl w:ilvl="1" w:tentative="0">
       <w:start w:val="1"/>
       <w:numFmt w:val="bullet"/>
       <w:lvlText w:val="o"/>
       <w:lvlJc w:val="left"/>
       <w:pPr>
         <w:tabs>
-          <w:tab w:val="num" w:pos="1440"/>
+          <w:tab w:val="left" w:pos="1440"/>
         </w:tabs>
         <w:ind w:left="1440" w:hanging="360"/>
       </w:pPr>
       <w:rPr>
-        <w:rFonts w:ascii="Courier New" w:hAnsi="Courier New" w:hint="default"/>
+        <w:rFonts w:hint="default" w:ascii="Courier New" w:hAnsi="Courier New"/>
         <w:sz w:val="20"/>
       </w:rPr>
     </w:lvl>
-    <w:lvl w:ilvl="2" w:tentative="1">
+    <w:lvl w:ilvl="2" w:tentative="0">
       <w:start w:val="1"/>
       <w:numFmt w:val="bullet"/>
       <w:lvlText w:val=""/>
       <w:lvlJc w:val="left"/>
       <w:pPr>
         <w:tabs>
-          <w:tab w:val="num" w:pos="2160"/>
+          <w:tab w:val="left" w:pos="2160"/>
         </w:tabs>
         <w:ind w:left="2160" w:hanging="360"/>
       </w:pPr>
       <w:rPr>
-        <w:rFonts w:ascii="Wingdings" w:hAnsi="Wingdings" w:hint="default"/>
+        <w:rFonts w:hint="default" w:ascii="Wingdings" w:hAnsi="Wingdings"/>
         <w:sz w:val="20"/>
       </w:rPr>
     </w:lvl>
-    <w:lvl w:ilvl="3" w:tentative="1">
+    <w:lvl w:ilvl="3" w:tentative="0">
       <w:start w:val="1"/>
       <w:numFmt w:val="bullet"/>
       <w:lvlText w:val=""/>
       <w:lvlJc w:val="left"/>
       <w:pPr>
         <w:tabs>
-          <w:tab w:val="num" w:pos="2880"/>
+          <w:tab w:val="left" w:pos="2880"/>
         </w:tabs>
         <w:ind w:left="2880" w:hanging="360"/>
       </w:pPr>
       <w:rPr>
-        <w:rFonts w:ascii="Wingdings" w:hAnsi="Wingdings" w:hint="default"/>
+        <w:rFonts w:hint="default" w:ascii="Wingdings" w:hAnsi="Wingdings"/>
         <w:sz w:val="20"/>
       </w:rPr>
     </w:lvl>
-    <w:lvl w:ilvl="4" w:tentative="1">
+    <w:lvl w:ilvl="4" w:tentative="0">
       <w:start w:val="1"/>
       <w:numFmt w:val="bullet"/>
       <w:lvlText w:val=""/>
       <w:lvlJc w:val="left"/>
       <w:pPr>
         <w:tabs>
-          <w:tab w:val="num" w:pos="3600"/>
+          <w:tab w:val="left" w:pos="3600"/>
         </w:tabs>
         <w:ind w:left="3600" w:hanging="360"/>
       </w:pPr>
       <w:rPr>
-        <w:rFonts w:ascii="Wingdings" w:hAnsi="Wingdings" w:hint="default"/>
+        <w:rFonts w:hint="default" w:ascii="Wingdings" w:hAnsi="Wingdings"/>
         <w:sz w:val="20"/>
       </w:rPr>
     </w:lvl>
-    <w:lvl w:ilvl="5" w:tentative="1">
+    <w:lvl w:ilvl="5" w:tentative="0">
       <w:start w:val="1"/>
       <w:numFmt w:val="bullet"/>
       <w:lvlText w:val=""/>
       <w:lvlJc w:val="left"/>
       <w:pPr>
         <w:tabs>
-          <w:tab w:val="num" w:pos="4320"/>
+          <w:tab w:val="left" w:pos="4320"/>
         </w:tabs>
         <w:ind w:left="4320" w:hanging="360"/>
       </w:pPr>
       <w:rPr>
-        <w:rFonts w:ascii="Wingdings" w:hAnsi="Wingdings" w:hint="default"/>
+        <w:rFonts w:hint="default" w:ascii="Wingdings" w:hAnsi="Wingdings"/>
         <w:sz w:val="20"/>
       </w:rPr>
     </w:lvl>
-    <w:lvl w:ilvl="6" w:tentative="1">
+    <w:lvl w:ilvl="6" w:tentative="0">
       <w:start w:val="1"/>
       <w:numFmt w:val="bullet"/>
       <w:lvlText w:val=""/>
       <w:lvlJc w:val="left"/>
       <w:pPr>
         <w:tabs>
-          <w:tab w:val="num" w:pos="5040"/>
+          <w:tab w:val="left" w:pos="5040"/>
         </w:tabs>
         <w:ind w:left="5040" w:hanging="360"/>
       </w:pPr>
       <w:rPr>
-        <w:rFonts w:ascii="Wingdings" w:hAnsi="Wingdings" w:hint="default"/>
+        <w:rFonts w:hint="default" w:ascii="Wingdings" w:hAnsi="Wingdings"/>
         <w:sz w:val="20"/>
       </w:rPr>
     </w:lvl>
-    <w:lvl w:ilvl="7" w:tentative="1">
+    <w:lvl w:ilvl="7" w:tentative="0">
       <w:start w:val="1"/>
       <w:numFmt w:val="bullet"/>
       <w:lvlText w:val=""/>
       <w:lvlJc w:val="left"/>
       <w:pPr>
         <w:tabs>
-          <w:tab w:val="num" w:pos="5760"/>
+          <w:tab w:val="left" w:pos="5760"/>
         </w:tabs>
         <w:ind w:left="5760" w:hanging="360"/>
       </w:pPr>
       <w:rPr>
-        <w:rFonts w:ascii="Wingdings" w:hAnsi="Wingdings" w:hint="default"/>
+        <w:rFonts w:hint="default" w:ascii="Wingdings" w:hAnsi="Wingdings"/>
         <w:sz w:val="20"/>
       </w:rPr>
     </w:lvl>
-    <w:lvl w:ilvl="8" w:tentative="1">
+    <w:lvl w:ilvl="8" w:tentative="0">
       <w:start w:val="1"/>
       <w:numFmt w:val="bullet"/>
       <w:lvlText w:val=""/>
       <w:lvlJc w:val="left"/>
       <w:pPr>
         <w:tabs>
-          <w:tab w:val="num" w:pos="6480"/>
+          <w:tab w:val="left" w:pos="6480"/>
         </w:tabs>
         <w:ind w:left="6480" w:hanging="360"/>
       </w:pPr>
       <w:rPr>
-        <w:rFonts w:ascii="Wingdings" w:hAnsi="Wingdings" w:hint="default"/>
+        <w:rFonts w:hint="default" w:ascii="Wingdings" w:hAnsi="Wingdings"/>
         <w:sz w:val="20"/>
       </w:rPr>
     </w:lvl>
   </w:abstractNum>
-  <w:abstractNum w:abstractNumId="7" w15:restartNumberingAfterBreak="0">
+  <w:abstractNum w:abstractNumId="7">
     <w:nsid w:val="71150D73"/>
     <w:multiLevelType w:val="multilevel"/>
-    <w:tmpl w:val="4E22000E"/>
-    <w:lvl w:ilvl="0">
+    <w:tmpl w:val="71150D73"/>
+    <w:lvl w:ilvl="0" w:tentative="0">
       <w:start w:val="1"/>
       <w:numFmt w:val="decimal"/>
       <w:lvlText w:val="%1."/>
       <w:lvlJc w:val="left"/>
       <w:pPr>
         <w:tabs>
-          <w:tab w:val="num" w:pos="720"/>
+          <w:tab w:val="left" w:pos="720"/>
         </w:tabs>
         <w:ind w:left="720" w:hanging="360"/>
       </w:pPr>
     </w:lvl>
-    <w:lvl w:ilvl="1" w:tentative="1">
+    <w:lvl w:ilvl="1" w:tentative="0">
       <w:start w:val="1"/>
       <w:numFmt w:val="decimal"/>
       <w:lvlText w:val="%2."/>
       <w:lvlJc w:val="left"/>
       <w:pPr>
         <w:tabs>
-          <w:tab w:val="num" w:pos="1440"/>
+          <w:tab w:val="left" w:pos="1440"/>
         </w:tabs>
         <w:ind w:left="1440" w:hanging="360"/>
       </w:pPr>
     </w:lvl>
-    <w:lvl w:ilvl="2" w:tentative="1">
+    <w:lvl w:ilvl="2" w:tentative="0">
       <w:start w:val="1"/>
       <w:numFmt w:val="decimal"/>
       <w:lvlText w:val="%3."/>
       <w:lvlJc w:val="left"/>
       <w:pPr>
         <w:tabs>
-          <w:tab w:val="num" w:pos="2160"/>
+          <w:tab w:val="left" w:pos="2160"/>
         </w:tabs>
         <w:ind w:left="2160" w:hanging="360"/>
       </w:pPr>
     </w:lvl>
-    <w:lvl w:ilvl="3" w:tentative="1">
+    <w:lvl w:ilvl="3" w:tentative="0">
       <w:start w:val="1"/>
       <w:numFmt w:val="decimal"/>
       <w:lvlText w:val="%4."/>
       <w:lvlJc w:val="left"/>
       <w:pPr>
         <w:tabs>
-          <w:tab w:val="num" w:pos="2880"/>
+          <w:tab w:val="left" w:pos="2880"/>
         </w:tabs>
         <w:ind w:left="2880" w:hanging="360"/>
       </w:pPr>
     </w:lvl>
-    <w:lvl w:ilvl="4" w:tentative="1">
+    <w:lvl w:ilvl="4" w:tentative="0">
       <w:start w:val="1"/>
       <w:numFmt w:val="decimal"/>
       <w:lvlText w:val="%5."/>
       <w:lvlJc w:val="left"/>
       <w:pPr>
         <w:tabs>
-          <w:tab w:val="num" w:pos="3600"/>
+          <w:tab w:val="left" w:pos="3600"/>
         </w:tabs>
         <w:ind w:left="3600" w:hanging="360"/>
       </w:pPr>
     </w:lvl>
-    <w:lvl w:ilvl="5" w:tentative="1">
+    <w:lvl w:ilvl="5" w:tentative="0">
       <w:start w:val="1"/>
       <w:numFmt w:val="decimal"/>
       <w:lvlText w:val="%6."/>
       <w:lvlJc w:val="left"/>
       <w:pPr>
         <w:tabs>
-          <w:tab w:val="num" w:pos="4320"/>
+          <w:tab w:val="left" w:pos="4320"/>
         </w:tabs>
         <w:ind w:left="4320" w:hanging="360"/>
       </w:pPr>
     </w:lvl>
-    <w:lvl w:ilvl="6" w:tentative="1">
+    <w:lvl w:ilvl="6" w:tentative="0">
       <w:start w:val="1"/>
       <w:numFmt w:val="decimal"/>
       <w:lvlText w:val="%7."/>
       <w:lvlJc w:val="left"/>
       <w:pPr>
         <w:tabs>
-          <w:tab w:val="num" w:pos="5040"/>
+          <w:tab w:val="left" w:pos="5040"/>
         </w:tabs>
         <w:ind w:left="5040" w:hanging="360"/>
       </w:pPr>
     </w:lvl>
-    <w:lvl w:ilvl="7" w:tentative="1">
+    <w:lvl w:ilvl="7" w:tentative="0">
       <w:start w:val="1"/>
       <w:numFmt w:val="decimal"/>
       <w:lvlText w:val="%8."/>
       <w:lvlJc w:val="left"/>
       <w:pPr>
         <w:tabs>
-          <w:tab w:val="num" w:pos="5760"/>
+          <w:tab w:val="left" w:pos="5760"/>
         </w:tabs>
         <w:ind w:left="5760" w:hanging="360"/>
       </w:pPr>
     </w:lvl>
-    <w:lvl w:ilvl="8" w:tentative="1">
+    <w:lvl w:ilvl="8" w:tentative="0">
       <w:start w:val="1"/>
       <w:numFmt w:val="decimal"/>
       <w:lvlText w:val="%9."/>
       <w:lvlJc w:val="left"/>
       <w:pPr>
         <w:tabs>
-          <w:tab w:val="num" w:pos="6480"/>
+          <w:tab w:val="left" w:pos="6480"/>
         </w:tabs>
         <w:ind w:left="6480" w:hanging="360"/>
       </w:pPr>
     </w:lvl>
   </w:abstractNum>
-  <w:abstractNum w:abstractNumId="8" w15:restartNumberingAfterBreak="0">
+  <w:abstractNum w:abstractNumId="8">
     <w:nsid w:val="74DB41B2"/>
     <w:multiLevelType w:val="multilevel"/>
-    <w:tmpl w:val="2D7C67A6"/>
-    <w:lvl w:ilvl="0">
+    <w:tmpl w:val="74DB41B2"/>
+    <w:lvl w:ilvl="0" w:tentative="0">
       <w:start w:val="1"/>
       <w:numFmt w:val="bullet"/>
       <w:lvlText w:val=""/>
       <w:lvlJc w:val="left"/>
       <w:pPr>
         <w:tabs>
-          <w:tab w:val="num" w:pos="720"/>
+          <w:tab w:val="left" w:pos="720"/>
         </w:tabs>
         <w:ind w:left="720" w:hanging="360"/>
       </w:pPr>
       <w:rPr>
-        <w:rFonts w:ascii="Symbol" w:hAnsi="Symbol" w:hint="default"/>
+        <w:rFonts w:hint="default" w:ascii="Symbol" w:hAnsi="Symbol"/>
         <w:sz w:val="20"/>
       </w:rPr>
     </w:lvl>
-    <w:lvl w:ilvl="1" w:tentative="1">
+    <w:lvl w:ilvl="1" w:tentative="0">
       <w:start w:val="1"/>
       <w:numFmt w:val="bullet"/>
       <w:lvlText w:val="o"/>
       <w:lvlJc w:val="left"/>
       <w:pPr>
         <w:tabs>
-          <w:tab w:val="num" w:pos="1440"/>
+          <w:tab w:val="left" w:pos="1440"/>
         </w:tabs>
         <w:ind w:left="1440" w:hanging="360"/>
       </w:pPr>
       <w:rPr>
-        <w:rFonts w:ascii="Courier New" w:hAnsi="Courier New" w:hint="default"/>
+        <w:rFonts w:hint="default" w:ascii="Courier New" w:hAnsi="Courier New"/>
         <w:sz w:val="20"/>
       </w:rPr>
     </w:lvl>
-    <w:lvl w:ilvl="2" w:tentative="1">
+    <w:lvl w:ilvl="2" w:tentative="0">
       <w:start w:val="1"/>
       <w:numFmt w:val="bullet"/>
       <w:lvlText w:val=""/>
       <w:lvlJc w:val="left"/>
       <w:pPr>
         <w:tabs>
-          <w:tab w:val="num" w:pos="2160"/>
+          <w:tab w:val="left" w:pos="2160"/>
         </w:tabs>
         <w:ind w:left="2160" w:hanging="360"/>
       </w:pPr>
       <w:rPr>
-        <w:rFonts w:ascii="Wingdings" w:hAnsi="Wingdings" w:hint="default"/>
+        <w:rFonts w:hint="default" w:ascii="Wingdings" w:hAnsi="Wingdings"/>
         <w:sz w:val="20"/>
       </w:rPr>
     </w:lvl>
-    <w:lvl w:ilvl="3" w:tentative="1">
+    <w:lvl w:ilvl="3" w:tentative="0">
       <w:start w:val="1"/>
       <w:numFmt w:val="bullet"/>
       <w:lvlText w:val=""/>
       <w:lvlJc w:val="left"/>
       <w:pPr>
         <w:tabs>
-          <w:tab w:val="num" w:pos="2880"/>
+          <w:tab w:val="left" w:pos="2880"/>
         </w:tabs>
         <w:ind w:left="2880" w:hanging="360"/>
       </w:pPr>
       <w:rPr>
-        <w:rFonts w:ascii="Wingdings" w:hAnsi="Wingdings" w:hint="default"/>
+        <w:rFonts w:hint="default" w:ascii="Wingdings" w:hAnsi="Wingdings"/>
         <w:sz w:val="20"/>
       </w:rPr>
     </w:lvl>
-    <w:lvl w:ilvl="4" w:tentative="1">
+    <w:lvl w:ilvl="4" w:tentative="0">
       <w:start w:val="1"/>
       <w:numFmt w:val="bullet"/>
       <w:lvlText w:val=""/>
       <w:lvlJc w:val="left"/>
       <w:pPr>
         <w:tabs>
-          <w:tab w:val="num" w:pos="3600"/>
+          <w:tab w:val="left" w:pos="3600"/>
         </w:tabs>
         <w:ind w:left="3600" w:hanging="360"/>
       </w:pPr>
       <w:rPr>
-        <w:rFonts w:ascii="Wingdings" w:hAnsi="Wingdings" w:hint="default"/>
+        <w:rFonts w:hint="default" w:ascii="Wingdings" w:hAnsi="Wingdings"/>
         <w:sz w:val="20"/>
       </w:rPr>
     </w:lvl>
-    <w:lvl w:ilvl="5" w:tentative="1">
+    <w:lvl w:ilvl="5" w:tentative="0">
       <w:start w:val="1"/>
       <w:numFmt w:val="bullet"/>
       <w:lvlText w:val=""/>
       <w:lvlJc w:val="left"/>
       <w:pPr>
         <w:tabs>
-          <w:tab w:val="num" w:pos="4320"/>
+          <w:tab w:val="left" w:pos="4320"/>
         </w:tabs>
         <w:ind w:left="4320" w:hanging="360"/>
       </w:pPr>
       <w:rPr>
-        <w:rFonts w:ascii="Wingdings" w:hAnsi="Wingdings" w:hint="default"/>
+        <w:rFonts w:hint="default" w:ascii="Wingdings" w:hAnsi="Wingdings"/>
         <w:sz w:val="20"/>
       </w:rPr>
     </w:lvl>
-    <w:lvl w:ilvl="6" w:tentative="1">
+    <w:lvl w:ilvl="6" w:tentative="0">
       <w:start w:val="1"/>
       <w:numFmt w:val="bullet"/>
       <w:lvlText w:val=""/>
       <w:lvlJc w:val="left"/>
       <w:pPr>
         <w:tabs>
-          <w:tab w:val="num" w:pos="5040"/>
+          <w:tab w:val="left" w:pos="5040"/>
         </w:tabs>
         <w:ind w:left="5040" w:hanging="360"/>
       </w:pPr>
       <w:rPr>
-        <w:rFonts w:ascii="Wingdings" w:hAnsi="Wingdings" w:hint="default"/>
+        <w:rFonts w:hint="default" w:ascii="Wingdings" w:hAnsi="Wingdings"/>
         <w:sz w:val="20"/>
       </w:rPr>
     </w:lvl>
-    <w:lvl w:ilvl="7" w:tentative="1">
+    <w:lvl w:ilvl="7" w:tentative="0">
       <w:start w:val="1"/>
       <w:numFmt w:val="bullet"/>
       <w:lvlText w:val=""/>
       <w:lvlJc w:val="left"/>
       <w:pPr>
         <w:tabs>
-          <w:tab w:val="num" w:pos="5760"/>
+          <w:tab w:val="left" w:pos="5760"/>
         </w:tabs>
         <w:ind w:left="5760" w:hanging="360"/>
       </w:pPr>
       <w:rPr>
-        <w:rFonts w:ascii="Wingdings" w:hAnsi="Wingdings" w:hint="default"/>
+        <w:rFonts w:hint="default" w:ascii="Wingdings" w:hAnsi="Wingdings"/>
         <w:sz w:val="20"/>
       </w:rPr>
     </w:lvl>
-    <w:lvl w:ilvl="8" w:tentative="1">
+    <w:lvl w:ilvl="8" w:tentative="0">
       <w:start w:val="1"/>
       <w:numFmt w:val="bullet"/>
       <w:lvlText w:val=""/>
       <w:lvlJc w:val="left"/>
       <w:pPr>
         <w:tabs>
-          <w:tab w:val="num" w:pos="6480"/>
+          <w:tab w:val="left" w:pos="6480"/>
         </w:tabs>
         <w:ind w:left="6480" w:hanging="360"/>
       </w:pPr>
       <w:rPr>
-        <w:rFonts w:ascii="Wingdings" w:hAnsi="Wingdings" w:hint="default"/>
+        <w:rFonts w:hint="default" w:ascii="Wingdings" w:hAnsi="Wingdings"/>
         <w:sz w:val="20"/>
       </w:rPr>
     </w:lvl>
   </w:abstractNum>
-  <w:num w:numId="1" w16cid:durableId="332492362">
+  <w:num w:numId="1">
     <w:abstractNumId w:val="3"/>
   </w:num>
-  <w:num w:numId="2" w16cid:durableId="1087464229">
+  <w:num w:numId="2">
     <w:abstractNumId w:val="6"/>
   </w:num>
-  <w:num w:numId="3" w16cid:durableId="483858608">
+  <w:num w:numId="3">
     <w:abstractNumId w:val="5"/>
   </w:num>
-  <w:num w:numId="4" w16cid:durableId="1054309262">
+  <w:num w:numId="4">
     <w:abstractNumId w:val="7"/>
   </w:num>
-  <w:num w:numId="5" w16cid:durableId="997073934">
+  <w:num w:numId="5">
     <w:abstractNumId w:val="0"/>
   </w:num>
-  <w:num w:numId="6" w16cid:durableId="1155804826">
+  <w:num w:numId="6">
     <w:abstractNumId w:val="4"/>
   </w:num>
-  <w:num w:numId="7" w16cid:durableId="1388601903">
+  <w:num w:numId="7">
     <w:abstractNumId w:val="1"/>
   </w:num>
-  <w:num w:numId="8" w16cid:durableId="1582593653">
+  <w:num w:numId="8">
     <w:abstractNumId w:val="8"/>
   </w:num>
-  <w:num w:numId="9" w16cid:durableId="1645236607">
+  <w:num w:numId="9">
     <w:abstractNumId w:val="2"/>
   </w:num>
 </w:numbering>
 </file>
 
 <file path=word/styles.xml><?xml version="1.0" encoding="utf-8"?>
-<w:styles xmlns:mc="http://schemas.openxmlformats.org/markup-compatibility/2006" xmlns:r="http://schemas.openxmlformats.org/officeDocument/2006/relationships" xmlns:w="http://schemas.openxmlformats.org/wordprocessingml/2006/main" xmlns:w14="http://schemas.microsoft.com/office/word/2010/wordml" xmlns:w15="http://schemas.microsoft.com/office/word/2012/wordml" xmlns:w16cex="http://schemas.microsoft.com/office/word/2018/wordml/cex" xmlns:w16cid="http://schemas.microsoft.com/office/word/2016/wordml/cid" xmlns:w16="http://schemas.microsoft.com/office/word/2018/wordml" xmlns:w16du="http://schemas.microsoft.com/office/word/2023/wordml/word16du" xmlns:w16sdtdh="http://schemas.microsoft.com/office/word/2020/wordml/sdtdatahash" xmlns:w16sdtfl="http://schemas.microsoft.com/office/word/2024/wordml/sdtformatlock" xmlns:w16se="http://schemas.microsoft.com/office/word/2015/wordml/symex" mc:Ignorable="w14 w15 w16se w16cid w16 w16cex w16sdtdh w16sdtfl w16du">
+<w:styles xmlns:mc="http://schemas.openxmlformats.org/markup-compatibility/2006" xmlns:o="urn:schemas-microsoft-com:office:office" xmlns:r="http://schemas.openxmlformats.org/officeDocument/2006/relationships" xmlns:m="http://schemas.openxmlformats.org/officeDocument/2006/math" xmlns:v="urn:schemas-microsoft-com:vml" xmlns:w="http://schemas.openxmlformats.org/wordprocessingml/2006/main" xmlns:w14="http://schemas.microsoft.com/office/word/2010/wordml" xmlns:w10="urn:schemas-microsoft-com:office:word" xmlns:sl="http://schemas.openxmlformats.org/schemaLibrary/2006/main" xmlns:wpsCustomData="http://www.wps.cn/officeDocument/2013/wpsCustomData" mc:Ignorable="w14">
   <w:docDefaults>
     <w:rPrDefault>
       <w:rPr>
-        <w:rFonts w:asciiTheme="minorHAnsi" w:eastAsiaTheme="minorHAnsi" w:hAnsiTheme="minorHAnsi" w:cstheme="minorBidi"/>
-        <w:kern w:val="2"/>
-        <w:sz w:val="22"/>
-        <w:szCs w:val="22"/>
-        <w:lang w:val="en-US" w:eastAsia="en-US" w:bidi="ar-SA"/>
-        <w14:ligatures w14:val="standardContextual"/>
+        <w:rFonts w:asciiTheme="minorHAnsi" w:hAnsiTheme="minorHAnsi" w:eastAsiaTheme="minorHAnsi" w:cstheme="minorBidi"/>
       </w:rPr>
     </w:rPrDefault>
-    <w:pPrDefault>
-      <w:pPr>
-        <w:spacing w:after="200" w:line="276" w:lineRule="auto"/>
-      </w:pPr>
-    </w:pPrDefault>
+    <w:pPrDefault/>
   </w:docDefaults>
-  <w:latentStyles w:defLockedState="0" w:defUIPriority="99" w:defSemiHidden="0" w:defUnhideWhenUsed="0" w:defQFormat="0" w:count="376">
-    <w:lsdException w:name="Normal" w:uiPriority="0" w:qFormat="1"/>
-    <w:lsdException w:name="heading 1" w:uiPriority="9" w:qFormat="1"/>
-    <w:lsdException w:name="heading 2" w:semiHidden="1" w:uiPriority="9" w:unhideWhenUsed="1" w:qFormat="1"/>
-    <w:lsdException w:name="heading 3" w:semiHidden="1" w:uiPriority="9" w:unhideWhenUsed="1" w:qFormat="1"/>
-    <w:lsdException w:name="heading 4" w:semiHidden="1" w:uiPriority="9" w:unhideWhenUsed="1" w:qFormat="1"/>
-    <w:lsdException w:name="heading 5" w:semiHidden="1" w:uiPriority="9" w:unhideWhenUsed="1" w:qFormat="1"/>
-    <w:lsdException w:name="heading 6" w:semiHidden="1" w:uiPriority="9" w:unhideWhenUsed="1" w:qFormat="1"/>
-    <w:lsdException w:name="heading 7" w:semiHidden="1" w:uiPriority="9" w:unhideWhenUsed="1" w:qFormat="1"/>
-    <w:lsdException w:name="heading 8" w:semiHidden="1" w:uiPriority="9" w:unhideWhenUsed="1" w:qFormat="1"/>
-    <w:lsdException w:name="heading 9" w:semiHidden="1" w:uiPriority="9" w:unhideWhenUsed="1" w:qFormat="1"/>
-    <w:lsdException w:name="index 1" w:semiHidden="1" w:unhideWhenUsed="1"/>
-    <w:lsdException w:name="index 2" w:semiHidden="1" w:unhideWhenUsed="1"/>
-    <w:lsdException w:name="index 3" w:semiHidden="1" w:unhideWhenUsed="1"/>
-    <w:lsdException w:name="index 4" w:semiHidden="1" w:unhideWhenUsed="1"/>
-    <w:lsdException w:name="index 5" w:semiHidden="1" w:unhideWhenUsed="1"/>
-    <w:lsdException w:name="index 6" w:semiHidden="1" w:unhideWhenUsed="1"/>
-    <w:lsdException w:name="index 7" w:semiHidden="1" w:unhideWhenUsed="1"/>
-    <w:lsdException w:name="index 8" w:semiHidden="1" w:unhideWhenUsed="1"/>
-    <w:lsdException w:name="index 9" w:semiHidden="1" w:unhideWhenUsed="1"/>
-    <w:lsdException w:name="toc 1" w:semiHidden="1" w:uiPriority="39" w:unhideWhenUsed="1"/>
-    <w:lsdException w:name="toc 2" w:semiHidden="1" w:uiPriority="39" w:unhideWhenUsed="1"/>
-    <w:lsdException w:name="toc 3" w:semiHidden="1" w:uiPriority="39" w:unhideWhenUsed="1"/>
-    <w:lsdException w:name="toc 4" w:semiHidden="1" w:uiPriority="39" w:unhideWhenUsed="1"/>
-    <w:lsdException w:name="toc 5" w:semiHidden="1" w:uiPriority="39" w:unhideWhenUsed="1"/>
-    <w:lsdException w:name="toc 6" w:semiHidden="1" w:uiPriority="39" w:unhideWhenUsed="1"/>
-    <w:lsdException w:name="toc 7" w:semiHidden="1" w:uiPriority="39" w:unhideWhenUsed="1"/>
-    <w:lsdException w:name="toc 8" w:semiHidden="1" w:uiPriority="39" w:unhideWhenUsed="1"/>
-    <w:lsdException w:name="toc 9" w:semiHidden="1" w:uiPriority="39" w:unhideWhenUsed="1"/>
-    <w:lsdException w:name="Normal Indent" w:semiHidden="1" w:unhideWhenUsed="1"/>
-    <w:lsdException w:name="footnote text" w:semiHidden="1" w:unhideWhenUsed="1"/>
-    <w:lsdException w:name="annotation text" w:semiHidden="1" w:unhideWhenUsed="1"/>
-    <w:lsdException w:name="header" w:semiHidden="1" w:unhideWhenUsed="1"/>
-    <w:lsdException w:name="footer" w:semiHidden="1" w:unhideWhenUsed="1"/>
-    <w:lsdException w:name="index heading" w:semiHidden="1" w:unhideWhenUsed="1"/>
-    <w:lsdException w:name="caption" w:semiHidden="1" w:uiPriority="35" w:unhideWhenUsed="1" w:qFormat="1"/>
-    <w:lsdException w:name="table of figures" w:semiHidden="1" w:unhideWhenUsed="1"/>
-    <w:lsdException w:name="envelope address" w:semiHidden="1" w:unhideWhenUsed="1"/>
-    <w:lsdException w:name="envelope return" w:semiHidden="1" w:unhideWhenUsed="1"/>
-    <w:lsdException w:name="footnote reference" w:semiHidden="1" w:unhideWhenUsed="1"/>
-    <w:lsdException w:name="annotation reference" w:semiHidden="1" w:unhideWhenUsed="1"/>
-    <w:lsdException w:name="line number" w:semiHidden="1" w:unhideWhenUsed="1"/>
-    <w:lsdException w:name="page number" w:semiHidden="1" w:unhideWhenUsed="1"/>
-    <w:lsdException w:name="endnote reference" w:semiHidden="1" w:unhideWhenUsed="1"/>
-    <w:lsdException w:name="endnote text" w:semiHidden="1" w:unhideWhenUsed="1"/>
-    <w:lsdException w:name="table of authorities" w:semiHidden="1" w:unhideWhenUsed="1"/>
-    <w:lsdException w:name="macro" w:semiHidden="1" w:unhideWhenUsed="1"/>
-    <w:lsdException w:name="toa heading" w:semiHidden="1" w:unhideWhenUsed="1"/>
-    <w:lsdException w:name="List" w:semiHidden="1" w:unhideWhenUsed="1"/>
-    <w:lsdException w:name="List Bullet" w:semiHidden="1" w:unhideWhenUsed="1"/>
-    <w:lsdException w:name="List Number" w:semiHidden="1" w:unhideWhenUsed="1"/>
-    <w:lsdException w:name="List 2" w:semiHidden="1" w:unhideWhenUsed="1"/>
-    <w:lsdException w:name="List 3" w:semiHidden="1" w:unhideWhenUsed="1"/>
-    <w:lsdException w:name="List 4" w:semiHidden="1" w:unhideWhenUsed="1"/>
-    <w:lsdException w:name="List 5" w:semiHidden="1" w:unhideWhenUsed="1"/>
-    <w:lsdException w:name="List Bullet 2" w:semiHidden="1" w:unhideWhenUsed="1"/>
-    <w:lsdException w:name="List Bullet 3" w:semiHidden="1" w:unhideWhenUsed="1"/>
-    <w:lsdException w:name="List Bullet 4" w:semiHidden="1" w:unhideWhenUsed="1"/>
-    <w:lsdException w:name="List Bullet 5" w:semiHidden="1" w:unhideWhenUsed="1"/>
-    <w:lsdException w:name="List Number 2" w:semiHidden="1" w:unhideWhenUsed="1"/>
-    <w:lsdException w:name="List Number 3" w:semiHidden="1" w:unhideWhenUsed="1"/>
-    <w:lsdException w:name="List Number 4" w:semiHidden="1" w:unhideWhenUsed="1"/>
-    <w:lsdException w:name="List Number 5" w:semiHidden="1" w:unhideWhenUsed="1"/>
-    <w:lsdException w:name="Title" w:uiPriority="10" w:qFormat="1"/>
-    <w:lsdException w:name="Closing" w:semiHidden="1" w:unhideWhenUsed="1"/>
-    <w:lsdException w:name="Signature" w:semiHidden="1" w:unhideWhenUsed="1"/>
-    <w:lsdException w:name="Default Paragraph Font" w:semiHidden="1" w:uiPriority="1" w:unhideWhenUsed="1"/>
-    <w:lsdException w:name="Body Text" w:semiHidden="1" w:unhideWhenUsed="1"/>
-    <w:lsdException w:name="Body Text Indent" w:semiHidden="1" w:unhideWhenUsed="1"/>
-    <w:lsdException w:name="List Continue" w:semiHidden="1" w:unhideWhenUsed="1"/>
-    <w:lsdException w:name="List Continue 2" w:semiHidden="1" w:unhideWhenUsed="1"/>
-    <w:lsdException w:name="List Continue 3" w:semiHidden="1" w:unhideWhenUsed="1"/>
-    <w:lsdException w:name="List Continue 4" w:semiHidden="1" w:unhideWhenUsed="1"/>
-    <w:lsdException w:name="List Continue 5" w:semiHidden="1" w:unhideWhenUsed="1"/>
-    <w:lsdException w:name="Message Header" w:semiHidden="1" w:unhideWhenUsed="1"/>
-    <w:lsdException w:name="Subtitle" w:uiPriority="11" w:qFormat="1"/>
-    <w:lsdException w:name="Salutation" w:semiHidden="1" w:unhideWhenUsed="1"/>
-    <w:lsdException w:name="Date" w:semiHidden="1" w:unhideWhenUsed="1"/>
-    <w:lsdException w:name="Body Text First Indent" w:semiHidden="1" w:unhideWhenUsed="1"/>
-    <w:lsdException w:name="Body Text First Indent 2" w:semiHidden="1" w:unhideWhenUsed="1"/>
-    <w:lsdException w:name="Note Heading" w:semiHidden="1" w:unhideWhenUsed="1"/>
-    <w:lsdException w:name="Body Text 2" w:semiHidden="1" w:unhideWhenUsed="1"/>
-    <w:lsdException w:name="Body Text 3" w:semiHidden="1" w:unhideWhenUsed="1"/>
-    <w:lsdException w:name="Body Text Indent 2" w:semiHidden="1" w:unhideWhenUsed="1"/>
-    <w:lsdException w:name="Body Text Indent 3" w:semiHidden="1" w:unhideWhenUsed="1"/>
-    <w:lsdException w:name="Block Text" w:semiHidden="1" w:unhideWhenUsed="1"/>
-    <w:lsdException w:name="Hyperlink" w:semiHidden="1" w:unhideWhenUsed="1"/>
-    <w:lsdException w:name="FollowedHyperlink" w:semiHidden="1" w:unhideWhenUsed="1"/>
-    <w:lsdException w:name="Strong" w:uiPriority="22" w:qFormat="1"/>
-    <w:lsdException w:name="Emphasis" w:uiPriority="20" w:qFormat="1"/>
-    <w:lsdException w:name="Document Map" w:semiHidden="1" w:unhideWhenUsed="1"/>
-    <w:lsdException w:name="Plain Text" w:semiHidden="1" w:unhideWhenUsed="1"/>
-    <w:lsdException w:name="E-mail Signature" w:semiHidden="1" w:unhideWhenUsed="1"/>
-    <w:lsdException w:name="HTML Top of Form" w:semiHidden="1" w:unhideWhenUsed="1"/>
-    <w:lsdException w:name="HTML Bottom of Form" w:semiHidden="1" w:unhideWhenUsed="1"/>
-    <w:lsdException w:name="Normal (Web)" w:semiHidden="1" w:unhideWhenUsed="1"/>
-    <w:lsdException w:name="HTML Acronym" w:semiHidden="1" w:unhideWhenUsed="1"/>
-    <w:lsdException w:name="HTML Address" w:semiHidden="1" w:unhideWhenUsed="1"/>
-    <w:lsdException w:name="HTML Cite" w:semiHidden="1" w:unhideWhenUsed="1"/>
-    <w:lsdException w:name="HTML Code" w:semiHidden="1" w:unhideWhenUsed="1"/>
-    <w:lsdException w:name="HTML Definition" w:semiHidden="1" w:unhideWhenUsed="1"/>
-    <w:lsdException w:name="HTML Keyboard" w:semiHidden="1" w:unhideWhenUsed="1"/>
-    <w:lsdException w:name="HTML Preformatted" w:semiHidden="1" w:unhideWhenUsed="1"/>
-    <w:lsdException w:name="HTML Sample" w:semiHidden="1" w:unhideWhenUsed="1"/>
-    <w:lsdException w:name="HTML Typewriter" w:semiHidden="1" w:unhideWhenUsed="1"/>
-    <w:lsdException w:name="HTML Variable" w:semiHidden="1" w:unhideWhenUsed="1"/>
-    <w:lsdException w:name="Normal Table" w:semiHidden="1" w:unhideWhenUsed="1"/>
-    <w:lsdException w:name="annotation subject" w:semiHidden="1" w:unhideWhenUsed="1"/>
-    <w:lsdException w:name="No List" w:semiHidden="1" w:unhideWhenUsed="1"/>
-    <w:lsdException w:name="Outline List 1" w:semiHidden="1" w:unhideWhenUsed="1"/>
-    <w:lsdException w:name="Outline List 2" w:semiHidden="1" w:unhideWhenUsed="1"/>
-    <w:lsdException w:name="Outline List 3" w:semiHidden="1" w:unhideWhenUsed="1"/>
-    <w:lsdException w:name="Table Simple 1" w:semiHidden="1" w:unhideWhenUsed="1"/>
-    <w:lsdException w:name="Table Simple 2" w:semiHidden="1" w:unhideWhenUsed="1"/>
-    <w:lsdException w:name="Table Simple 3" w:semiHidden="1" w:unhideWhenUsed="1"/>
-    <w:lsdException w:name="Table Classic 1" w:semiHidden="1" w:unhideWhenUsed="1"/>
-    <w:lsdException w:name="Table Classic 2" w:semiHidden="1" w:unhideWhenUsed="1"/>
-    <w:lsdException w:name="Table Classic 3" w:semiHidden="1" w:unhideWhenUsed="1"/>
-    <w:lsdException w:name="Table Classic 4" w:semiHidden="1" w:unhideWhenUsed="1"/>
-    <w:lsdException w:name="Table Colorful 1" w:semiHidden="1" w:unhideWhenUsed="1"/>
-    <w:lsdException w:name="Table Colorful 2" w:semiHidden="1" w:unhideWhenUsed="1"/>
-    <w:lsdException w:name="Table Colorful 3" w:semiHidden="1" w:unhideWhenUsed="1"/>
-    <w:lsdException w:name="Table Columns 1" w:semiHidden="1" w:unhideWhenUsed="1"/>
-    <w:lsdException w:name="Table Columns 2" w:semiHidden="1" w:unhideWhenUsed="1"/>
-    <w:lsdException w:name="Table Columns 3" w:semiHidden="1" w:unhideWhenUsed="1"/>
-    <w:lsdException w:name="Table Columns 4" w:semiHidden="1" w:unhideWhenUsed="1"/>
-    <w:lsdException w:name="Table Columns 5" w:semiHidden="1" w:unhideWhenUsed="1"/>
-    <w:lsdException w:name="Table Grid 1" w:semiHidden="1" w:unhideWhenUsed="1"/>
-    <w:lsdException w:name="Table Grid 2" w:semiHidden="1" w:unhideWhenUsed="1"/>
-    <w:lsdException w:name="Table Grid 3" w:semiHidden="1" w:unhideWhenUsed="1"/>
-    <w:lsdException w:name="Table Grid 4" w:semiHidden="1" w:unhideWhenUsed="1"/>
-    <w:lsdException w:name="Table Grid 5" w:semiHidden="1" w:unhideWhenUsed="1"/>
-    <w:lsdException w:name="Table Grid 6" w:semiHidden="1" w:unhideWhenUsed="1"/>
-    <w:lsdException w:name="Table Grid 7" w:semiHidden="1" w:unhideWhenUsed="1"/>
-    <w:lsdException w:name="Table Grid 8" w:semiHidden="1" w:unhideWhenUsed="1"/>
-    <w:lsdException w:name="Table List 1" w:semiHidden="1" w:unhideWhenUsed="1"/>
-    <w:lsdException w:name="Table List 2" w:semiHidden="1" w:unhideWhenUsed="1"/>
-    <w:lsdException w:name="Table List 3" w:semiHidden="1" w:unhideWhenUsed="1"/>
-    <w:lsdException w:name="Table List 4" w:semiHidden="1" w:unhideWhenUsed="1"/>
-    <w:lsdException w:name="Table List 5" w:semiHidden="1" w:unhideWhenUsed="1"/>
-    <w:lsdException w:name="Table List 6" w:semiHidden="1" w:unhideWhenUsed="1"/>
-    <w:lsdException w:name="Table List 7" w:semiHidden="1" w:unhideWhenUsed="1"/>
-    <w:lsdException w:name="Table List 8" w:semiHidden="1" w:unhideWhenUsed="1"/>
-    <w:lsdException w:name="Table 3D effects 1" w:semiHidden="1" w:unhideWhenUsed="1"/>
-    <w:lsdException w:name="Table 3D effects 2" w:semiHidden="1" w:unhideWhenUsed="1"/>
-    <w:lsdException w:name="Table 3D effects 3" w:semiHidden="1" w:unhideWhenUsed="1"/>
-    <w:lsdException w:name="Table Contemporary" w:semiHidden="1" w:unhideWhenUsed="1"/>
-    <w:lsdException w:name="Table Elegant" w:semiHidden="1" w:unhideWhenUsed="1"/>
-    <w:lsdException w:name="Table Professional" w:semiHidden="1" w:unhideWhenUsed="1"/>
-    <w:lsdException w:name="Table Subtle 1" w:semiHidden="1" w:unhideWhenUsed="1"/>
-    <w:lsdException w:name="Table Subtle 2" w:semiHidden="1" w:unhideWhenUsed="1"/>
-    <w:lsdException w:name="Table Web 1" w:semiHidden="1" w:unhideWhenUsed="1"/>
-    <w:lsdException w:name="Table Web 2" w:semiHidden="1" w:unhideWhenUsed="1"/>
-    <w:lsdException w:name="Table Web 3" w:semiHidden="1" w:unhideWhenUsed="1"/>
-    <w:lsdException w:name="Balloon Text" w:semiHidden="1" w:unhideWhenUsed="1"/>
-    <w:lsdException w:name="Table Grid" w:uiPriority="59"/>
-    <w:lsdException w:name="Table Theme" w:semiHidden="1" w:unhideWhenUsed="1"/>
-    <w:lsdException w:name="Placeholder Text" w:semiHidden="1"/>
-    <w:lsdException w:name="No Spacing" w:uiPriority="1" w:qFormat="1"/>
-    <w:lsdException w:name="Light Shading" w:uiPriority="60"/>
-    <w:lsdException w:name="Light List" w:uiPriority="61"/>
-    <w:lsdException w:name="Light Grid" w:uiPriority="62"/>
-    <w:lsdException w:name="Medium Shading 1" w:uiPriority="63"/>
-    <w:lsdException w:name="Medium Shading 2" w:uiPriority="64"/>
-    <w:lsdException w:name="Medium List 1" w:uiPriority="65"/>
-    <w:lsdException w:name="Medium List 2" w:uiPriority="66"/>
-    <w:lsdException w:name="Medium Grid 1" w:uiPriority="67"/>
-    <w:lsdException w:name="Medium Grid 2" w:uiPriority="68"/>
-    <w:lsdException w:name="Medium Grid 3" w:uiPriority="69"/>
-    <w:lsdException w:name="Dark List" w:uiPriority="70"/>
-    <w:lsdException w:name="Colorful Shading" w:uiPriority="71"/>
-    <w:lsdException w:name="Colorful List" w:uiPriority="72"/>
-    <w:lsdException w:name="Colorful Grid" w:uiPriority="73"/>
-    <w:lsdException w:name="Light Shading Accent 1" w:uiPriority="60"/>
-    <w:lsdException w:name="Light List Accent 1" w:uiPriority="61"/>
-    <w:lsdException w:name="Light Grid Accent 1" w:uiPriority="62"/>
-    <w:lsdException w:name="Medium Shading 1 Accent 1" w:uiPriority="63"/>
-    <w:lsdException w:name="Medium Shading 2 Accent 1" w:uiPriority="64"/>
-    <w:lsdException w:name="Medium List 1 Accent 1" w:uiPriority="65"/>
-    <w:lsdException w:name="Revision" w:semiHidden="1"/>
-    <w:lsdException w:name="List Paragraph" w:uiPriority="34" w:qFormat="1"/>
-    <w:lsdException w:name="Quote" w:uiPriority="29" w:qFormat="1"/>
-    <w:lsdException w:name="Intense Quote" w:uiPriority="30" w:qFormat="1"/>
-    <w:lsdException w:name="Medium List 2 Accent 1" w:uiPriority="66"/>
-    <w:lsdException w:name="Medium Grid 1 Accent 1" w:uiPriority="67"/>
-    <w:lsdException w:name="Medium Grid 2 Accent 1" w:uiPriority="68"/>
-    <w:lsdException w:name="Medium Grid 3 Accent 1" w:uiPriority="69"/>
-    <w:lsdException w:name="Dark List Accent 1" w:uiPriority="70"/>
-    <w:lsdException w:name="Colorful Shading Accent 1" w:uiPriority="71"/>
-    <w:lsdException w:name="Colorful List Accent 1" w:uiPriority="72"/>
-    <w:lsdException w:name="Colorful Grid Accent 1" w:uiPriority="73"/>
-    <w:lsdException w:name="Light Shading Accent 2" w:uiPriority="60"/>
-    <w:lsdException w:name="Light List Accent 2" w:uiPriority="61"/>
-    <w:lsdException w:name="Light Grid Accent 2" w:uiPriority="62"/>
-    <w:lsdException w:name="Medium Shading 1 Accent 2" w:uiPriority="63"/>
-    <w:lsdException w:name="Medium Shading 2 Accent 2" w:uiPriority="64"/>
-    <w:lsdException w:name="Medium List 1 Accent 2" w:uiPriority="65"/>
-    <w:lsdException w:name="Medium List 2 Accent 2" w:uiPriority="66"/>
-    <w:lsdException w:name="Medium Grid 1 Accent 2" w:uiPriority="67"/>
-    <w:lsdException w:name="Medium Grid 2 Accent 2" w:uiPriority="68"/>
-    <w:lsdException w:name="Medium Grid 3 Accent 2" w:uiPriority="69"/>
-    <w:lsdException w:name="Dark List Accent 2" w:uiPriority="70"/>
-    <w:lsdException w:name="Colorful Shading Accent 2" w:uiPriority="71"/>
-    <w:lsdException w:name="Colorful List Accent 2" w:uiPriority="72"/>
-    <w:lsdException w:name="Colorful Grid Accent 2" w:uiPriority="73"/>
-    <w:lsdException w:name="Light Shading Accent 3" w:uiPriority="60"/>
-    <w:lsdException w:name="Light List Accent 3" w:uiPriority="61"/>
-    <w:lsdException w:name="Light Grid Accent 3" w:uiPriority="62"/>
-    <w:lsdException w:name="Medium Shading 1 Accent 3" w:uiPriority="63"/>
-    <w:lsdException w:name="Medium Shading 2 Accent 3" w:uiPriority="64"/>
-    <w:lsdException w:name="Medium List 1 Accent 3" w:uiPriority="65"/>
-    <w:lsdException w:name="Medium List 2 Accent 3" w:uiPriority="66"/>
-    <w:lsdException w:name="Medium Grid 1 Accent 3" w:uiPriority="67"/>
-    <w:lsdException w:name="Medium Grid 2 Accent 3" w:uiPriority="68"/>
-    <w:lsdException w:name="Medium Grid 3 Accent 3" w:uiPriority="69"/>
-    <w:lsdException w:name="Dark List Accent 3" w:uiPriority="70"/>
-    <w:lsdException w:name="Colorful Shading Accent 3" w:uiPriority="71"/>
-    <w:lsdException w:name="Colorful List Accent 3" w:uiPriority="72"/>
-    <w:lsdException w:name="Colorful Grid Accent 3" w:uiPriority="73"/>
-    <w:lsdException w:name="Light Shading Accent 4" w:uiPriority="60"/>
-    <w:lsdException w:name="Light List Accent 4" w:uiPriority="61"/>
-    <w:lsdException w:name="Light Grid Accent 4" w:uiPriority="62"/>
-    <w:lsdException w:name="Medium Shading 1 Accent 4" w:uiPriority="63"/>
-    <w:lsdException w:name="Medium Shading 2 Accent 4" w:uiPriority="64"/>
-    <w:lsdException w:name="Medium List 1 Accent 4" w:uiPriority="65"/>
-    <w:lsdException w:name="Medium List 2 Accent 4" w:uiPriority="66"/>
-    <w:lsdException w:name="Medium Grid 1 Accent 4" w:uiPriority="67"/>
-    <w:lsdException w:name="Medium Grid 2 Accent 4" w:uiPriority="68"/>
-    <w:lsdException w:name="Medium Grid 3 Accent 4" w:uiPriority="69"/>
-    <w:lsdException w:name="Dark List Accent 4" w:uiPriority="70"/>
-    <w:lsdException w:name="Colorful Shading Accent 4" w:uiPriority="71"/>
-    <w:lsdException w:name="Colorful List Accent 4" w:uiPriority="72"/>
-    <w:lsdException w:name="Colorful Grid Accent 4" w:uiPriority="73"/>
-    <w:lsdException w:name="Light Shading Accent 5" w:uiPriority="60"/>
-    <w:lsdException w:name="Light List Accent 5" w:uiPriority="61"/>
-    <w:lsdException w:name="Light Grid Accent 5" w:uiPriority="62"/>
-    <w:lsdException w:name="Medium Shading 1 Accent 5" w:uiPriority="63"/>
-    <w:lsdException w:name="Medium Shading 2 Accent 5" w:uiPriority="64"/>
-    <w:lsdException w:name="Medium List 1 Accent 5" w:uiPriority="65"/>
-    <w:lsdException w:name="Medium List 2 Accent 5" w:uiPriority="66"/>
-    <w:lsdException w:name="Medium Grid 1 Accent 5" w:uiPriority="67"/>
-    <w:lsdException w:name="Medium Grid 2 Accent 5" w:uiPriority="68"/>
-    <w:lsdException w:name="Medium Grid 3 Accent 5" w:uiPriority="69"/>
-    <w:lsdException w:name="Dark List Accent 5" w:uiPriority="70"/>
-    <w:lsdException w:name="Colorful Shading Accent 5" w:uiPriority="71"/>
-    <w:lsdException w:name="Colorful List Accent 5" w:uiPriority="72"/>
-    <w:lsdException w:name="Colorful Grid Accent 5" w:uiPriority="73"/>
-    <w:lsdException w:name="Light Shading Accent 6" w:uiPriority="60"/>
-    <w:lsdException w:name="Light List Accent 6" w:uiPriority="61"/>
-    <w:lsdException w:name="Light Grid Accent 6" w:uiPriority="62"/>
-    <w:lsdException w:name="Medium Shading 1 Accent 6" w:uiPriority="63"/>
-    <w:lsdException w:name="Medium Shading 2 Accent 6" w:uiPriority="64"/>
-    <w:lsdException w:name="Medium List 1 Accent 6" w:uiPriority="65"/>
-    <w:lsdException w:name="Medium List 2 Accent 6" w:uiPriority="66"/>
-    <w:lsdException w:name="Medium Grid 1 Accent 6" w:uiPriority="67"/>
-    <w:lsdException w:name="Medium Grid 2 Accent 6" w:uiPriority="68"/>
-    <w:lsdException w:name="Medium Grid 3 Accent 6" w:uiPriority="69"/>
-    <w:lsdException w:name="Dark List Accent 6" w:uiPriority="70"/>
-    <w:lsdException w:name="Colorful Shading Accent 6" w:uiPriority="71"/>
-    <w:lsdException w:name="Colorful List Accent 6" w:uiPriority="72"/>
-    <w:lsdException w:name="Colorful Grid Accent 6" w:uiPriority="73"/>
-    <w:lsdException w:name="Subtle Emphasis" w:uiPriority="19" w:qFormat="1"/>
-    <w:lsdException w:name="Intense Emphasis" w:uiPriority="21" w:qFormat="1"/>
-    <w:lsdException w:name="Subtle Reference" w:uiPriority="31" w:qFormat="1"/>
-    <w:lsdException w:name="Intense Reference" w:uiPriority="32" w:qFormat="1"/>
-    <w:lsdException w:name="Book Title" w:uiPriority="33" w:qFormat="1"/>
-    <w:lsdException w:name="Bibliography" w:semiHidden="1" w:uiPriority="37" w:unhideWhenUsed="1"/>
-    <w:lsdException w:name="TOC Heading" w:semiHidden="1" w:uiPriority="39" w:unhideWhenUsed="1" w:qFormat="1"/>
-    <w:lsdException w:name="Plain Table 1" w:uiPriority="41"/>
-    <w:lsdException w:name="Plain Table 2" w:uiPriority="42"/>
-    <w:lsdException w:name="Plain Table 3" w:uiPriority="43"/>
-    <w:lsdException w:name="Plain Table 4" w:uiPriority="44"/>
-    <w:lsdException w:name="Plain Table 5" w:uiPriority="45"/>
-    <w:lsdException w:name="Grid Table Light" w:uiPriority="40"/>
-    <w:lsdException w:name="Grid Table 1 Light" w:uiPriority="46"/>
-    <w:lsdException w:name="Grid Table 2" w:uiPriority="47"/>
-    <w:lsdException w:name="Grid Table 3" w:uiPriority="48"/>
-    <w:lsdException w:name="Grid Table 4" w:uiPriority="49"/>
-    <w:lsdException w:name="Grid Table 5 Dark" w:uiPriority="50"/>
-    <w:lsdException w:name="Grid Table 6 Colorful" w:uiPriority="51"/>
-    <w:lsdException w:name="Grid Table 7 Colorful" w:uiPriority="52"/>
-    <w:lsdException w:name="Grid Table 1 Light Accent 1" w:uiPriority="46"/>
-    <w:lsdException w:name="Grid Table 2 Accent 1" w:uiPriority="47"/>
-    <w:lsdException w:name="Grid Table 3 Accent 1" w:uiPriority="48"/>
-    <w:lsdException w:name="Grid Table 4 Accent 1" w:uiPriority="49"/>
-    <w:lsdException w:name="Grid Table 5 Dark Accent 1" w:uiPriority="50"/>
-    <w:lsdException w:name="Grid Table 6 Colorful Accent 1" w:uiPriority="51"/>
-    <w:lsdException w:name="Grid Table 7 Colorful Accent 1" w:uiPriority="52"/>
-    <w:lsdException w:name="Grid Table 1 Light Accent 2" w:uiPriority="46"/>
-    <w:lsdException w:name="Grid Table 2 Accent 2" w:uiPriority="47"/>
-    <w:lsdException w:name="Grid Table 3 Accent 2" w:uiPriority="48"/>
-    <w:lsdException w:name="Grid Table 4 Accent 2" w:uiPriority="49"/>
-    <w:lsdException w:name="Grid Table 5 Dark Accent 2" w:uiPriority="50"/>
-    <w:lsdException w:name="Grid Table 6 Colorful Accent 2" w:uiPriority="51"/>
-    <w:lsdException w:name="Grid Table 7 Colorful Accent 2" w:uiPriority="52"/>
-    <w:lsdException w:name="Grid Table 1 Light Accent 3" w:uiPriority="46"/>
-    <w:lsdException w:name="Grid Table 2 Accent 3" w:uiPriority="47"/>
-    <w:lsdException w:name="Grid Table 3 Accent 3" w:uiPriority="48"/>
-    <w:lsdException w:name="Grid Table 4 Accent 3" w:uiPriority="49"/>
-    <w:lsdException w:name="Grid Table 5 Dark Accent 3" w:uiPriority="50"/>
-    <w:lsdException w:name="Grid Table 6 Colorful Accent 3" w:uiPriority="51"/>
-    <w:lsdException w:name="Grid Table 7 Colorful Accent 3" w:uiPriority="52"/>
-    <w:lsdException w:name="Grid Table 1 Light Accent 4" w:uiPriority="46"/>
-    <w:lsdException w:name="Grid Table 2 Accent 4" w:uiPriority="47"/>
-    <w:lsdException w:name="Grid Table 3 Accent 4" w:uiPriority="48"/>
-    <w:lsdException w:name="Grid Table 4 Accent 4" w:uiPriority="49"/>
-    <w:lsdException w:name="Grid Table 5 Dark Accent 4" w:uiPriority="50"/>
-    <w:lsdException w:name="Grid Table 6 Colorful Accent 4" w:uiPriority="51"/>
-    <w:lsdException w:name="Grid Table 7 Colorful Accent 4" w:uiPriority="52"/>
-    <w:lsdException w:name="Grid Table 1 Light Accent 5" w:uiPriority="46"/>
-    <w:lsdException w:name="Grid Table 2 Accent 5" w:uiPriority="47"/>
-    <w:lsdException w:name="Grid Table 3 Accent 5" w:uiPriority="48"/>
-    <w:lsdException w:name="Grid Table 4 Accent 5" w:uiPriority="49"/>
-    <w:lsdException w:name="Grid Table 5 Dark Accent 5" w:uiPriority="50"/>
-    <w:lsdException w:name="Grid Table 6 Colorful Accent 5" w:uiPriority="51"/>
-    <w:lsdException w:name="Grid Table 7 Colorful Accent 5" w:uiPriority="52"/>
-    <w:lsdException w:name="Grid Table 1 Light Accent 6" w:uiPriority="46"/>
-    <w:lsdException w:name="Grid Table 2 Accent 6" w:uiPriority="47"/>
-    <w:lsdException w:name="Grid Table 3 Accent 6" w:uiPriority="48"/>
-    <w:lsdException w:name="Grid Table 4 Accent 6" w:uiPriority="49"/>
-    <w:lsdException w:name="Grid Table 5 Dark Accent 6" w:uiPriority="50"/>
-    <w:lsdException w:name="Grid Table 6 Colorful Accent 6" w:uiPriority="51"/>
-    <w:lsdException w:name="Grid Table 7 Colorful Accent 6" w:uiPriority="52"/>
-    <w:lsdException w:name="List Table 1 Light" w:uiPriority="46"/>
-    <w:lsdException w:name="List Table 2" w:uiPriority="47"/>
-    <w:lsdException w:name="List Table 3" w:uiPriority="48"/>
-    <w:lsdException w:name="List Table 4" w:uiPriority="49"/>
-    <w:lsdException w:name="List Table 5 Dark" w:uiPriority="50"/>
-    <w:lsdException w:name="List Table 6 Colorful" w:uiPriority="51"/>
-    <w:lsdException w:name="List Table 7 Colorful" w:uiPriority="52"/>
-    <w:lsdException w:name="List Table 1 Light Accent 1" w:uiPriority="46"/>
-    <w:lsdException w:name="List Table 2 Accent 1" w:uiPriority="47"/>
-    <w:lsdException w:name="List Table 3 Accent 1" w:uiPriority="48"/>
-    <w:lsdException w:name="List Table 4 Accent 1" w:uiPriority="49"/>
-    <w:lsdException w:name="List Table 5 Dark Accent 1" w:uiPriority="50"/>
-    <w:lsdException w:name="List Table 6 Colorful Accent 1" w:uiPriority="51"/>
-    <w:lsdException w:name="List Table 7 Colorful Accent 1" w:uiPriority="52"/>
-    <w:lsdException w:name="List Table 1 Light Accent 2" w:uiPriority="46"/>
-    <w:lsdException w:name="List Table 2 Accent 2" w:uiPriority="47"/>
-    <w:lsdException w:name="List Table 3 Accent 2" w:uiPriority="48"/>
-    <w:lsdException w:name="List Table 4 Accent 2" w:uiPriority="49"/>
-    <w:lsdException w:name="List Table 5 Dark Accent 2" w:uiPriority="50"/>
-    <w:lsdException w:name="List Table 6 Colorful Accent 2" w:uiPriority="51"/>
-    <w:lsdException w:name="List Table 7 Colorful Accent 2" w:uiPriority="52"/>
-    <w:lsdException w:name="List Table 1 Light Accent 3" w:uiPriority="46"/>
-    <w:lsdException w:name="List Table 2 Accent 3" w:uiPriority="47"/>
-    <w:lsdException w:name="List Table 3 Accent 3" w:uiPriority="48"/>
-    <w:lsdException w:name="List Table 4 Accent 3" w:uiPriority="49"/>
-    <w:lsdException w:name="List Table 5 Dark Accent 3" w:uiPriority="50"/>
-    <w:lsdException w:name="List Table 6 Colorful Accent 3" w:uiPriority="51"/>
-    <w:lsdException w:name="List Table 7 Colorful Accent 3" w:uiPriority="52"/>
-    <w:lsdException w:name="List Table 1 Light Accent 4" w:uiPriority="46"/>
-    <w:lsdException w:name="List Table 2 Accent 4" w:uiPriority="47"/>
-    <w:lsdException w:name="List Table 3 Accent 4" w:uiPriority="48"/>
-    <w:lsdException w:name="List Table 4 Accent 4" w:uiPriority="49"/>
-    <w:lsdException w:name="List Table 5 Dark Accent 4" w:uiPriority="50"/>
-    <w:lsdException w:name="List Table 6 Colorful Accent 4" w:uiPriority="51"/>
-    <w:lsdException w:name="List Table 7 Colorful Accent 4" w:uiPriority="52"/>
-    <w:lsdException w:name="List Table 1 Light Accent 5" w:uiPriority="46"/>
-    <w:lsdException w:name="List Table 2 Accent 5" w:uiPriority="47"/>
-    <w:lsdException w:name="List Table 3 Accent 5" w:uiPriority="48"/>
-    <w:lsdException w:name="List Table 4 Accent 5" w:uiPriority="49"/>
-    <w:lsdException w:name="List Table 5 Dark Accent 5" w:uiPriority="50"/>
-    <w:lsdException w:name="List Table 6 Colorful Accent 5" w:uiPriority="51"/>
-    <w:lsdException w:name="List Table 7 Colorful Accent 5" w:uiPriority="52"/>
-    <w:lsdException w:name="List Table 1 Light Accent 6" w:uiPriority="46"/>
-    <w:lsdException w:name="List Table 2 Accent 6" w:uiPriority="47"/>
-    <w:lsdException w:name="List Table 3 Accent 6" w:uiPriority="48"/>
-    <w:lsdException w:name="List Table 4 Accent 6" w:uiPriority="49"/>
-    <w:lsdException w:name="List Table 5 Dark Accent 6" w:uiPriority="50"/>
-    <w:lsdException w:name="List Table 6 Colorful Accent 6" w:uiPriority="51"/>
-    <w:lsdException w:name="List Table 7 Colorful Accent 6" w:uiPriority="52"/>
-    <w:lsdException w:name="Mention" w:semiHidden="1" w:unhideWhenUsed="1"/>
-    <w:lsdException w:name="Smart Hyperlink" w:semiHidden="1" w:unhideWhenUsed="1"/>
-    <w:lsdException w:name="Hashtag" w:semiHidden="1" w:unhideWhenUsed="1"/>
-    <w:lsdException w:name="Unresolved Mention" w:semiHidden="1" w:unhideWhenUsed="1"/>
-    <w:lsdException w:name="Smart Link" w:semiHidden="1" w:unhideWhenUsed="1"/>
+  <w:latentStyles w:count="260" w:defQFormat="0" w:defUnhideWhenUsed="1" w:defSemiHidden="1" w:defUIPriority="99" w:defLockedState="0">
+    <w:lsdException w:qFormat="1" w:unhideWhenUsed="0" w:uiPriority="0" w:semiHidden="0" w:name="Normal"/>
+    <w:lsdException w:qFormat="1" w:unhideWhenUsed="0" w:uiPriority="9" w:semiHidden="0" w:name="heading 1"/>
+    <w:lsdException w:qFormat="1" w:uiPriority="9" w:name="heading 2"/>
+    <w:lsdException w:qFormat="1" w:uiPriority="9" w:name="heading 3"/>
+    <w:lsdException w:qFormat="1" w:uiPriority="9" w:name="heading 4"/>
+    <w:lsdException w:qFormat="1" w:uiPriority="9" w:name="heading 5"/>
+    <w:lsdException w:qFormat="1" w:uiPriority="9" w:name="heading 6"/>
+    <w:lsdException w:qFormat="1" w:uiPriority="9" w:name="heading 7"/>
+    <w:lsdException w:qFormat="1" w:uiPriority="9" w:name="heading 8"/>
+    <w:lsdException w:qFormat="1" w:uiPriority="9" w:name="heading 9"/>
+    <w:lsdException w:uiPriority="99" w:name="index 1"/>
+    <w:lsdException w:uiPriority="99" w:name="index 2"/>
+    <w:lsdException w:uiPriority="99" w:name="index 3"/>
+    <w:lsdException w:uiPriority="99" w:name="index 4"/>
+    <w:lsdException w:uiPriority="99" w:name="index 5"/>
+    <w:lsdException w:uiPriority="99" w:name="index 6"/>
+    <w:lsdException w:uiPriority="99" w:name="index 7"/>
+    <w:lsdException w:uiPriority="39" w:name="toc 8"/>
+    <w:lsdException w:uiPriority="39" w:name="toc 9"/>
+    <w:lsdException w:uiPriority="99" w:name="Normal Indent"/>
+    <w:lsdException w:uiPriority="99" w:name="footnote text"/>
+    <w:lsdException w:uiPriority="99" w:name="annotation text"/>
+    <w:lsdException w:uiPriority="99" w:name="header"/>
+    <w:lsdException w:uiPriority="99" w:name="footer"/>
+    <w:lsdException w:uiPriority="99" w:name="index heading"/>
+    <w:lsdException w:qFormat="1" w:uiPriority="35" w:name="caption"/>
+    <w:lsdException w:uiPriority="99" w:name="table of figures"/>
+    <w:lsdException w:uiPriority="99" w:name="envelope address"/>
+    <w:lsdException w:uiPriority="99" w:name="envelope return"/>
+    <w:lsdException w:uiPriority="99" w:name="footnote reference"/>
+    <w:lsdException w:uiPriority="99" w:name="annotation reference"/>
+    <w:lsdException w:uiPriority="99" w:name="line number"/>
+    <w:lsdException w:uiPriority="99" w:name="page number"/>
+    <w:lsdException w:uiPriority="99" w:name="endnote reference"/>
+    <w:lsdException w:uiPriority="99" w:name="endnote text"/>
+    <w:lsdException w:uiPriority="99" w:name="table of authorities"/>
+    <w:lsdException w:uiPriority="99" w:name="macro"/>
+    <w:lsdException w:uiPriority="99" w:name="toa heading"/>
+    <w:lsdException w:uiPriority="99" w:name="List"/>
+    <w:lsdException w:uiPriority="99" w:name="List Bullet"/>
+    <w:lsdException w:uiPriority="99" w:name="List Number"/>
+    <w:lsdException w:uiPriority="99" w:name="List 2"/>
+    <w:lsdException w:uiPriority="99" w:name="List 3"/>
+    <w:lsdException w:uiPriority="99" w:name="List 4"/>
+    <w:lsdException w:uiPriority="99" w:name="List 5"/>
+    <w:lsdException w:uiPriority="99" w:name="List Bullet 2"/>
+    <w:lsdException w:uiPriority="99" w:name="List Bullet 3"/>
+    <w:lsdException w:uiPriority="99" w:name="List Bullet 4"/>
+    <w:lsdException w:uiPriority="99" w:name="List Bullet 5"/>
+    <w:lsdException w:uiPriority="99" w:name="List Number 2"/>
+    <w:lsdException w:uiPriority="99" w:name="List Number 3"/>
+    <w:lsdException w:uiPriority="99" w:name="List Number 4"/>
+    <w:lsdException w:uiPriority="99" w:name="List Number 5"/>
+    <w:lsdException w:qFormat="1" w:unhideWhenUsed="0" w:uiPriority="10" w:semiHidden="0" w:name="Title"/>
+    <w:lsdException w:uiPriority="99" w:name="Closing"/>
+    <w:lsdException w:uiPriority="99" w:name="Signature"/>
+    <w:lsdException w:qFormat="1" w:uiPriority="1" w:semiHidden="0" w:name="Default Paragraph Font"/>
+    <w:lsdException w:uiPriority="99" w:name="Body Text"/>
+    <w:lsdException w:uiPriority="99" w:name="Body Text Indent"/>
+    <w:lsdException w:uiPriority="99" w:name="List Continue"/>
+    <w:lsdException w:uiPriority="99" w:name="List Continue 2"/>
+    <w:lsdException w:uiPriority="99" w:name="List Continue 3"/>
+    <w:lsdException w:uiPriority="99" w:name="List Continue 4"/>
+    <w:lsdException w:uiPriority="99" w:name="List Continue 5"/>
+    <w:lsdException w:uiPriority="99" w:name="Message Header"/>
+    <w:lsdException w:qFormat="1" w:unhideWhenUsed="0" w:uiPriority="11" w:semiHidden="0" w:name="Subtitle"/>
+    <w:lsdException w:uiPriority="99" w:name="Salutation"/>
+    <w:lsdException w:uiPriority="99" w:name="Date"/>
+    <w:lsdException w:uiPriority="99" w:name="Body Text First Indent"/>
+    <w:lsdException w:uiPriority="99" w:name="Body Text First Indent 2"/>
+    <w:lsdException w:uiPriority="99" w:name="Note Heading"/>
+    <w:lsdException w:uiPriority="99" w:name="Body Text 2"/>
+    <w:lsdException w:uiPriority="99" w:name="Body Text 3"/>
+    <w:lsdException w:uiPriority="99" w:name="Body Text Indent 2"/>
+    <w:lsdException w:uiPriority="99" w:name="Body Text Indent 3"/>
+    <w:lsdException w:uiPriority="99" w:name="Block Text"/>
+    <w:lsdException w:uiPriority="99" w:name="Hyperlink"/>
+    <w:lsdException w:uiPriority="99" w:name="FollowedHyperlink"/>
+    <w:lsdException w:qFormat="1" w:unhideWhenUsed="0" w:uiPriority="22" w:semiHidden="0" w:name="Strong"/>
+    <w:lsdException w:qFormat="1" w:unhideWhenUsed="0" w:uiPriority="20" w:semiHidden="0" w:name="Emphasis"/>
+    <w:lsdException w:uiPriority="99" w:name="Document Map"/>
+    <w:lsdException w:uiPriority="99" w:name="Plain Text"/>
+    <w:lsdException w:uiPriority="99" w:name="E-mail Signature"/>
+    <w:lsdException w:uiPriority="99" w:name="Normal (Web)"/>
+    <w:lsdException w:uiPriority="99" w:name="HTML Acronym"/>
+    <w:lsdException w:uiPriority="99" w:name="HTML Address"/>
+    <w:lsdException w:uiPriority="99" w:name="HTML Cite"/>
+    <w:lsdException w:uiPriority="99" w:name="HTML Code"/>
+    <w:lsdException w:uiPriority="99" w:name="HTML Definition"/>
+    <w:lsdException w:uiPriority="99" w:name="HTML Keyboard"/>
+    <w:lsdException w:uiPriority="99" w:name="HTML Preformatted"/>
+    <w:lsdException w:uiPriority="99" w:name="HTML Sample"/>
+    <w:lsdException w:uiPriority="99" w:name="HTML Typewriter"/>
+    <w:lsdException w:uiPriority="99" w:name="HTML Variable"/>
+    <w:lsdException w:qFormat="1" w:uiPriority="99" w:name="Normal Table"/>
+    <w:lsdException w:uiPriority="99" w:name="annotation subject"/>
+    <w:lsdException w:uiPriority="99" w:name="Table Simple 1"/>
+    <w:lsdException w:uiPriority="99" w:name="Table Simple 2"/>
+    <w:lsdException w:uiPriority="99" w:name="Table Simple 3"/>
+    <w:lsdException w:uiPriority="99" w:name="Table Classic 1"/>
+    <w:lsdException w:uiPriority="99" w:name="Table Classic 2"/>
+    <w:lsdException w:uiPriority="99" w:name="Table Classic 3"/>
+    <w:lsdException w:uiPriority="99" w:name="Table Classic 4"/>
+    <w:lsdException w:uiPriority="99" w:name="Table Colorful 1"/>
+    <w:lsdException w:uiPriority="99" w:name="Table Colorful 2"/>
+    <w:lsdException w:uiPriority="99" w:name="Table Colorful 3"/>
+    <w:lsdException w:uiPriority="99" w:name="Table Columns 1"/>
+    <w:lsdException w:uiPriority="99" w:name="Table Columns 2"/>
+    <w:lsdException w:uiPriority="99" w:name="Table Columns 3"/>
+    <w:lsdException w:uiPriority="99" w:name="Table Columns 4"/>
+    <w:lsdException w:uiPriority="99" w:name="Table Columns 5"/>
+    <w:lsdException w:uiPriority="99" w:name="Table Grid 1"/>
+    <w:lsdException w:uiPriority="99" w:name="Table Grid 2"/>
+    <w:lsdException w:uiPriority="99" w:name="Table Grid 3"/>
+    <w:lsdException w:uiPriority="99" w:name="Table Grid 4"/>
+    <w:lsdException w:uiPriority="99" w:name="Table Grid 5"/>
+    <w:lsdException w:uiPriority="99" w:name="Table Grid 6"/>
+    <w:lsdException w:uiPriority="99" w:name="Table Grid 7"/>
+    <w:lsdException w:uiPriority="99" w:name="Table Grid 8"/>
+    <w:lsdException w:uiPriority="99" w:name="Table List 1"/>
+    <w:lsdException w:uiPriority="99" w:name="Table List 2"/>
+    <w:lsdException w:uiPriority="99" w:name="Table List 3"/>
+    <w:lsdException w:uiPriority="99" w:name="Table List 4"/>
+    <w:lsdException w:uiPriority="99" w:name="Table List 5"/>
+    <w:lsdException w:uiPriority="99" w:name="Table List 6"/>
+    <w:lsdException w:uiPriority="99" w:name="Table List 7"/>
+    <w:lsdException w:uiPriority="99" w:name="Table List 8"/>
+    <w:lsdException w:uiPriority="99" w:name="Table 3D effects 1"/>
+    <w:lsdException w:uiPriority="99" w:name="Table 3D effects 2"/>
+    <w:lsdException w:uiPriority="99" w:name="Table 3D effects 3"/>
+    <w:lsdException w:uiPriority="99" w:name="Table Contemporary"/>
+    <w:lsdException w:uiPriority="99" w:name="Table Elegant"/>
+    <w:lsdException w:uiPriority="99" w:name="Table Professional"/>
+    <w:lsdException w:uiPriority="99" w:name="Table Subtle 1"/>
+    <w:lsdException w:uiPriority="99" w:name="Table Subtle 2"/>
+    <w:lsdException w:uiPriority="99" w:name="Table Web 1"/>
+    <w:lsdException w:uiPriority="99" w:name="Table Web 2"/>
+    <w:lsdException w:uiPriority="99" w:name="Table Web 3"/>
+    <w:lsdException w:uiPriority="99" w:name="Balloon Text"/>
+    <w:lsdException w:unhideWhenUsed="0" w:uiPriority="59" w:semiHidden="0" w:name="Table Grid"/>
+    <w:lsdException w:uiPriority="99" w:name="Table Theme"/>
+    <w:lsdException w:qFormat="1" w:unhideWhenUsed="0" w:uiPriority="34" w:semiHidden="0" w:name="List Paragraph"/>
+    <w:lsdException w:qFormat="1" w:unhideWhenUsed="0" w:uiPriority="29" w:semiHidden="0" w:name="Quote"/>
+    <w:lsdException w:qFormat="1" w:unhideWhenUsed="0" w:uiPriority="30" w:semiHidden="0" w:name="Intense Quote"/>
   </w:latentStyles>
-  <w:style w:type="paragraph" w:default="1" w:styleId="Normal">
+  <w:style w:type="paragraph" w:default="1" w:styleId="1">
     <w:name w:val="Normal"/>
     <w:qFormat/>
+    <w:uiPriority w:val="0"/>
+    <w:pPr>
+      <w:spacing w:after="200" w:line="276" w:lineRule="auto"/>
+    </w:pPr>
+    <w:rPr>
+      <w:rFonts w:asciiTheme="minorHAnsi" w:hAnsiTheme="minorHAnsi" w:eastAsiaTheme="minorHAnsi" w:cstheme="minorBidi"/>
+      <w:kern w:val="2"/>
+      <w:sz w:val="22"/>
+      <w:szCs w:val="22"/>
+      <w:lang w:val="en-US" w:eastAsia="en-US" w:bidi="ar-SA"/>
+      <w14:ligatures w14:val="standardContextual"/>
+    </w:rPr>
   </w:style>
-  <w:style w:type="paragraph" w:styleId="Heading1">
+  <w:style w:type="paragraph" w:styleId="2">
     <w:name w:val="heading 1"/>
-    <w:basedOn w:val="Normal"/>
-    <w:next w:val="Normal"/>
-    <w:link w:val="Heading1Char"/>
+    <w:basedOn w:val="1"/>
+    <w:next w:val="1"/>
+    <w:link w:val="15"/>
+    <w:qFormat/>
     <w:uiPriority w:val="9"/>
-    <w:qFormat/>
-    <w:rsid w:val="00D92885"/>
     <w:pPr>
       <w:keepNext/>
       <w:keepLines/>
@@ -2919,22 +2966,21 @@
       <w:outlineLvl w:val="0"/>
     </w:pPr>
     <w:rPr>
-      <w:rFonts w:asciiTheme="majorHAnsi" w:eastAsiaTheme="majorEastAsia" w:hAnsiTheme="majorHAnsi" w:cstheme="majorBidi"/>
-      <w:color w:val="365F91" w:themeColor="accent1" w:themeShade="BF"/>
+      <w:rFonts w:asciiTheme="majorHAnsi" w:hAnsiTheme="majorHAnsi" w:eastAsiaTheme="majorEastAsia" w:cstheme="majorBidi"/>
+      <w:color w:val="376092" w:themeColor="accent1" w:themeShade="BF"/>
       <w:sz w:val="40"/>
       <w:szCs w:val="40"/>
     </w:rPr>
   </w:style>
-  <w:style w:type="paragraph" w:styleId="Heading2">
+  <w:style w:type="paragraph" w:styleId="3">
     <w:name w:val="heading 2"/>
-    <w:basedOn w:val="Normal"/>
-    <w:next w:val="Normal"/>
-    <w:link w:val="Heading2Char"/>
-    <w:uiPriority w:val="9"/>
+    <w:basedOn w:val="1"/>
+    <w:next w:val="1"/>
+    <w:link w:val="16"/>
     <w:semiHidden/>
     <w:unhideWhenUsed/>
     <w:qFormat/>
-    <w:rsid w:val="00D92885"/>
+    <w:uiPriority w:val="9"/>
     <w:pPr>
       <w:keepNext/>
       <w:keepLines/>
@@ -2942,22 +2988,21 @@
       <w:outlineLvl w:val="1"/>
     </w:pPr>
     <w:rPr>
-      <w:rFonts w:asciiTheme="majorHAnsi" w:eastAsiaTheme="majorEastAsia" w:hAnsiTheme="majorHAnsi" w:cstheme="majorBidi"/>
-      <w:color w:val="365F91" w:themeColor="accent1" w:themeShade="BF"/>
+      <w:rFonts w:asciiTheme="majorHAnsi" w:hAnsiTheme="majorHAnsi" w:eastAsiaTheme="majorEastAsia" w:cstheme="majorBidi"/>
+      <w:color w:val="376092" w:themeColor="accent1" w:themeShade="BF"/>
       <w:sz w:val="32"/>
       <w:szCs w:val="32"/>
     </w:rPr>
   </w:style>
-  <w:style w:type="paragraph" w:styleId="Heading3">
+  <w:style w:type="paragraph" w:styleId="4">
     <w:name w:val="heading 3"/>
-    <w:basedOn w:val="Normal"/>
-    <w:next w:val="Normal"/>
-    <w:link w:val="Heading3Char"/>
-    <w:uiPriority w:val="9"/>
+    <w:basedOn w:val="1"/>
+    <w:next w:val="1"/>
+    <w:link w:val="17"/>
     <w:semiHidden/>
     <w:unhideWhenUsed/>
     <w:qFormat/>
-    <w:rsid w:val="00D92885"/>
+    <w:uiPriority w:val="9"/>
     <w:pPr>
       <w:keepNext/>
       <w:keepLines/>
@@ -2966,21 +3011,20 @@
     </w:pPr>
     <w:rPr>
       <w:rFonts w:eastAsiaTheme="majorEastAsia" w:cstheme="majorBidi"/>
-      <w:color w:val="365F91" w:themeColor="accent1" w:themeShade="BF"/>
+      <w:color w:val="376092" w:themeColor="accent1" w:themeShade="BF"/>
       <w:sz w:val="28"/>
       <w:szCs w:val="28"/>
     </w:rPr>
   </w:style>
-  <w:style w:type="paragraph" w:styleId="Heading4">
+  <w:style w:type="paragraph" w:styleId="5">
     <w:name w:val="heading 4"/>
-    <w:basedOn w:val="Normal"/>
-    <w:next w:val="Normal"/>
-    <w:link w:val="Heading4Char"/>
-    <w:uiPriority w:val="9"/>
+    <w:basedOn w:val="1"/>
+    <w:next w:val="1"/>
+    <w:link w:val="18"/>
     <w:semiHidden/>
     <w:unhideWhenUsed/>
     <w:qFormat/>
-    <w:rsid w:val="00D92885"/>
+    <w:uiPriority w:val="9"/>
     <w:pPr>
       <w:keepNext/>
       <w:keepLines/>
@@ -2991,19 +3035,18 @@
       <w:rFonts w:eastAsiaTheme="majorEastAsia" w:cstheme="majorBidi"/>
       <w:i/>
       <w:iCs/>
-      <w:color w:val="365F91" w:themeColor="accent1" w:themeShade="BF"/>
+      <w:color w:val="376092" w:themeColor="accent1" w:themeShade="BF"/>
     </w:rPr>
   </w:style>
-  <w:style w:type="paragraph" w:styleId="Heading5">
+  <w:style w:type="paragraph" w:styleId="6">
     <w:name w:val="heading 5"/>
-    <w:basedOn w:val="Normal"/>
-    <w:next w:val="Normal"/>
-    <w:link w:val="Heading5Char"/>
-    <w:uiPriority w:val="9"/>
+    <w:basedOn w:val="1"/>
+    <w:next w:val="1"/>
+    <w:link w:val="19"/>
     <w:semiHidden/>
     <w:unhideWhenUsed/>
     <w:qFormat/>
-    <w:rsid w:val="00D92885"/>
+    <w:uiPriority w:val="9"/>
     <w:pPr>
       <w:keepNext/>
       <w:keepLines/>
@@ -3012,19 +3055,18 @@
     </w:pPr>
     <w:rPr>
       <w:rFonts w:eastAsiaTheme="majorEastAsia" w:cstheme="majorBidi"/>
-      <w:color w:val="365F91" w:themeColor="accent1" w:themeShade="BF"/>
+      <w:color w:val="376092" w:themeColor="accent1" w:themeShade="BF"/>
     </w:rPr>
   </w:style>
-  <w:style w:type="paragraph" w:styleId="Heading6">
+  <w:style w:type="paragraph" w:styleId="7">
     <w:name w:val="heading 6"/>
-    <w:basedOn w:val="Normal"/>
-    <w:next w:val="Normal"/>
-    <w:link w:val="Heading6Char"/>
-    <w:uiPriority w:val="9"/>
+    <w:basedOn w:val="1"/>
+    <w:next w:val="1"/>
+    <w:link w:val="20"/>
     <w:semiHidden/>
     <w:unhideWhenUsed/>
     <w:qFormat/>
-    <w:rsid w:val="00D92885"/>
+    <w:uiPriority w:val="9"/>
     <w:pPr>
       <w:keepNext/>
       <w:keepLines/>
@@ -3036,18 +3078,25 @@
       <w:i/>
       <w:iCs/>
       <w:color w:val="595959" w:themeColor="text1" w:themeTint="A6"/>
+      <w14:textFill>
+        <w14:solidFill>
+          <w14:schemeClr w14:val="tx1">
+            <w14:lumMod w14:val="65000"/>
+            <w14:lumOff w14:val="35000"/>
+          </w14:schemeClr>
+        </w14:solidFill>
+      </w14:textFill>
     </w:rPr>
   </w:style>
-  <w:style w:type="paragraph" w:styleId="Heading7">
+  <w:style w:type="paragraph" w:styleId="8">
     <w:name w:val="heading 7"/>
-    <w:basedOn w:val="Normal"/>
-    <w:next w:val="Normal"/>
-    <w:link w:val="Heading7Char"/>
-    <w:uiPriority w:val="9"/>
+    <w:basedOn w:val="1"/>
+    <w:next w:val="1"/>
+    <w:link w:val="21"/>
     <w:semiHidden/>
     <w:unhideWhenUsed/>
     <w:qFormat/>
-    <w:rsid w:val="00D92885"/>
+    <w:uiPriority w:val="9"/>
     <w:pPr>
       <w:keepNext/>
       <w:keepLines/>
@@ -3057,18 +3106,25 @@
     <w:rPr>
       <w:rFonts w:eastAsiaTheme="majorEastAsia" w:cstheme="majorBidi"/>
       <w:color w:val="595959" w:themeColor="text1" w:themeTint="A6"/>
+      <w14:textFill>
+        <w14:solidFill>
+          <w14:schemeClr w14:val="tx1">
+            <w14:lumMod w14:val="65000"/>
+            <w14:lumOff w14:val="35000"/>
+          </w14:schemeClr>
+        </w14:solidFill>
+      </w14:textFill>
     </w:rPr>
   </w:style>
-  <w:style w:type="paragraph" w:styleId="Heading8">
+  <w:style w:type="paragraph" w:styleId="9">
     <w:name w:val="heading 8"/>
-    <w:basedOn w:val="Normal"/>
-    <w:next w:val="Normal"/>
-    <w:link w:val="Heading8Char"/>
-    <w:uiPriority w:val="9"/>
+    <w:basedOn w:val="1"/>
+    <w:next w:val="1"/>
+    <w:link w:val="22"/>
     <w:semiHidden/>
     <w:unhideWhenUsed/>
     <w:qFormat/>
-    <w:rsid w:val="00D92885"/>
+    <w:uiPriority w:val="9"/>
     <w:pPr>
       <w:keepNext/>
       <w:keepLines/>
@@ -3079,19 +3135,26 @@
       <w:rFonts w:eastAsiaTheme="majorEastAsia" w:cstheme="majorBidi"/>
       <w:i/>
       <w:iCs/>
-      <w:color w:val="272727" w:themeColor="text1" w:themeTint="D8"/>
+      <w:color w:val="262626" w:themeColor="text1" w:themeTint="D9"/>
+      <w14:textFill>
+        <w14:solidFill>
+          <w14:schemeClr w14:val="tx1">
+            <w14:lumMod w14:val="85000"/>
+            <w14:lumOff w14:val="15000"/>
+          </w14:schemeClr>
+        </w14:solidFill>
+      </w14:textFill>
     </w:rPr>
   </w:style>
-  <w:style w:type="paragraph" w:styleId="Heading9">
+  <w:style w:type="paragraph" w:styleId="10">
     <w:name w:val="heading 9"/>
-    <w:basedOn w:val="Normal"/>
-    <w:next w:val="Normal"/>
-    <w:link w:val="Heading9Char"/>
-    <w:uiPriority w:val="9"/>
+    <w:basedOn w:val="1"/>
+    <w:next w:val="1"/>
+    <w:link w:val="23"/>
     <w:semiHidden/>
     <w:unhideWhenUsed/>
     <w:qFormat/>
-    <w:rsid w:val="00D92885"/>
+    <w:uiPriority w:val="9"/>
     <w:pPr>
       <w:keepNext/>
       <w:keepLines/>
@@ -3100,21 +3163,30 @@
     </w:pPr>
     <w:rPr>
       <w:rFonts w:eastAsiaTheme="majorEastAsia" w:cstheme="majorBidi"/>
-      <w:color w:val="272727" w:themeColor="text1" w:themeTint="D8"/>
+      <w:color w:val="262626" w:themeColor="text1" w:themeTint="D9"/>
+      <w14:textFill>
+        <w14:solidFill>
+          <w14:schemeClr w14:val="tx1">
+            <w14:lumMod w14:val="85000"/>
+            <w14:lumOff w14:val="15000"/>
+          </w14:schemeClr>
+        </w14:solidFill>
+      </w14:textFill>
     </w:rPr>
   </w:style>
-  <w:style w:type="character" w:default="1" w:styleId="DefaultParagraphFont">
+  <w:style w:type="character" w:default="1" w:styleId="11">
     <w:name w:val="Default Paragraph Font"/>
+    <w:unhideWhenUsed/>
+    <w:qFormat/>
     <w:uiPriority w:val="1"/>
-    <w:unhideWhenUsed/>
   </w:style>
-  <w:style w:type="table" w:default="1" w:styleId="TableNormal">
+  <w:style w:type="table" w:default="1" w:styleId="12">
     <w:name w:val="Normal Table"/>
-    <w:uiPriority w:val="99"/>
     <w:semiHidden/>
     <w:unhideWhenUsed/>
+    <w:qFormat/>
+    <w:uiPriority w:val="99"/>
     <w:tblPr>
-      <w:tblInd w:w="0" w:type="dxa"/>
       <w:tblCellMar>
         <w:top w:w="0" w:type="dxa"/>
         <w:left w:w="108" w:type="dxa"/>
@@ -3123,177 +3195,33 @@
       </w:tblCellMar>
     </w:tblPr>
   </w:style>
-  <w:style w:type="numbering" w:default="1" w:styleId="NoList">
-    <w:name w:val="No List"/>
-    <w:uiPriority w:val="99"/>
-    <w:semiHidden/>
-    <w:unhideWhenUsed/>
-  </w:style>
-  <w:style w:type="character" w:customStyle="1" w:styleId="Heading1Char">
-    <w:name w:val="Heading 1 Char"/>
-    <w:basedOn w:val="DefaultParagraphFont"/>
-    <w:link w:val="Heading1"/>
-    <w:uiPriority w:val="9"/>
-    <w:rsid w:val="00D92885"/>
-    <w:rPr>
-      <w:rFonts w:asciiTheme="majorHAnsi" w:eastAsiaTheme="majorEastAsia" w:hAnsiTheme="majorHAnsi" w:cstheme="majorBidi"/>
-      <w:color w:val="365F91" w:themeColor="accent1" w:themeShade="BF"/>
-      <w:sz w:val="40"/>
-      <w:szCs w:val="40"/>
-    </w:rPr>
-  </w:style>
-  <w:style w:type="character" w:customStyle="1" w:styleId="Heading2Char">
-    <w:name w:val="Heading 2 Char"/>
-    <w:basedOn w:val="DefaultParagraphFont"/>
-    <w:link w:val="Heading2"/>
-    <w:uiPriority w:val="9"/>
-    <w:semiHidden/>
-    <w:rsid w:val="00D92885"/>
-    <w:rPr>
-      <w:rFonts w:asciiTheme="majorHAnsi" w:eastAsiaTheme="majorEastAsia" w:hAnsiTheme="majorHAnsi" w:cstheme="majorBidi"/>
-      <w:color w:val="365F91" w:themeColor="accent1" w:themeShade="BF"/>
-      <w:sz w:val="32"/>
-      <w:szCs w:val="32"/>
-    </w:rPr>
-  </w:style>
-  <w:style w:type="character" w:customStyle="1" w:styleId="Heading3Char">
-    <w:name w:val="Heading 3 Char"/>
-    <w:basedOn w:val="DefaultParagraphFont"/>
-    <w:link w:val="Heading3"/>
-    <w:uiPriority w:val="9"/>
-    <w:semiHidden/>
-    <w:rsid w:val="00D92885"/>
-    <w:rPr>
-      <w:rFonts w:eastAsiaTheme="majorEastAsia" w:cstheme="majorBidi"/>
-      <w:color w:val="365F91" w:themeColor="accent1" w:themeShade="BF"/>
-      <w:sz w:val="28"/>
-      <w:szCs w:val="28"/>
-    </w:rPr>
-  </w:style>
-  <w:style w:type="character" w:customStyle="1" w:styleId="Heading4Char">
-    <w:name w:val="Heading 4 Char"/>
-    <w:basedOn w:val="DefaultParagraphFont"/>
-    <w:link w:val="Heading4"/>
-    <w:uiPriority w:val="9"/>
-    <w:semiHidden/>
-    <w:rsid w:val="00D92885"/>
-    <w:rPr>
-      <w:rFonts w:eastAsiaTheme="majorEastAsia" w:cstheme="majorBidi"/>
-      <w:i/>
-      <w:iCs/>
-      <w:color w:val="365F91" w:themeColor="accent1" w:themeShade="BF"/>
-    </w:rPr>
-  </w:style>
-  <w:style w:type="character" w:customStyle="1" w:styleId="Heading5Char">
-    <w:name w:val="Heading 5 Char"/>
-    <w:basedOn w:val="DefaultParagraphFont"/>
-    <w:link w:val="Heading5"/>
-    <w:uiPriority w:val="9"/>
-    <w:semiHidden/>
-    <w:rsid w:val="00D92885"/>
-    <w:rPr>
-      <w:rFonts w:eastAsiaTheme="majorEastAsia" w:cstheme="majorBidi"/>
-      <w:color w:val="365F91" w:themeColor="accent1" w:themeShade="BF"/>
-    </w:rPr>
-  </w:style>
-  <w:style w:type="character" w:customStyle="1" w:styleId="Heading6Char">
-    <w:name w:val="Heading 6 Char"/>
-    <w:basedOn w:val="DefaultParagraphFont"/>
-    <w:link w:val="Heading6"/>
-    <w:uiPriority w:val="9"/>
-    <w:semiHidden/>
-    <w:rsid w:val="00D92885"/>
-    <w:rPr>
-      <w:rFonts w:eastAsiaTheme="majorEastAsia" w:cstheme="majorBidi"/>
-      <w:i/>
-      <w:iCs/>
-      <w:color w:val="595959" w:themeColor="text1" w:themeTint="A6"/>
-    </w:rPr>
-  </w:style>
-  <w:style w:type="character" w:customStyle="1" w:styleId="Heading7Char">
-    <w:name w:val="Heading 7 Char"/>
-    <w:basedOn w:val="DefaultParagraphFont"/>
-    <w:link w:val="Heading7"/>
-    <w:uiPriority w:val="9"/>
-    <w:semiHidden/>
-    <w:rsid w:val="00D92885"/>
-    <w:rPr>
-      <w:rFonts w:eastAsiaTheme="majorEastAsia" w:cstheme="majorBidi"/>
-      <w:color w:val="595959" w:themeColor="text1" w:themeTint="A6"/>
-    </w:rPr>
-  </w:style>
-  <w:style w:type="character" w:customStyle="1" w:styleId="Heading8Char">
-    <w:name w:val="Heading 8 Char"/>
-    <w:basedOn w:val="DefaultParagraphFont"/>
-    <w:link w:val="Heading8"/>
-    <w:uiPriority w:val="9"/>
-    <w:semiHidden/>
-    <w:rsid w:val="00D92885"/>
-    <w:rPr>
-      <w:rFonts w:eastAsiaTheme="majorEastAsia" w:cstheme="majorBidi"/>
-      <w:i/>
-      <w:iCs/>
-      <w:color w:val="272727" w:themeColor="text1" w:themeTint="D8"/>
-    </w:rPr>
-  </w:style>
-  <w:style w:type="character" w:customStyle="1" w:styleId="Heading9Char">
-    <w:name w:val="Heading 9 Char"/>
-    <w:basedOn w:val="DefaultParagraphFont"/>
-    <w:link w:val="Heading9"/>
-    <w:uiPriority w:val="9"/>
-    <w:semiHidden/>
-    <w:rsid w:val="00D92885"/>
-    <w:rPr>
-      <w:rFonts w:eastAsiaTheme="majorEastAsia" w:cstheme="majorBidi"/>
-      <w:color w:val="272727" w:themeColor="text1" w:themeTint="D8"/>
-    </w:rPr>
-  </w:style>
-  <w:style w:type="paragraph" w:styleId="Title">
+  <w:style w:type="paragraph" w:styleId="13">
     <w:name w:val="Title"/>
-    <w:basedOn w:val="Normal"/>
-    <w:next w:val="Normal"/>
-    <w:link w:val="TitleChar"/>
+    <w:basedOn w:val="1"/>
+    <w:next w:val="1"/>
+    <w:link w:val="24"/>
+    <w:qFormat/>
     <w:uiPriority w:val="10"/>
-    <w:qFormat/>
-    <w:rsid w:val="00D92885"/>
     <w:pPr>
       <w:spacing w:after="80" w:line="240" w:lineRule="auto"/>
       <w:contextualSpacing/>
     </w:pPr>
     <w:rPr>
-      <w:rFonts w:asciiTheme="majorHAnsi" w:eastAsiaTheme="majorEastAsia" w:hAnsiTheme="majorHAnsi" w:cstheme="majorBidi"/>
+      <w:rFonts w:asciiTheme="majorHAnsi" w:hAnsiTheme="majorHAnsi" w:eastAsiaTheme="majorEastAsia" w:cstheme="majorBidi"/>
       <w:spacing w:val="-10"/>
       <w:kern w:val="28"/>
       <w:sz w:val="56"/>
       <w:szCs w:val="56"/>
     </w:rPr>
   </w:style>
-  <w:style w:type="character" w:customStyle="1" w:styleId="TitleChar">
-    <w:name w:val="Title Char"/>
-    <w:basedOn w:val="DefaultParagraphFont"/>
-    <w:link w:val="Title"/>
-    <w:uiPriority w:val="10"/>
-    <w:rsid w:val="00D92885"/>
-    <w:rPr>
-      <w:rFonts w:asciiTheme="majorHAnsi" w:eastAsiaTheme="majorEastAsia" w:hAnsiTheme="majorHAnsi" w:cstheme="majorBidi"/>
-      <w:spacing w:val="-10"/>
-      <w:kern w:val="28"/>
-      <w:sz w:val="56"/>
-      <w:szCs w:val="56"/>
-    </w:rPr>
-  </w:style>
-  <w:style w:type="paragraph" w:styleId="Subtitle">
+  <w:style w:type="paragraph" w:styleId="14">
     <w:name w:val="Subtitle"/>
-    <w:basedOn w:val="Normal"/>
-    <w:next w:val="Normal"/>
-    <w:link w:val="SubtitleChar"/>
+    <w:basedOn w:val="1"/>
+    <w:next w:val="1"/>
+    <w:link w:val="25"/>
+    <w:qFormat/>
     <w:uiPriority w:val="11"/>
-    <w:qFormat/>
-    <w:rsid w:val="00D92885"/>
     <w:pPr>
-      <w:numPr>
-        <w:ilvl w:val="1"/>
-      </w:numPr>
       <w:spacing w:after="160"/>
     </w:pPr>
     <w:rPr>
@@ -3302,30 +3230,205 @@
       <w:spacing w:val="15"/>
       <w:sz w:val="28"/>
       <w:szCs w:val="28"/>
+      <w14:textFill>
+        <w14:solidFill>
+          <w14:schemeClr w14:val="tx1">
+            <w14:lumMod w14:val="65000"/>
+            <w14:lumOff w14:val="35000"/>
+          </w14:schemeClr>
+        </w14:solidFill>
+      </w14:textFill>
     </w:rPr>
   </w:style>
-  <w:style w:type="character" w:customStyle="1" w:styleId="SubtitleChar">
+  <w:style w:type="character" w:customStyle="1" w:styleId="15">
+    <w:name w:val="Heading 1 Char"/>
+    <w:basedOn w:val="11"/>
+    <w:link w:val="2"/>
+    <w:uiPriority w:val="9"/>
+    <w:rPr>
+      <w:rFonts w:asciiTheme="majorHAnsi" w:hAnsiTheme="majorHAnsi" w:eastAsiaTheme="majorEastAsia" w:cstheme="majorBidi"/>
+      <w:color w:val="376092" w:themeColor="accent1" w:themeShade="BF"/>
+      <w:sz w:val="40"/>
+      <w:szCs w:val="40"/>
+    </w:rPr>
+  </w:style>
+  <w:style w:type="character" w:customStyle="1" w:styleId="16">
+    <w:name w:val="Heading 2 Char"/>
+    <w:basedOn w:val="11"/>
+    <w:link w:val="3"/>
+    <w:semiHidden/>
+    <w:qFormat/>
+    <w:uiPriority w:val="9"/>
+    <w:rPr>
+      <w:rFonts w:asciiTheme="majorHAnsi" w:hAnsiTheme="majorHAnsi" w:eastAsiaTheme="majorEastAsia" w:cstheme="majorBidi"/>
+      <w:color w:val="376092" w:themeColor="accent1" w:themeShade="BF"/>
+      <w:sz w:val="32"/>
+      <w:szCs w:val="32"/>
+    </w:rPr>
+  </w:style>
+  <w:style w:type="character" w:customStyle="1" w:styleId="17">
+    <w:name w:val="Heading 3 Char"/>
+    <w:basedOn w:val="11"/>
+    <w:link w:val="4"/>
+    <w:semiHidden/>
+    <w:uiPriority w:val="9"/>
+    <w:rPr>
+      <w:rFonts w:eastAsiaTheme="majorEastAsia" w:cstheme="majorBidi"/>
+      <w:color w:val="376092" w:themeColor="accent1" w:themeShade="BF"/>
+      <w:sz w:val="28"/>
+      <w:szCs w:val="28"/>
+    </w:rPr>
+  </w:style>
+  <w:style w:type="character" w:customStyle="1" w:styleId="18">
+    <w:name w:val="Heading 4 Char"/>
+    <w:basedOn w:val="11"/>
+    <w:link w:val="5"/>
+    <w:semiHidden/>
+    <w:uiPriority w:val="9"/>
+    <w:rPr>
+      <w:rFonts w:eastAsiaTheme="majorEastAsia" w:cstheme="majorBidi"/>
+      <w:i/>
+      <w:iCs/>
+      <w:color w:val="376092" w:themeColor="accent1" w:themeShade="BF"/>
+    </w:rPr>
+  </w:style>
+  <w:style w:type="character" w:customStyle="1" w:styleId="19">
+    <w:name w:val="Heading 5 Char"/>
+    <w:basedOn w:val="11"/>
+    <w:link w:val="6"/>
+    <w:semiHidden/>
+    <w:qFormat/>
+    <w:uiPriority w:val="9"/>
+    <w:rPr>
+      <w:rFonts w:eastAsiaTheme="majorEastAsia" w:cstheme="majorBidi"/>
+      <w:color w:val="376092" w:themeColor="accent1" w:themeShade="BF"/>
+    </w:rPr>
+  </w:style>
+  <w:style w:type="character" w:customStyle="1" w:styleId="20">
+    <w:name w:val="Heading 6 Char"/>
+    <w:basedOn w:val="11"/>
+    <w:link w:val="7"/>
+    <w:semiHidden/>
+    <w:qFormat/>
+    <w:uiPriority w:val="9"/>
+    <w:rPr>
+      <w:rFonts w:eastAsiaTheme="majorEastAsia" w:cstheme="majorBidi"/>
+      <w:i/>
+      <w:iCs/>
+      <w:color w:val="595959" w:themeColor="text1" w:themeTint="A6"/>
+      <w14:textFill>
+        <w14:solidFill>
+          <w14:schemeClr w14:val="tx1">
+            <w14:lumMod w14:val="65000"/>
+            <w14:lumOff w14:val="35000"/>
+          </w14:schemeClr>
+        </w14:solidFill>
+      </w14:textFill>
+    </w:rPr>
+  </w:style>
+  <w:style w:type="character" w:customStyle="1" w:styleId="21">
+    <w:name w:val="Heading 7 Char"/>
+    <w:basedOn w:val="11"/>
+    <w:link w:val="8"/>
+    <w:semiHidden/>
+    <w:qFormat/>
+    <w:uiPriority w:val="9"/>
+    <w:rPr>
+      <w:rFonts w:eastAsiaTheme="majorEastAsia" w:cstheme="majorBidi"/>
+      <w:color w:val="595959" w:themeColor="text1" w:themeTint="A6"/>
+      <w14:textFill>
+        <w14:solidFill>
+          <w14:schemeClr w14:val="tx1">
+            <w14:lumMod w14:val="65000"/>
+            <w14:lumOff w14:val="35000"/>
+          </w14:schemeClr>
+        </w14:solidFill>
+      </w14:textFill>
+    </w:rPr>
+  </w:style>
+  <w:style w:type="character" w:customStyle="1" w:styleId="22">
+    <w:name w:val="Heading 8 Char"/>
+    <w:basedOn w:val="11"/>
+    <w:link w:val="9"/>
+    <w:semiHidden/>
+    <w:qFormat/>
+    <w:uiPriority w:val="9"/>
+    <w:rPr>
+      <w:rFonts w:eastAsiaTheme="majorEastAsia" w:cstheme="majorBidi"/>
+      <w:i/>
+      <w:iCs/>
+      <w:color w:val="262626" w:themeColor="text1" w:themeTint="D9"/>
+      <w14:textFill>
+        <w14:solidFill>
+          <w14:schemeClr w14:val="tx1">
+            <w14:lumMod w14:val="85000"/>
+            <w14:lumOff w14:val="15000"/>
+          </w14:schemeClr>
+        </w14:solidFill>
+      </w14:textFill>
+    </w:rPr>
+  </w:style>
+  <w:style w:type="character" w:customStyle="1" w:styleId="23">
+    <w:name w:val="Heading 9 Char"/>
+    <w:basedOn w:val="11"/>
+    <w:link w:val="10"/>
+    <w:semiHidden/>
+    <w:qFormat/>
+    <w:uiPriority w:val="9"/>
+    <w:rPr>
+      <w:rFonts w:eastAsiaTheme="majorEastAsia" w:cstheme="majorBidi"/>
+      <w:color w:val="262626" w:themeColor="text1" w:themeTint="D9"/>
+      <w14:textFill>
+        <w14:solidFill>
+          <w14:schemeClr w14:val="tx1">
+            <w14:lumMod w14:val="85000"/>
+            <w14:lumOff w14:val="15000"/>
+          </w14:schemeClr>
+        </w14:solidFill>
+      </w14:textFill>
+    </w:rPr>
+  </w:style>
+  <w:style w:type="character" w:customStyle="1" w:styleId="24">
+    <w:name w:val="Title Char"/>
+    <w:basedOn w:val="11"/>
+    <w:link w:val="13"/>
+    <w:uiPriority w:val="10"/>
+    <w:rPr>
+      <w:rFonts w:asciiTheme="majorHAnsi" w:hAnsiTheme="majorHAnsi" w:eastAsiaTheme="majorEastAsia" w:cstheme="majorBidi"/>
+      <w:spacing w:val="-10"/>
+      <w:kern w:val="28"/>
+      <w:sz w:val="56"/>
+      <w:szCs w:val="56"/>
+    </w:rPr>
+  </w:style>
+  <w:style w:type="character" w:customStyle="1" w:styleId="25">
     <w:name w:val="Subtitle Char"/>
-    <w:basedOn w:val="DefaultParagraphFont"/>
-    <w:link w:val="Subtitle"/>
+    <w:basedOn w:val="11"/>
+    <w:link w:val="14"/>
     <w:uiPriority w:val="11"/>
-    <w:rsid w:val="00D92885"/>
     <w:rPr>
       <w:rFonts w:eastAsiaTheme="majorEastAsia" w:cstheme="majorBidi"/>
       <w:color w:val="595959" w:themeColor="text1" w:themeTint="A6"/>
       <w:spacing w:val="15"/>
       <w:sz w:val="28"/>
       <w:szCs w:val="28"/>
+      <w14:textFill>
+        <w14:solidFill>
+          <w14:schemeClr w14:val="tx1">
+            <w14:lumMod w14:val="65000"/>
+            <w14:lumOff w14:val="35000"/>
+          </w14:schemeClr>
+        </w14:solidFill>
+      </w14:textFill>
     </w:rPr>
   </w:style>
-  <w:style w:type="paragraph" w:styleId="Quote">
+  <w:style w:type="paragraph" w:styleId="26">
     <w:name w:val="Quote"/>
-    <w:basedOn w:val="Normal"/>
-    <w:next w:val="Normal"/>
-    <w:link w:val="QuoteChar"/>
+    <w:basedOn w:val="1"/>
+    <w:next w:val="1"/>
+    <w:link w:val="27"/>
+    <w:qFormat/>
     <w:uiPriority w:val="29"/>
-    <w:qFormat/>
-    <w:rsid w:val="00D92885"/>
     <w:pPr>
       <w:spacing w:before="160" w:after="160"/>
       <w:jc w:val="center"/>
@@ -3334,55 +3437,67 @@
       <w:i/>
       <w:iCs/>
       <w:color w:val="404040" w:themeColor="text1" w:themeTint="BF"/>
+      <w14:textFill>
+        <w14:solidFill>
+          <w14:schemeClr w14:val="tx1">
+            <w14:lumMod w14:val="75000"/>
+            <w14:lumOff w14:val="25000"/>
+          </w14:schemeClr>
+        </w14:solidFill>
+      </w14:textFill>
     </w:rPr>
   </w:style>
-  <w:style w:type="character" w:customStyle="1" w:styleId="QuoteChar">
+  <w:style w:type="character" w:customStyle="1" w:styleId="27">
     <w:name w:val="Quote Char"/>
-    <w:basedOn w:val="DefaultParagraphFont"/>
-    <w:link w:val="Quote"/>
+    <w:basedOn w:val="11"/>
+    <w:link w:val="26"/>
     <w:uiPriority w:val="29"/>
-    <w:rsid w:val="00D92885"/>
     <w:rPr>
       <w:i/>
       <w:iCs/>
       <w:color w:val="404040" w:themeColor="text1" w:themeTint="BF"/>
+      <w14:textFill>
+        <w14:solidFill>
+          <w14:schemeClr w14:val="tx1">
+            <w14:lumMod w14:val="75000"/>
+            <w14:lumOff w14:val="25000"/>
+          </w14:schemeClr>
+        </w14:solidFill>
+      </w14:textFill>
     </w:rPr>
   </w:style>
-  <w:style w:type="paragraph" w:styleId="ListParagraph">
+  <w:style w:type="paragraph" w:styleId="28">
     <w:name w:val="List Paragraph"/>
-    <w:basedOn w:val="Normal"/>
+    <w:basedOn w:val="1"/>
+    <w:qFormat/>
     <w:uiPriority w:val="34"/>
-    <w:qFormat/>
-    <w:rsid w:val="00D92885"/>
     <w:pPr>
       <w:ind w:left="720"/>
       <w:contextualSpacing/>
     </w:pPr>
   </w:style>
-  <w:style w:type="character" w:styleId="IntenseEmphasis">
+  <w:style w:type="character" w:customStyle="1" w:styleId="29">
     <w:name w:val="Intense Emphasis"/>
-    <w:basedOn w:val="DefaultParagraphFont"/>
+    <w:basedOn w:val="11"/>
+    <w:qFormat/>
     <w:uiPriority w:val="21"/>
-    <w:qFormat/>
-    <w:rsid w:val="00D92885"/>
     <w:rPr>
       <w:i/>
       <w:iCs/>
-      <w:color w:val="365F91" w:themeColor="accent1" w:themeShade="BF"/>
+      <w:color w:val="376092" w:themeColor="accent1" w:themeShade="BF"/>
     </w:rPr>
   </w:style>
-  <w:style w:type="paragraph" w:styleId="IntenseQuote">
+  <w:style w:type="paragraph" w:styleId="30">
     <w:name w:val="Intense Quote"/>
-    <w:basedOn w:val="Normal"/>
-    <w:next w:val="Normal"/>
-    <w:link w:val="IntenseQuoteChar"/>
+    <w:basedOn w:val="1"/>
+    <w:next w:val="1"/>
+    <w:link w:val="31"/>
+    <w:qFormat/>
     <w:uiPriority w:val="30"/>
-    <w:qFormat/>
-    <w:rsid w:val="00D92885"/>
     <w:pPr>
       <w:pBdr>
-        <w:top w:val="single" w:sz="4" w:space="10" w:color="365F91" w:themeColor="accent1" w:themeShade="BF"/>
-        <w:bottom w:val="single" w:sz="4" w:space="10" w:color="365F91" w:themeColor="accent1" w:themeShade="BF"/>
+        <w:top w:val="single" w:color="366091" w:themeColor="accent1" w:themeShade="BF" w:sz="4" w:space="10"/>
+        <w:bottom w:val="single" w:color="366091" w:themeColor="accent1" w:themeShade="BF" w:sz="4" w:space="10"/>
       </w:pBdr>
       <w:spacing w:before="360" w:after="360"/>
       <w:ind w:left="864" w:right="864"/>
@@ -3391,32 +3506,30 @@
     <w:rPr>
       <w:i/>
       <w:iCs/>
-      <w:color w:val="365F91" w:themeColor="accent1" w:themeShade="BF"/>
+      <w:color w:val="376092" w:themeColor="accent1" w:themeShade="BF"/>
     </w:rPr>
   </w:style>
-  <w:style w:type="character" w:customStyle="1" w:styleId="IntenseQuoteChar">
+  <w:style w:type="character" w:customStyle="1" w:styleId="31">
     <w:name w:val="Intense Quote Char"/>
-    <w:basedOn w:val="DefaultParagraphFont"/>
-    <w:link w:val="IntenseQuote"/>
+    <w:basedOn w:val="11"/>
+    <w:link w:val="30"/>
     <w:uiPriority w:val="30"/>
-    <w:rsid w:val="00D92885"/>
     <w:rPr>
       <w:i/>
       <w:iCs/>
-      <w:color w:val="365F91" w:themeColor="accent1" w:themeShade="BF"/>
+      <w:color w:val="376092" w:themeColor="accent1" w:themeShade="BF"/>
     </w:rPr>
   </w:style>
-  <w:style w:type="character" w:styleId="IntenseReference">
+  <w:style w:type="character" w:customStyle="1" w:styleId="32">
     <w:name w:val="Intense Reference"/>
-    <w:basedOn w:val="DefaultParagraphFont"/>
+    <w:basedOn w:val="11"/>
+    <w:qFormat/>
     <w:uiPriority w:val="32"/>
-    <w:qFormat/>
-    <w:rsid w:val="00D92885"/>
     <w:rPr>
       <w:b/>
       <w:bCs/>
       <w:smallCaps/>
-      <w:color w:val="365F91" w:themeColor="accent1" w:themeShade="BF"/>
+      <w:color w:val="376092" w:themeColor="accent1" w:themeShade="BF"/>
       <w:spacing w:val="5"/>
     </w:rPr>
   </w:style>
@@ -3704,6 +3817,5 @@
     </a:fmtScheme>
   </a:themeElements>
   <a:objectDefaults/>
-  <a:extraClrSchemeLst/>
 </a:theme>
 </file>
</xml_diff>